<commit_message>
added N3 table and finished diagram
</commit_message>
<xml_diff>
--- a/ex4_solution_2026_Ascendant/ex4_Ascendant.docx
+++ b/ex4_solution_2026_Ascendant/ex4_Ascendant.docx
@@ -801,12 +801,14 @@
         </w:rPr>
         <w:t xml:space="preserve"> בטבלת החניון מייצג את המחיר הנוכחי בלבד. אם תעריף החניה ישתנה בעתיד, המחיר הישן יידרס ולא יישמר לו זכר. לכן, אם לא נשמור את הסכום הסופי ששולם (</w:t>
       </w:r>
+      <w:proofErr w:type="spellStart"/>
       <w:r>
         <w:rPr>
           <w:rFonts w:asciiTheme="minorBidi" w:hAnsiTheme="minorBidi"/>
         </w:rPr>
         <w:t>amountPaid</w:t>
       </w:r>
+      <w:proofErr w:type="spellEnd"/>
       <w:r>
         <w:rPr>
           <w:rFonts w:asciiTheme="minorBidi" w:hAnsiTheme="minorBidi"/>
@@ -918,13 +920,41 @@
           <w:szCs w:val="22"/>
         </w:rPr>
       </w:pPr>
-      <w:r>
-        <w:rPr>
-          <w:rFonts w:ascii="Consolas" w:hAnsi="Consolas"/>
-          <w:sz w:val="22"/>
-          <w:szCs w:val="22"/>
-        </w:rPr>
-        <w:t>TotalMinutes = EndTime – StartTime</w:t>
+      <w:proofErr w:type="spellStart"/>
+      <w:r>
+        <w:rPr>
+          <w:rFonts w:ascii="Consolas" w:hAnsi="Consolas"/>
+          <w:sz w:val="22"/>
+          <w:szCs w:val="22"/>
+        </w:rPr>
+        <w:t>TotalMinutes</w:t>
+      </w:r>
+      <w:proofErr w:type="spellEnd"/>
+      <w:r>
+        <w:rPr>
+          <w:rFonts w:ascii="Consolas" w:hAnsi="Consolas"/>
+          <w:sz w:val="22"/>
+          <w:szCs w:val="22"/>
+        </w:rPr>
+        <w:t xml:space="preserve"> = </w:t>
+      </w:r>
+      <w:proofErr w:type="spellStart"/>
+      <w:r>
+        <w:rPr>
+          <w:rFonts w:ascii="Consolas" w:hAnsi="Consolas"/>
+          <w:sz w:val="22"/>
+          <w:szCs w:val="22"/>
+        </w:rPr>
+        <w:t>EndTime</w:t>
+      </w:r>
+      <w:proofErr w:type="spellEnd"/>
+      <w:r>
+        <w:rPr>
+          <w:rFonts w:ascii="Consolas" w:hAnsi="Consolas"/>
+          <w:sz w:val="22"/>
+          <w:szCs w:val="22"/>
+        </w:rPr>
+        <w:t xml:space="preserve"> – StartTime</w:t>
       </w:r>
     </w:p>
     <w:p>
@@ -997,7 +1027,43 @@
           <w:szCs w:val="22"/>
         </w:rPr>
         <w:tab/>
-        <w:t xml:space="preserve">    IF (TotalMinutes &lt;= ParkingLot.numberOfGraceMinutes) THEN</w:t>
+        <w:t xml:space="preserve">    IF (</w:t>
+      </w:r>
+      <w:proofErr w:type="spellStart"/>
+      <w:r>
+        <w:rPr>
+          <w:rFonts w:ascii="Consolas" w:hAnsi="Consolas"/>
+          <w:sz w:val="22"/>
+          <w:szCs w:val="22"/>
+        </w:rPr>
+        <w:t>TotalMinutes</w:t>
+      </w:r>
+      <w:proofErr w:type="spellEnd"/>
+      <w:r>
+        <w:rPr>
+          <w:rFonts w:ascii="Consolas" w:hAnsi="Consolas"/>
+          <w:sz w:val="22"/>
+          <w:szCs w:val="22"/>
+        </w:rPr>
+        <w:t xml:space="preserve"> &lt;= </w:t>
+      </w:r>
+      <w:proofErr w:type="spellStart"/>
+      <w:r>
+        <w:rPr>
+          <w:rFonts w:ascii="Consolas" w:hAnsi="Consolas"/>
+          <w:sz w:val="22"/>
+          <w:szCs w:val="22"/>
+        </w:rPr>
+        <w:t>ParkingLot.numberOfGraceMinutes</w:t>
+      </w:r>
+      <w:proofErr w:type="spellEnd"/>
+      <w:r>
+        <w:rPr>
+          <w:rFonts w:ascii="Consolas" w:hAnsi="Consolas"/>
+          <w:sz w:val="22"/>
+          <w:szCs w:val="22"/>
+        </w:rPr>
+        <w:t>) THEN</w:t>
       </w:r>
     </w:p>
     <w:p>
@@ -1042,7 +1108,25 @@
           <w:szCs w:val="22"/>
         </w:rPr>
         <w:tab/>
-        <w:t xml:space="preserve">        AmountPaid = 0</w:t>
+        <w:t xml:space="preserve">        </w:t>
+      </w:r>
+      <w:proofErr w:type="spellStart"/>
+      <w:r>
+        <w:rPr>
+          <w:rFonts w:ascii="Consolas" w:hAnsi="Consolas"/>
+          <w:sz w:val="22"/>
+          <w:szCs w:val="22"/>
+        </w:rPr>
+        <w:t>AmountPaid</w:t>
+      </w:r>
+      <w:proofErr w:type="spellEnd"/>
+      <w:r>
+        <w:rPr>
+          <w:rFonts w:ascii="Consolas" w:hAnsi="Consolas"/>
+          <w:sz w:val="22"/>
+          <w:szCs w:val="22"/>
+        </w:rPr>
+        <w:t xml:space="preserve"> = 0</w:t>
       </w:r>
     </w:p>
     <w:p>
@@ -1082,8 +1166,54 @@
           <w:sz w:val="22"/>
           <w:szCs w:val="22"/>
         </w:rPr>
-        <w:t xml:space="preserve">         AmountPaid = TotalMinutes * ParkingLot.price</w:t>
-      </w:r>
+        <w:t xml:space="preserve">         </w:t>
+      </w:r>
+      <w:proofErr w:type="spellStart"/>
+      <w:r>
+        <w:rPr>
+          <w:rFonts w:ascii="Consolas" w:hAnsi="Consolas"/>
+          <w:sz w:val="22"/>
+          <w:szCs w:val="22"/>
+        </w:rPr>
+        <w:t>AmountPaid</w:t>
+      </w:r>
+      <w:proofErr w:type="spellEnd"/>
+      <w:r>
+        <w:rPr>
+          <w:rFonts w:ascii="Consolas" w:hAnsi="Consolas"/>
+          <w:sz w:val="22"/>
+          <w:szCs w:val="22"/>
+        </w:rPr>
+        <w:t xml:space="preserve"> = </w:t>
+      </w:r>
+      <w:proofErr w:type="spellStart"/>
+      <w:r>
+        <w:rPr>
+          <w:rFonts w:ascii="Consolas" w:hAnsi="Consolas"/>
+          <w:sz w:val="22"/>
+          <w:szCs w:val="22"/>
+        </w:rPr>
+        <w:t>TotalMinutes</w:t>
+      </w:r>
+      <w:proofErr w:type="spellEnd"/>
+      <w:r>
+        <w:rPr>
+          <w:rFonts w:ascii="Consolas" w:hAnsi="Consolas"/>
+          <w:sz w:val="22"/>
+          <w:szCs w:val="22"/>
+        </w:rPr>
+        <w:t xml:space="preserve"> * </w:t>
+      </w:r>
+      <w:proofErr w:type="spellStart"/>
+      <w:r>
+        <w:rPr>
+          <w:rFonts w:ascii="Consolas" w:hAnsi="Consolas"/>
+          <w:sz w:val="22"/>
+          <w:szCs w:val="22"/>
+        </w:rPr>
+        <w:t>ParkingLot.price</w:t>
+      </w:r>
+      <w:proofErr w:type="spellEnd"/>
     </w:p>
     <w:p>
       <w:pPr>
@@ -1142,7 +1272,43 @@
           <w:sz w:val="22"/>
           <w:szCs w:val="22"/>
         </w:rPr>
-        <w:t xml:space="preserve">    TotalDays = CEILING(TotalMinutes / 1440)</w:t>
+        <w:t xml:space="preserve">    </w:t>
+      </w:r>
+      <w:proofErr w:type="spellStart"/>
+      <w:r>
+        <w:rPr>
+          <w:rFonts w:ascii="Consolas" w:hAnsi="Consolas"/>
+          <w:sz w:val="22"/>
+          <w:szCs w:val="22"/>
+        </w:rPr>
+        <w:t>TotalDays</w:t>
+      </w:r>
+      <w:proofErr w:type="spellEnd"/>
+      <w:r>
+        <w:rPr>
+          <w:rFonts w:ascii="Consolas" w:hAnsi="Consolas"/>
+          <w:sz w:val="22"/>
+          <w:szCs w:val="22"/>
+        </w:rPr>
+        <w:t xml:space="preserve"> = CEILING(</w:t>
+      </w:r>
+      <w:proofErr w:type="spellStart"/>
+      <w:r>
+        <w:rPr>
+          <w:rFonts w:ascii="Consolas" w:hAnsi="Consolas"/>
+          <w:sz w:val="22"/>
+          <w:szCs w:val="22"/>
+        </w:rPr>
+        <w:t>TotalMinutes</w:t>
+      </w:r>
+      <w:proofErr w:type="spellEnd"/>
+      <w:r>
+        <w:rPr>
+          <w:rFonts w:ascii="Consolas" w:hAnsi="Consolas"/>
+          <w:sz w:val="22"/>
+          <w:szCs w:val="22"/>
+        </w:rPr>
+        <w:t xml:space="preserve"> / 1440)</w:t>
       </w:r>
     </w:p>
     <w:p>
@@ -1162,8 +1328,54 @@
           <w:sz w:val="22"/>
           <w:szCs w:val="22"/>
         </w:rPr>
-        <w:t xml:space="preserve">    AmountPaid = TotalDays * ParkingLot.price</w:t>
-      </w:r>
+        <w:t xml:space="preserve">    </w:t>
+      </w:r>
+      <w:proofErr w:type="spellStart"/>
+      <w:r>
+        <w:rPr>
+          <w:rFonts w:ascii="Consolas" w:hAnsi="Consolas"/>
+          <w:sz w:val="22"/>
+          <w:szCs w:val="22"/>
+        </w:rPr>
+        <w:t>AmountPaid</w:t>
+      </w:r>
+      <w:proofErr w:type="spellEnd"/>
+      <w:r>
+        <w:rPr>
+          <w:rFonts w:ascii="Consolas" w:hAnsi="Consolas"/>
+          <w:sz w:val="22"/>
+          <w:szCs w:val="22"/>
+        </w:rPr>
+        <w:t xml:space="preserve"> = </w:t>
+      </w:r>
+      <w:proofErr w:type="spellStart"/>
+      <w:r>
+        <w:rPr>
+          <w:rFonts w:ascii="Consolas" w:hAnsi="Consolas"/>
+          <w:sz w:val="22"/>
+          <w:szCs w:val="22"/>
+        </w:rPr>
+        <w:t>TotalDays</w:t>
+      </w:r>
+      <w:proofErr w:type="spellEnd"/>
+      <w:r>
+        <w:rPr>
+          <w:rFonts w:ascii="Consolas" w:hAnsi="Consolas"/>
+          <w:sz w:val="22"/>
+          <w:szCs w:val="22"/>
+        </w:rPr>
+        <w:t xml:space="preserve"> * </w:t>
+      </w:r>
+      <w:proofErr w:type="spellStart"/>
+      <w:r>
+        <w:rPr>
+          <w:rFonts w:ascii="Consolas" w:hAnsi="Consolas"/>
+          <w:sz w:val="22"/>
+          <w:szCs w:val="22"/>
+        </w:rPr>
+        <w:t>ParkingLot.price</w:t>
+      </w:r>
+      <w:proofErr w:type="spellEnd"/>
     </w:p>
     <w:p>
       <w:pPr>
@@ -1182,7 +1394,43 @@
           <w:sz w:val="22"/>
           <w:szCs w:val="22"/>
         </w:rPr>
-        <w:t xml:space="preserve">    IF (TotalDays &gt; ParkingLot.maxDaysAllowed) THEN</w:t>
+        <w:t xml:space="preserve">    IF (</w:t>
+      </w:r>
+      <w:proofErr w:type="spellStart"/>
+      <w:r>
+        <w:rPr>
+          <w:rFonts w:ascii="Consolas" w:hAnsi="Consolas"/>
+          <w:sz w:val="22"/>
+          <w:szCs w:val="22"/>
+        </w:rPr>
+        <w:t>TotalDays</w:t>
+      </w:r>
+      <w:proofErr w:type="spellEnd"/>
+      <w:r>
+        <w:rPr>
+          <w:rFonts w:ascii="Consolas" w:hAnsi="Consolas"/>
+          <w:sz w:val="22"/>
+          <w:szCs w:val="22"/>
+        </w:rPr>
+        <w:t xml:space="preserve"> &gt; </w:t>
+      </w:r>
+      <w:proofErr w:type="spellStart"/>
+      <w:r>
+        <w:rPr>
+          <w:rFonts w:ascii="Consolas" w:hAnsi="Consolas"/>
+          <w:sz w:val="22"/>
+          <w:szCs w:val="22"/>
+        </w:rPr>
+        <w:t>ParkingLot.maxDaysAllowed</w:t>
+      </w:r>
+      <w:proofErr w:type="spellEnd"/>
+      <w:r>
+        <w:rPr>
+          <w:rFonts w:ascii="Consolas" w:hAnsi="Consolas"/>
+          <w:sz w:val="22"/>
+          <w:szCs w:val="22"/>
+        </w:rPr>
+        <w:t>) THEN</w:t>
       </w:r>
     </w:p>
     <w:p>
@@ -1202,7 +1450,43 @@
           <w:sz w:val="22"/>
           <w:szCs w:val="22"/>
         </w:rPr>
-        <w:t xml:space="preserve">    AmountPaid = AmountPaid + PENALTY_FEE</w:t>
+        <w:t xml:space="preserve">    </w:t>
+      </w:r>
+      <w:proofErr w:type="spellStart"/>
+      <w:r>
+        <w:rPr>
+          <w:rFonts w:ascii="Consolas" w:hAnsi="Consolas"/>
+          <w:sz w:val="22"/>
+          <w:szCs w:val="22"/>
+        </w:rPr>
+        <w:t>AmountPaid</w:t>
+      </w:r>
+      <w:proofErr w:type="spellEnd"/>
+      <w:r>
+        <w:rPr>
+          <w:rFonts w:ascii="Consolas" w:hAnsi="Consolas"/>
+          <w:sz w:val="22"/>
+          <w:szCs w:val="22"/>
+        </w:rPr>
+        <w:t xml:space="preserve"> = </w:t>
+      </w:r>
+      <w:proofErr w:type="spellStart"/>
+      <w:r>
+        <w:rPr>
+          <w:rFonts w:ascii="Consolas" w:hAnsi="Consolas"/>
+          <w:sz w:val="22"/>
+          <w:szCs w:val="22"/>
+        </w:rPr>
+        <w:t>AmountPaid</w:t>
+      </w:r>
+      <w:proofErr w:type="spellEnd"/>
+      <w:r>
+        <w:rPr>
+          <w:rFonts w:ascii="Consolas" w:hAnsi="Consolas"/>
+          <w:sz w:val="22"/>
+          <w:szCs w:val="22"/>
+        </w:rPr>
+        <w:t xml:space="preserve"> + PENALTY_FEE</w:t>
       </w:r>
     </w:p>
     <w:p>
@@ -1262,8 +1546,18 @@
           <w:sz w:val="22"/>
           <w:szCs w:val="22"/>
         </w:rPr>
-        <w:t>RETURN AmountPaid</w:t>
-      </w:r>
+        <w:t xml:space="preserve">RETURN </w:t>
+      </w:r>
+      <w:proofErr w:type="spellStart"/>
+      <w:r>
+        <w:rPr>
+          <w:rFonts w:ascii="Consolas" w:hAnsi="Consolas"/>
+          <w:sz w:val="22"/>
+          <w:szCs w:val="22"/>
+        </w:rPr>
+        <w:t>AmountPaid</w:t>
+      </w:r>
+      <w:proofErr w:type="spellEnd"/>
     </w:p>
     <w:p>
       <w:pPr>
@@ -1387,6 +1681,7 @@
                 <w:rtl/>
               </w:rPr>
             </w:pPr>
+            <w:proofErr w:type="spellStart"/>
             <w:r>
               <w:rPr>
                 <w:rFonts w:asciiTheme="minorBidi" w:hAnsiTheme="minorBidi"/>
@@ -1396,6 +1691,7 @@
               </w:rPr>
               <w:t>uniqueNumber</w:t>
             </w:r>
+            <w:proofErr w:type="spellEnd"/>
             <w:r>
               <w:rPr>
                 <w:rFonts w:asciiTheme="minorBidi" w:hAnsiTheme="minorBidi"/>
@@ -1419,6 +1715,7 @@
                 <w:rtl/>
               </w:rPr>
             </w:pPr>
+            <w:proofErr w:type="spellStart"/>
             <w:r>
               <w:rPr>
                 <w:rFonts w:asciiTheme="minorBidi" w:hAnsiTheme="minorBidi"/>
@@ -1427,6 +1724,7 @@
               </w:rPr>
               <w:t>ParkingLot</w:t>
             </w:r>
+            <w:proofErr w:type="spellEnd"/>
           </w:p>
         </w:tc>
       </w:tr>
@@ -1447,6 +1745,7 @@
                 <w:rtl/>
               </w:rPr>
             </w:pPr>
+            <w:proofErr w:type="spellStart"/>
             <w:r>
               <w:rPr>
                 <w:rFonts w:asciiTheme="minorBidi" w:hAnsiTheme="minorBidi"/>
@@ -1456,14 +1755,43 @@
               </w:rPr>
               <w:t>uniqueNumber</w:t>
             </w:r>
-            <w:r>
-              <w:rPr>
-                <w:rFonts w:asciiTheme="minorBidi" w:hAnsiTheme="minorBidi"/>
-                <w:sz w:val="22"/>
-                <w:szCs w:val="22"/>
-              </w:rPr>
-              <w:t>(FK ParkingLot), numberOfGraceMinutes</w:t>
-            </w:r>
+            <w:proofErr w:type="spellEnd"/>
+            <w:r>
+              <w:rPr>
+                <w:rFonts w:asciiTheme="minorBidi" w:hAnsiTheme="minorBidi"/>
+                <w:sz w:val="22"/>
+                <w:szCs w:val="22"/>
+              </w:rPr>
+              <w:t xml:space="preserve">(FK </w:t>
+            </w:r>
+            <w:proofErr w:type="spellStart"/>
+            <w:r>
+              <w:rPr>
+                <w:rFonts w:asciiTheme="minorBidi" w:hAnsiTheme="minorBidi"/>
+                <w:sz w:val="22"/>
+                <w:szCs w:val="22"/>
+              </w:rPr>
+              <w:t>ParkingLot</w:t>
+            </w:r>
+            <w:proofErr w:type="spellEnd"/>
+            <w:r>
+              <w:rPr>
+                <w:rFonts w:asciiTheme="minorBidi" w:hAnsiTheme="minorBidi"/>
+                <w:sz w:val="22"/>
+                <w:szCs w:val="22"/>
+              </w:rPr>
+              <w:t xml:space="preserve">), </w:t>
+            </w:r>
+            <w:proofErr w:type="spellStart"/>
+            <w:r>
+              <w:rPr>
+                <w:rFonts w:asciiTheme="minorBidi" w:hAnsiTheme="minorBidi"/>
+                <w:sz w:val="22"/>
+                <w:szCs w:val="22"/>
+              </w:rPr>
+              <w:t>numberOfGraceMinutes</w:t>
+            </w:r>
+            <w:proofErr w:type="spellEnd"/>
           </w:p>
         </w:tc>
         <w:tc>
@@ -1479,6 +1807,7 @@
                 <w:rtl/>
               </w:rPr>
             </w:pPr>
+            <w:proofErr w:type="spellStart"/>
             <w:r>
               <w:rPr>
                 <w:rFonts w:asciiTheme="minorBidi" w:hAnsiTheme="minorBidi"/>
@@ -1487,6 +1816,7 @@
               </w:rPr>
               <w:t>MinutesParkingLot</w:t>
             </w:r>
+            <w:proofErr w:type="spellEnd"/>
           </w:p>
         </w:tc>
       </w:tr>
@@ -1507,6 +1837,7 @@
                 <w:rtl/>
               </w:rPr>
             </w:pPr>
+            <w:proofErr w:type="spellStart"/>
             <w:r>
               <w:rPr>
                 <w:rFonts w:asciiTheme="minorBidi" w:hAnsiTheme="minorBidi"/>
@@ -1516,14 +1847,61 @@
               </w:rPr>
               <w:t>uniqueNumber</w:t>
             </w:r>
-            <w:r>
-              <w:rPr>
-                <w:rFonts w:asciiTheme="minorBidi" w:hAnsiTheme="minorBidi"/>
-                <w:sz w:val="22"/>
-                <w:szCs w:val="22"/>
-              </w:rPr>
-              <w:t>(FK ParkingLot), overnightAllowed, maxDaysAllowed</w:t>
-            </w:r>
+            <w:proofErr w:type="spellEnd"/>
+            <w:r>
+              <w:rPr>
+                <w:rFonts w:asciiTheme="minorBidi" w:hAnsiTheme="minorBidi"/>
+                <w:sz w:val="22"/>
+                <w:szCs w:val="22"/>
+              </w:rPr>
+              <w:t xml:space="preserve">(FK </w:t>
+            </w:r>
+            <w:proofErr w:type="spellStart"/>
+            <w:r>
+              <w:rPr>
+                <w:rFonts w:asciiTheme="minorBidi" w:hAnsiTheme="minorBidi"/>
+                <w:sz w:val="22"/>
+                <w:szCs w:val="22"/>
+              </w:rPr>
+              <w:t>ParkingLot</w:t>
+            </w:r>
+            <w:proofErr w:type="spellEnd"/>
+            <w:r>
+              <w:rPr>
+                <w:rFonts w:asciiTheme="minorBidi" w:hAnsiTheme="minorBidi"/>
+                <w:sz w:val="22"/>
+                <w:szCs w:val="22"/>
+              </w:rPr>
+              <w:t xml:space="preserve">), </w:t>
+            </w:r>
+            <w:proofErr w:type="spellStart"/>
+            <w:r>
+              <w:rPr>
+                <w:rFonts w:asciiTheme="minorBidi" w:hAnsiTheme="minorBidi"/>
+                <w:sz w:val="22"/>
+                <w:szCs w:val="22"/>
+              </w:rPr>
+              <w:t>overnightAllowed</w:t>
+            </w:r>
+            <w:proofErr w:type="spellEnd"/>
+            <w:r>
+              <w:rPr>
+                <w:rFonts w:asciiTheme="minorBidi" w:hAnsiTheme="minorBidi"/>
+                <w:sz w:val="22"/>
+                <w:szCs w:val="22"/>
+              </w:rPr>
+              <w:t xml:space="preserve">, </w:t>
+            </w:r>
+            <w:proofErr w:type="spellStart"/>
+            <w:r>
+              <w:rPr>
+                <w:rFonts w:asciiTheme="minorBidi" w:hAnsiTheme="minorBidi"/>
+                <w:sz w:val="22"/>
+                <w:szCs w:val="22"/>
+              </w:rPr>
+              <w:t>maxDaysAllowed</w:t>
+            </w:r>
+            <w:proofErr w:type="spellEnd"/>
           </w:p>
         </w:tc>
         <w:tc>
@@ -1539,6 +1917,7 @@
                 <w:rtl/>
               </w:rPr>
             </w:pPr>
+            <w:proofErr w:type="spellStart"/>
             <w:r>
               <w:rPr>
                 <w:rFonts w:asciiTheme="minorBidi" w:hAnsiTheme="minorBidi"/>
@@ -1547,6 +1926,7 @@
               </w:rPr>
               <w:t>DailyParkingLot</w:t>
             </w:r>
+            <w:proofErr w:type="spellEnd"/>
           </w:p>
         </w:tc>
       </w:tr>
@@ -1567,6 +1947,7 @@
                 <w:rtl/>
               </w:rPr>
             </w:pPr>
+            <w:proofErr w:type="spellStart"/>
             <w:r>
               <w:rPr>
                 <w:rFonts w:asciiTheme="minorBidi" w:hAnsiTheme="minorBidi"/>
@@ -1574,6 +1955,7 @@
               </w:rPr>
               <w:t>vehicleNumber</w:t>
             </w:r>
+            <w:proofErr w:type="spellEnd"/>
             <w:r>
               <w:rPr>
                 <w:rFonts w:asciiTheme="minorBidi" w:hAnsiTheme="minorBidi"/>
@@ -1623,6 +2005,7 @@
                 <w:rtl/>
               </w:rPr>
             </w:pPr>
+            <w:proofErr w:type="spellStart"/>
             <w:r>
               <w:rPr>
                 <w:rFonts w:asciiTheme="minorBidi" w:hAnsiTheme="minorBidi"/>
@@ -1630,20 +2013,32 @@
               </w:rPr>
               <w:t>uniqueNumber</w:t>
             </w:r>
-            <w:r>
-              <w:rPr>
-                <w:rFonts w:asciiTheme="minorBidi" w:hAnsiTheme="minorBidi"/>
-                <w:sz w:val="22"/>
-                <w:szCs w:val="22"/>
-              </w:rPr>
-              <w:t>(FK ParkingLot</w:t>
-            </w:r>
+            <w:proofErr w:type="spellEnd"/>
+            <w:r>
+              <w:rPr>
+                <w:rFonts w:asciiTheme="minorBidi" w:hAnsiTheme="minorBidi"/>
+                <w:sz w:val="22"/>
+                <w:szCs w:val="22"/>
+              </w:rPr>
+              <w:t xml:space="preserve">(FK </w:t>
+            </w:r>
+            <w:proofErr w:type="spellStart"/>
+            <w:r>
+              <w:rPr>
+                <w:rFonts w:asciiTheme="minorBidi" w:hAnsiTheme="minorBidi"/>
+                <w:sz w:val="22"/>
+                <w:szCs w:val="22"/>
+              </w:rPr>
+              <w:t>ParkingLot</w:t>
+            </w:r>
+            <w:proofErr w:type="spellEnd"/>
             <w:r>
               <w:rPr>
                 <w:rFonts w:asciiTheme="minorBidi" w:hAnsiTheme="minorBidi"/>
               </w:rPr>
               <w:t xml:space="preserve">), </w:t>
             </w:r>
+            <w:proofErr w:type="spellStart"/>
             <w:r>
               <w:rPr>
                 <w:rFonts w:asciiTheme="minorBidi" w:hAnsiTheme="minorBidi"/>
@@ -1651,12 +2046,14 @@
               </w:rPr>
               <w:t>floorNumber</w:t>
             </w:r>
+            <w:proofErr w:type="spellEnd"/>
             <w:r>
               <w:rPr>
                 <w:rFonts w:asciiTheme="minorBidi" w:hAnsiTheme="minorBidi"/>
               </w:rPr>
               <w:t xml:space="preserve">, </w:t>
             </w:r>
+            <w:proofErr w:type="spellStart"/>
             <w:r>
               <w:rPr>
                 <w:rFonts w:asciiTheme="minorBidi" w:hAnsiTheme="minorBidi"/>
@@ -1664,6 +2061,7 @@
               </w:rPr>
               <w:t>spaceNumber</w:t>
             </w:r>
+            <w:proofErr w:type="spellEnd"/>
             <w:r>
               <w:rPr>
                 <w:rFonts w:asciiTheme="minorBidi" w:hAnsiTheme="minorBidi"/>
@@ -1685,6 +2083,7 @@
                 <w:rtl/>
               </w:rPr>
             </w:pPr>
+            <w:proofErr w:type="spellStart"/>
             <w:r>
               <w:rPr>
                 <w:rFonts w:asciiTheme="minorBidi" w:hAnsiTheme="minorBidi"/>
@@ -1693,6 +2092,7 @@
               </w:rPr>
               <w:t>ParkingSpace</w:t>
             </w:r>
+            <w:proofErr w:type="spellEnd"/>
           </w:p>
         </w:tc>
       </w:tr>
@@ -1713,6 +2113,7 @@
                 <w:rtl/>
               </w:rPr>
             </w:pPr>
+            <w:proofErr w:type="spellStart"/>
             <w:r>
               <w:rPr>
                 <w:rFonts w:asciiTheme="minorBidi" w:hAnsiTheme="minorBidi"/>
@@ -1720,7 +2121,17 @@
                 <w:szCs w:val="22"/>
                 <w:u w:val="single"/>
               </w:rPr>
-              <w:t xml:space="preserve">vehicleNumber(FK </w:t>
+              <w:t>vehicleNumber</w:t>
+            </w:r>
+            <w:proofErr w:type="spellEnd"/>
+            <w:r>
+              <w:rPr>
+                <w:rFonts w:asciiTheme="minorBidi" w:hAnsiTheme="minorBidi"/>
+                <w:sz w:val="22"/>
+                <w:szCs w:val="22"/>
+                <w:u w:val="single"/>
+              </w:rPr>
+              <w:t xml:space="preserve">(FK </w:t>
             </w:r>
             <w:r>
               <w:rPr>
@@ -1730,6 +2141,7 @@
               </w:rPr>
               <w:t xml:space="preserve"> Vehicle), </w:t>
             </w:r>
+            <w:proofErr w:type="spellStart"/>
             <w:r>
               <w:rPr>
                 <w:rFonts w:asciiTheme="minorBidi" w:hAnsiTheme="minorBidi"/>
@@ -1739,14 +2151,34 @@
               </w:rPr>
               <w:t>uniqueNumber</w:t>
             </w:r>
-            <w:r>
-              <w:rPr>
-                <w:rFonts w:asciiTheme="minorBidi" w:hAnsiTheme="minorBidi"/>
-                <w:sz w:val="22"/>
-                <w:szCs w:val="22"/>
-              </w:rPr>
-              <w:t xml:space="preserve">(FK  ParkingSpace) , </w:t>
-            </w:r>
+            <w:proofErr w:type="spellEnd"/>
+            <w:r>
+              <w:rPr>
+                <w:rFonts w:asciiTheme="minorBidi" w:hAnsiTheme="minorBidi"/>
+                <w:sz w:val="22"/>
+                <w:szCs w:val="22"/>
+              </w:rPr>
+              <w:t xml:space="preserve">(FK  </w:t>
+            </w:r>
+            <w:proofErr w:type="spellStart"/>
+            <w:r>
+              <w:rPr>
+                <w:rFonts w:asciiTheme="minorBidi" w:hAnsiTheme="minorBidi"/>
+                <w:sz w:val="22"/>
+                <w:szCs w:val="22"/>
+              </w:rPr>
+              <w:t>ParkingSpace</w:t>
+            </w:r>
+            <w:proofErr w:type="spellEnd"/>
+            <w:r>
+              <w:rPr>
+                <w:rFonts w:asciiTheme="minorBidi" w:hAnsiTheme="minorBidi"/>
+                <w:sz w:val="22"/>
+                <w:szCs w:val="22"/>
+              </w:rPr>
+              <w:t xml:space="preserve">) , </w:t>
+            </w:r>
+            <w:proofErr w:type="spellStart"/>
             <w:r>
               <w:rPr>
                 <w:rFonts w:asciiTheme="minorBidi" w:hAnsiTheme="minorBidi"/>
@@ -1756,14 +2188,34 @@
               </w:rPr>
               <w:t>floorNumber</w:t>
             </w:r>
-            <w:r>
-              <w:rPr>
-                <w:rFonts w:asciiTheme="minorBidi" w:hAnsiTheme="minorBidi"/>
-                <w:sz w:val="22"/>
-                <w:szCs w:val="22"/>
-              </w:rPr>
-              <w:t xml:space="preserve">(FK  ParkingSpace) , </w:t>
-            </w:r>
+            <w:proofErr w:type="spellEnd"/>
+            <w:r>
+              <w:rPr>
+                <w:rFonts w:asciiTheme="minorBidi" w:hAnsiTheme="minorBidi"/>
+                <w:sz w:val="22"/>
+                <w:szCs w:val="22"/>
+              </w:rPr>
+              <w:t xml:space="preserve">(FK  </w:t>
+            </w:r>
+            <w:proofErr w:type="spellStart"/>
+            <w:r>
+              <w:rPr>
+                <w:rFonts w:asciiTheme="minorBidi" w:hAnsiTheme="minorBidi"/>
+                <w:sz w:val="22"/>
+                <w:szCs w:val="22"/>
+              </w:rPr>
+              <w:t>ParkingSpace</w:t>
+            </w:r>
+            <w:proofErr w:type="spellEnd"/>
+            <w:r>
+              <w:rPr>
+                <w:rFonts w:asciiTheme="minorBidi" w:hAnsiTheme="minorBidi"/>
+                <w:sz w:val="22"/>
+                <w:szCs w:val="22"/>
+              </w:rPr>
+              <w:t xml:space="preserve">) , </w:t>
+            </w:r>
+            <w:proofErr w:type="spellStart"/>
             <w:r>
               <w:rPr>
                 <w:rFonts w:asciiTheme="minorBidi" w:hAnsiTheme="minorBidi"/>
@@ -1771,16 +2223,9 @@
                 <w:szCs w:val="22"/>
                 <w:u w:val="single"/>
               </w:rPr>
-              <w:t xml:space="preserve">spaceNumber(FK </w:t>
-            </w:r>
-            <w:r>
-              <w:rPr>
-                <w:rFonts w:asciiTheme="minorBidi" w:hAnsiTheme="minorBidi"/>
-                <w:sz w:val="22"/>
-                <w:szCs w:val="22"/>
-              </w:rPr>
-              <w:t xml:space="preserve"> ParkingSpace), </w:t>
-            </w:r>
+              <w:t>spaceNumber</w:t>
+            </w:r>
+            <w:proofErr w:type="spellEnd"/>
             <w:r>
               <w:rPr>
                 <w:rFonts w:asciiTheme="minorBidi" w:hAnsiTheme="minorBidi"/>
@@ -1788,16 +2233,81 @@
                 <w:szCs w:val="22"/>
                 <w:u w:val="single"/>
               </w:rPr>
+              <w:t xml:space="preserve">(FK </w:t>
+            </w:r>
+            <w:r>
+              <w:rPr>
+                <w:rFonts w:asciiTheme="minorBidi" w:hAnsiTheme="minorBidi"/>
+                <w:sz w:val="22"/>
+                <w:szCs w:val="22"/>
+              </w:rPr>
+              <w:t xml:space="preserve"> </w:t>
+            </w:r>
+            <w:proofErr w:type="spellStart"/>
+            <w:r>
+              <w:rPr>
+                <w:rFonts w:asciiTheme="minorBidi" w:hAnsiTheme="minorBidi"/>
+                <w:sz w:val="22"/>
+                <w:szCs w:val="22"/>
+              </w:rPr>
+              <w:t>ParkingSpace</w:t>
+            </w:r>
+            <w:proofErr w:type="spellEnd"/>
+            <w:r>
+              <w:rPr>
+                <w:rFonts w:asciiTheme="minorBidi" w:hAnsiTheme="minorBidi"/>
+                <w:sz w:val="22"/>
+                <w:szCs w:val="22"/>
+              </w:rPr>
+              <w:t xml:space="preserve">), </w:t>
+            </w:r>
+            <w:proofErr w:type="spellStart"/>
+            <w:r>
+              <w:rPr>
+                <w:rFonts w:asciiTheme="minorBidi" w:hAnsiTheme="minorBidi"/>
+                <w:sz w:val="22"/>
+                <w:szCs w:val="22"/>
+                <w:u w:val="single"/>
+              </w:rPr>
               <w:t>startTime</w:t>
             </w:r>
-            <w:r>
-              <w:rPr>
-                <w:rFonts w:asciiTheme="minorBidi" w:hAnsiTheme="minorBidi"/>
-                <w:sz w:val="22"/>
-                <w:szCs w:val="22"/>
-              </w:rPr>
-              <w:t>, endTime, amountPaid</w:t>
-            </w:r>
+            <w:proofErr w:type="spellEnd"/>
+            <w:r>
+              <w:rPr>
+                <w:rFonts w:asciiTheme="minorBidi" w:hAnsiTheme="minorBidi"/>
+                <w:sz w:val="22"/>
+                <w:szCs w:val="22"/>
+              </w:rPr>
+              <w:t xml:space="preserve">, </w:t>
+            </w:r>
+            <w:proofErr w:type="spellStart"/>
+            <w:r>
+              <w:rPr>
+                <w:rFonts w:asciiTheme="minorBidi" w:hAnsiTheme="minorBidi"/>
+                <w:sz w:val="22"/>
+                <w:szCs w:val="22"/>
+              </w:rPr>
+              <w:t>endTime</w:t>
+            </w:r>
+            <w:proofErr w:type="spellEnd"/>
+            <w:r>
+              <w:rPr>
+                <w:rFonts w:asciiTheme="minorBidi" w:hAnsiTheme="minorBidi"/>
+                <w:sz w:val="22"/>
+                <w:szCs w:val="22"/>
+              </w:rPr>
+              <w:t xml:space="preserve">, </w:t>
+            </w:r>
+            <w:proofErr w:type="spellStart"/>
+            <w:r>
+              <w:rPr>
+                <w:rFonts w:asciiTheme="minorBidi" w:hAnsiTheme="minorBidi"/>
+                <w:sz w:val="22"/>
+                <w:szCs w:val="22"/>
+              </w:rPr>
+              <w:t>amountPaid</w:t>
+            </w:r>
+            <w:proofErr w:type="spellEnd"/>
           </w:p>
         </w:tc>
         <w:tc>
@@ -1813,12 +2323,14 @@
                 <w:rtl/>
               </w:rPr>
             </w:pPr>
+            <w:proofErr w:type="spellStart"/>
             <w:r>
               <w:rPr>
                 <w:rFonts w:asciiTheme="minorBidi" w:hAnsiTheme="minorBidi"/>
               </w:rPr>
               <w:t>ParksIn</w:t>
             </w:r>
+            <w:proofErr w:type="spellEnd"/>
           </w:p>
         </w:tc>
       </w:tr>
@@ -1964,6 +2476,7 @@
                 <w:rtl/>
               </w:rPr>
             </w:pPr>
+            <w:proofErr w:type="spellStart"/>
             <w:r>
               <w:rPr>
                 <w:rFonts w:asciiTheme="minorBidi" w:hAnsiTheme="minorBidi"/>
@@ -1973,6 +2486,7 @@
               </w:rPr>
               <w:t>uniqueNumber</w:t>
             </w:r>
+            <w:proofErr w:type="spellEnd"/>
             <w:r>
               <w:rPr>
                 <w:rFonts w:asciiTheme="minorBidi" w:hAnsiTheme="minorBidi"/>
@@ -1996,6 +2510,7 @@
                 <w:rtl/>
               </w:rPr>
             </w:pPr>
+            <w:proofErr w:type="spellStart"/>
             <w:r>
               <w:rPr>
                 <w:rFonts w:asciiTheme="minorBidi" w:hAnsiTheme="minorBidi"/>
@@ -2004,6 +2519,7 @@
               </w:rPr>
               <w:t>ParkingLot</w:t>
             </w:r>
+            <w:proofErr w:type="spellEnd"/>
           </w:p>
         </w:tc>
       </w:tr>
@@ -2024,6 +2540,7 @@
                 <w:rtl/>
               </w:rPr>
             </w:pPr>
+            <w:proofErr w:type="spellStart"/>
             <w:r>
               <w:rPr>
                 <w:rFonts w:asciiTheme="minorBidi" w:hAnsiTheme="minorBidi"/>
@@ -2033,14 +2550,43 @@
               </w:rPr>
               <w:t>uniqueNumber</w:t>
             </w:r>
-            <w:r>
-              <w:rPr>
-                <w:rFonts w:asciiTheme="minorBidi" w:hAnsiTheme="minorBidi"/>
-                <w:sz w:val="22"/>
-                <w:szCs w:val="22"/>
-              </w:rPr>
-              <w:t>(FK ParkingLot), numberOfGraceMinutes</w:t>
-            </w:r>
+            <w:proofErr w:type="spellEnd"/>
+            <w:r>
+              <w:rPr>
+                <w:rFonts w:asciiTheme="minorBidi" w:hAnsiTheme="minorBidi"/>
+                <w:sz w:val="22"/>
+                <w:szCs w:val="22"/>
+              </w:rPr>
+              <w:t xml:space="preserve">(FK </w:t>
+            </w:r>
+            <w:proofErr w:type="spellStart"/>
+            <w:r>
+              <w:rPr>
+                <w:rFonts w:asciiTheme="minorBidi" w:hAnsiTheme="minorBidi"/>
+                <w:sz w:val="22"/>
+                <w:szCs w:val="22"/>
+              </w:rPr>
+              <w:t>ParkingLot</w:t>
+            </w:r>
+            <w:proofErr w:type="spellEnd"/>
+            <w:r>
+              <w:rPr>
+                <w:rFonts w:asciiTheme="minorBidi" w:hAnsiTheme="minorBidi"/>
+                <w:sz w:val="22"/>
+                <w:szCs w:val="22"/>
+              </w:rPr>
+              <w:t xml:space="preserve">), </w:t>
+            </w:r>
+            <w:proofErr w:type="spellStart"/>
+            <w:r>
+              <w:rPr>
+                <w:rFonts w:asciiTheme="minorBidi" w:hAnsiTheme="minorBidi"/>
+                <w:sz w:val="22"/>
+                <w:szCs w:val="22"/>
+              </w:rPr>
+              <w:t>numberOfGraceMinutes</w:t>
+            </w:r>
+            <w:proofErr w:type="spellEnd"/>
           </w:p>
         </w:tc>
         <w:tc>
@@ -2056,6 +2602,7 @@
                 <w:rtl/>
               </w:rPr>
             </w:pPr>
+            <w:proofErr w:type="spellStart"/>
             <w:r>
               <w:rPr>
                 <w:rFonts w:asciiTheme="minorBidi" w:hAnsiTheme="minorBidi"/>
@@ -2064,6 +2611,7 @@
               </w:rPr>
               <w:t>MinutesParkingLot</w:t>
             </w:r>
+            <w:proofErr w:type="spellEnd"/>
           </w:p>
         </w:tc>
       </w:tr>
@@ -2084,6 +2632,7 @@
                 <w:rtl/>
               </w:rPr>
             </w:pPr>
+            <w:proofErr w:type="spellStart"/>
             <w:r>
               <w:rPr>
                 <w:rFonts w:asciiTheme="minorBidi" w:hAnsiTheme="minorBidi"/>
@@ -2093,14 +2642,43 @@
               </w:rPr>
               <w:t>uniqueNumber</w:t>
             </w:r>
-            <w:r>
-              <w:rPr>
-                <w:rFonts w:asciiTheme="minorBidi" w:hAnsiTheme="minorBidi"/>
-                <w:sz w:val="22"/>
-                <w:szCs w:val="22"/>
-              </w:rPr>
-              <w:t>(FK ParkingLot), overnightAllowed, maxDaysAllowed</w:t>
-            </w:r>
+            <w:proofErr w:type="spellEnd"/>
+            <w:r>
+              <w:rPr>
+                <w:rFonts w:asciiTheme="minorBidi" w:hAnsiTheme="minorBidi"/>
+                <w:sz w:val="22"/>
+                <w:szCs w:val="22"/>
+              </w:rPr>
+              <w:t xml:space="preserve">(FK ParkingLot), </w:t>
+            </w:r>
+            <w:proofErr w:type="spellStart"/>
+            <w:r>
+              <w:rPr>
+                <w:rFonts w:asciiTheme="minorBidi" w:hAnsiTheme="minorBidi"/>
+                <w:sz w:val="22"/>
+                <w:szCs w:val="22"/>
+              </w:rPr>
+              <w:t>overnightAllowed</w:t>
+            </w:r>
+            <w:proofErr w:type="spellEnd"/>
+            <w:r>
+              <w:rPr>
+                <w:rFonts w:asciiTheme="minorBidi" w:hAnsiTheme="minorBidi"/>
+                <w:sz w:val="22"/>
+                <w:szCs w:val="22"/>
+              </w:rPr>
+              <w:t xml:space="preserve">, </w:t>
+            </w:r>
+            <w:proofErr w:type="spellStart"/>
+            <w:r>
+              <w:rPr>
+                <w:rFonts w:asciiTheme="minorBidi" w:hAnsiTheme="minorBidi"/>
+                <w:sz w:val="22"/>
+                <w:szCs w:val="22"/>
+              </w:rPr>
+              <w:t>maxDaysAllowed</w:t>
+            </w:r>
+            <w:proofErr w:type="spellEnd"/>
           </w:p>
         </w:tc>
         <w:tc>
@@ -2116,6 +2694,7 @@
                 <w:rtl/>
               </w:rPr>
             </w:pPr>
+            <w:proofErr w:type="spellStart"/>
             <w:r>
               <w:rPr>
                 <w:rFonts w:asciiTheme="minorBidi" w:hAnsiTheme="minorBidi"/>
@@ -2124,6 +2703,7 @@
               </w:rPr>
               <w:t>DailyParkingLot</w:t>
             </w:r>
+            <w:proofErr w:type="spellEnd"/>
           </w:p>
         </w:tc>
       </w:tr>
@@ -2144,6 +2724,7 @@
                 <w:rtl/>
               </w:rPr>
             </w:pPr>
+            <w:proofErr w:type="spellStart"/>
             <w:r>
               <w:rPr>
                 <w:rFonts w:asciiTheme="minorBidi" w:hAnsiTheme="minorBidi"/>
@@ -2151,6 +2732,7 @@
               </w:rPr>
               <w:t>vehicleNumber</w:t>
             </w:r>
+            <w:proofErr w:type="spellEnd"/>
             <w:r>
               <w:rPr>
                 <w:rFonts w:asciiTheme="minorBidi" w:hAnsiTheme="minorBidi"/>
@@ -2200,6 +2782,7 @@
                 <w:rtl/>
               </w:rPr>
             </w:pPr>
+            <w:proofErr w:type="spellStart"/>
             <w:r>
               <w:rPr>
                 <w:rFonts w:asciiTheme="minorBidi" w:hAnsiTheme="minorBidi"/>
@@ -2207,20 +2790,32 @@
               </w:rPr>
               <w:t>uniqueNumber</w:t>
             </w:r>
-            <w:r>
-              <w:rPr>
-                <w:rFonts w:asciiTheme="minorBidi" w:hAnsiTheme="minorBidi"/>
-                <w:sz w:val="22"/>
-                <w:szCs w:val="22"/>
-              </w:rPr>
-              <w:t>(FK ParkingLot</w:t>
-            </w:r>
+            <w:proofErr w:type="spellEnd"/>
+            <w:r>
+              <w:rPr>
+                <w:rFonts w:asciiTheme="minorBidi" w:hAnsiTheme="minorBidi"/>
+                <w:sz w:val="22"/>
+                <w:szCs w:val="22"/>
+              </w:rPr>
+              <w:t xml:space="preserve">(FK </w:t>
+            </w:r>
+            <w:proofErr w:type="spellStart"/>
+            <w:r>
+              <w:rPr>
+                <w:rFonts w:asciiTheme="minorBidi" w:hAnsiTheme="minorBidi"/>
+                <w:sz w:val="22"/>
+                <w:szCs w:val="22"/>
+              </w:rPr>
+              <w:t>ParkingLot</w:t>
+            </w:r>
+            <w:proofErr w:type="spellEnd"/>
             <w:r>
               <w:rPr>
                 <w:rFonts w:asciiTheme="minorBidi" w:hAnsiTheme="minorBidi"/>
               </w:rPr>
               <w:t xml:space="preserve">), </w:t>
             </w:r>
+            <w:proofErr w:type="spellStart"/>
             <w:r>
               <w:rPr>
                 <w:rFonts w:asciiTheme="minorBidi" w:hAnsiTheme="minorBidi"/>
@@ -2228,12 +2823,14 @@
               </w:rPr>
               <w:t>floorNumber</w:t>
             </w:r>
+            <w:proofErr w:type="spellEnd"/>
             <w:r>
               <w:rPr>
                 <w:rFonts w:asciiTheme="minorBidi" w:hAnsiTheme="minorBidi"/>
               </w:rPr>
               <w:t xml:space="preserve">, </w:t>
             </w:r>
+            <w:proofErr w:type="spellStart"/>
             <w:r>
               <w:rPr>
                 <w:rFonts w:asciiTheme="minorBidi" w:hAnsiTheme="minorBidi"/>
@@ -2241,6 +2838,7 @@
               </w:rPr>
               <w:t>spaceNumber</w:t>
             </w:r>
+            <w:proofErr w:type="spellEnd"/>
             <w:r>
               <w:rPr>
                 <w:rFonts w:asciiTheme="minorBidi" w:hAnsiTheme="minorBidi"/>
@@ -2262,6 +2860,7 @@
                 <w:rtl/>
               </w:rPr>
             </w:pPr>
+            <w:proofErr w:type="spellStart"/>
             <w:r>
               <w:rPr>
                 <w:rFonts w:asciiTheme="minorBidi" w:hAnsiTheme="minorBidi"/>
@@ -2270,6 +2869,7 @@
               </w:rPr>
               <w:t>ParkingSpace</w:t>
             </w:r>
+            <w:proofErr w:type="spellEnd"/>
           </w:p>
         </w:tc>
       </w:tr>
@@ -2290,6 +2890,7 @@
                 <w:rtl/>
               </w:rPr>
             </w:pPr>
+            <w:proofErr w:type="spellStart"/>
             <w:r>
               <w:rPr>
                 <w:rFonts w:asciiTheme="minorBidi" w:hAnsiTheme="minorBidi"/>
@@ -2297,7 +2898,17 @@
                 <w:szCs w:val="22"/>
                 <w:u w:val="single"/>
               </w:rPr>
-              <w:t xml:space="preserve">vehicleNumber(FK </w:t>
+              <w:t>vehicleNumber</w:t>
+            </w:r>
+            <w:proofErr w:type="spellEnd"/>
+            <w:r>
+              <w:rPr>
+                <w:rFonts w:asciiTheme="minorBidi" w:hAnsiTheme="minorBidi"/>
+                <w:sz w:val="22"/>
+                <w:szCs w:val="22"/>
+                <w:u w:val="single"/>
+              </w:rPr>
+              <w:t xml:space="preserve">(FK </w:t>
             </w:r>
             <w:r>
               <w:rPr>
@@ -2307,6 +2918,7 @@
               </w:rPr>
               <w:t xml:space="preserve"> Vehicle), </w:t>
             </w:r>
+            <w:proofErr w:type="spellStart"/>
             <w:r>
               <w:rPr>
                 <w:rFonts w:asciiTheme="minorBidi" w:hAnsiTheme="minorBidi"/>
@@ -2316,14 +2928,34 @@
               </w:rPr>
               <w:t>uniqueNumber</w:t>
             </w:r>
-            <w:r>
-              <w:rPr>
-                <w:rFonts w:asciiTheme="minorBidi" w:hAnsiTheme="minorBidi"/>
-                <w:sz w:val="22"/>
-                <w:szCs w:val="22"/>
-              </w:rPr>
-              <w:t xml:space="preserve">(FK  ParkingSpace) , </w:t>
-            </w:r>
+            <w:proofErr w:type="spellEnd"/>
+            <w:r>
+              <w:rPr>
+                <w:rFonts w:asciiTheme="minorBidi" w:hAnsiTheme="minorBidi"/>
+                <w:sz w:val="22"/>
+                <w:szCs w:val="22"/>
+              </w:rPr>
+              <w:t xml:space="preserve">(FK  </w:t>
+            </w:r>
+            <w:proofErr w:type="spellStart"/>
+            <w:r>
+              <w:rPr>
+                <w:rFonts w:asciiTheme="minorBidi" w:hAnsiTheme="minorBidi"/>
+                <w:sz w:val="22"/>
+                <w:szCs w:val="22"/>
+              </w:rPr>
+              <w:t>ParkingSpace</w:t>
+            </w:r>
+            <w:proofErr w:type="spellEnd"/>
+            <w:r>
+              <w:rPr>
+                <w:rFonts w:asciiTheme="minorBidi" w:hAnsiTheme="minorBidi"/>
+                <w:sz w:val="22"/>
+                <w:szCs w:val="22"/>
+              </w:rPr>
+              <w:t xml:space="preserve">) , </w:t>
+            </w:r>
+            <w:proofErr w:type="spellStart"/>
             <w:r>
               <w:rPr>
                 <w:rFonts w:asciiTheme="minorBidi" w:hAnsiTheme="minorBidi"/>
@@ -2333,14 +2965,34 @@
               </w:rPr>
               <w:t>floorNumber</w:t>
             </w:r>
-            <w:r>
-              <w:rPr>
-                <w:rFonts w:asciiTheme="minorBidi" w:hAnsiTheme="minorBidi"/>
-                <w:sz w:val="22"/>
-                <w:szCs w:val="22"/>
-              </w:rPr>
-              <w:t xml:space="preserve">(FK  ParkingSpace) , </w:t>
-            </w:r>
+            <w:proofErr w:type="spellEnd"/>
+            <w:r>
+              <w:rPr>
+                <w:rFonts w:asciiTheme="minorBidi" w:hAnsiTheme="minorBidi"/>
+                <w:sz w:val="22"/>
+                <w:szCs w:val="22"/>
+              </w:rPr>
+              <w:t xml:space="preserve">(FK  </w:t>
+            </w:r>
+            <w:proofErr w:type="spellStart"/>
+            <w:r>
+              <w:rPr>
+                <w:rFonts w:asciiTheme="minorBidi" w:hAnsiTheme="minorBidi"/>
+                <w:sz w:val="22"/>
+                <w:szCs w:val="22"/>
+              </w:rPr>
+              <w:t>ParkingSpace</w:t>
+            </w:r>
+            <w:proofErr w:type="spellEnd"/>
+            <w:r>
+              <w:rPr>
+                <w:rFonts w:asciiTheme="minorBidi" w:hAnsiTheme="minorBidi"/>
+                <w:sz w:val="22"/>
+                <w:szCs w:val="22"/>
+              </w:rPr>
+              <w:t xml:space="preserve">) , </w:t>
+            </w:r>
+            <w:proofErr w:type="spellStart"/>
             <w:r>
               <w:rPr>
                 <w:rFonts w:asciiTheme="minorBidi" w:hAnsiTheme="minorBidi"/>
@@ -2348,16 +3000,9 @@
                 <w:szCs w:val="22"/>
                 <w:u w:val="single"/>
               </w:rPr>
-              <w:t xml:space="preserve">spaceNumber(FK </w:t>
-            </w:r>
-            <w:r>
-              <w:rPr>
-                <w:rFonts w:asciiTheme="minorBidi" w:hAnsiTheme="minorBidi"/>
-                <w:sz w:val="22"/>
-                <w:szCs w:val="22"/>
-              </w:rPr>
-              <w:t xml:space="preserve"> ParkingSpace), </w:t>
-            </w:r>
+              <w:t>spaceNumber</w:t>
+            </w:r>
+            <w:proofErr w:type="spellEnd"/>
             <w:r>
               <w:rPr>
                 <w:rFonts w:asciiTheme="minorBidi" w:hAnsiTheme="minorBidi"/>
@@ -2365,16 +3010,81 @@
                 <w:szCs w:val="22"/>
                 <w:u w:val="single"/>
               </w:rPr>
+              <w:t xml:space="preserve">(FK </w:t>
+            </w:r>
+            <w:r>
+              <w:rPr>
+                <w:rFonts w:asciiTheme="minorBidi" w:hAnsiTheme="minorBidi"/>
+                <w:sz w:val="22"/>
+                <w:szCs w:val="22"/>
+              </w:rPr>
+              <w:t xml:space="preserve"> </w:t>
+            </w:r>
+            <w:proofErr w:type="spellStart"/>
+            <w:r>
+              <w:rPr>
+                <w:rFonts w:asciiTheme="minorBidi" w:hAnsiTheme="minorBidi"/>
+                <w:sz w:val="22"/>
+                <w:szCs w:val="22"/>
+              </w:rPr>
+              <w:t>ParkingSpace</w:t>
+            </w:r>
+            <w:proofErr w:type="spellEnd"/>
+            <w:r>
+              <w:rPr>
+                <w:rFonts w:asciiTheme="minorBidi" w:hAnsiTheme="minorBidi"/>
+                <w:sz w:val="22"/>
+                <w:szCs w:val="22"/>
+              </w:rPr>
+              <w:t xml:space="preserve">), </w:t>
+            </w:r>
+            <w:proofErr w:type="spellStart"/>
+            <w:r>
+              <w:rPr>
+                <w:rFonts w:asciiTheme="minorBidi" w:hAnsiTheme="minorBidi"/>
+                <w:sz w:val="22"/>
+                <w:szCs w:val="22"/>
+                <w:u w:val="single"/>
+              </w:rPr>
               <w:t>startTime</w:t>
             </w:r>
-            <w:r>
-              <w:rPr>
-                <w:rFonts w:asciiTheme="minorBidi" w:hAnsiTheme="minorBidi"/>
-                <w:sz w:val="22"/>
-                <w:szCs w:val="22"/>
-              </w:rPr>
-              <w:t>, endTime, amountPaid</w:t>
-            </w:r>
+            <w:proofErr w:type="spellEnd"/>
+            <w:r>
+              <w:rPr>
+                <w:rFonts w:asciiTheme="minorBidi" w:hAnsiTheme="minorBidi"/>
+                <w:sz w:val="22"/>
+                <w:szCs w:val="22"/>
+              </w:rPr>
+              <w:t xml:space="preserve">, </w:t>
+            </w:r>
+            <w:proofErr w:type="spellStart"/>
+            <w:r>
+              <w:rPr>
+                <w:rFonts w:asciiTheme="minorBidi" w:hAnsiTheme="minorBidi"/>
+                <w:sz w:val="22"/>
+                <w:szCs w:val="22"/>
+              </w:rPr>
+              <w:t>endTime</w:t>
+            </w:r>
+            <w:proofErr w:type="spellEnd"/>
+            <w:r>
+              <w:rPr>
+                <w:rFonts w:asciiTheme="minorBidi" w:hAnsiTheme="minorBidi"/>
+                <w:sz w:val="22"/>
+                <w:szCs w:val="22"/>
+              </w:rPr>
+              <w:t xml:space="preserve">, </w:t>
+            </w:r>
+            <w:proofErr w:type="spellStart"/>
+            <w:r>
+              <w:rPr>
+                <w:rFonts w:asciiTheme="minorBidi" w:hAnsiTheme="minorBidi"/>
+                <w:sz w:val="22"/>
+                <w:szCs w:val="22"/>
+              </w:rPr>
+              <w:t>amountPaid</w:t>
+            </w:r>
+            <w:proofErr w:type="spellEnd"/>
           </w:p>
         </w:tc>
         <w:tc>
@@ -2390,12 +3100,14 @@
                 <w:rtl/>
               </w:rPr>
             </w:pPr>
+            <w:proofErr w:type="spellStart"/>
             <w:r>
               <w:rPr>
                 <w:rFonts w:asciiTheme="minorBidi" w:hAnsiTheme="minorBidi"/>
               </w:rPr>
               <w:t>ParksIn</w:t>
             </w:r>
+            <w:proofErr w:type="spellEnd"/>
           </w:p>
         </w:tc>
       </w:tr>
@@ -2416,6 +3128,7 @@
                 <w:rtl/>
               </w:rPr>
             </w:pPr>
+            <w:proofErr w:type="spellStart"/>
             <w:r>
               <w:rPr>
                 <w:rFonts w:asciiTheme="minorBidi" w:hAnsiTheme="minorBidi"/>
@@ -2425,14 +3138,79 @@
               </w:rPr>
               <w:t>uniqueNumber</w:t>
             </w:r>
-            <w:r>
-              <w:rPr>
-                <w:rFonts w:asciiTheme="minorBidi" w:hAnsiTheme="minorBidi"/>
-                <w:sz w:val="22"/>
-                <w:szCs w:val="22"/>
-              </w:rPr>
-              <w:t>(FK ParkingLot), pricePerMinute, concurrentCapacity, avgWashTime</w:t>
-            </w:r>
+            <w:proofErr w:type="spellEnd"/>
+            <w:r>
+              <w:rPr>
+                <w:rFonts w:asciiTheme="minorBidi" w:hAnsiTheme="minorBidi"/>
+                <w:sz w:val="22"/>
+                <w:szCs w:val="22"/>
+              </w:rPr>
+              <w:t xml:space="preserve">(FK </w:t>
+            </w:r>
+            <w:proofErr w:type="spellStart"/>
+            <w:r>
+              <w:rPr>
+                <w:rFonts w:asciiTheme="minorBidi" w:hAnsiTheme="minorBidi"/>
+                <w:sz w:val="22"/>
+                <w:szCs w:val="22"/>
+              </w:rPr>
+              <w:t>ParkingLot</w:t>
+            </w:r>
+            <w:proofErr w:type="spellEnd"/>
+            <w:r>
+              <w:rPr>
+                <w:rFonts w:asciiTheme="minorBidi" w:hAnsiTheme="minorBidi"/>
+                <w:sz w:val="22"/>
+                <w:szCs w:val="22"/>
+              </w:rPr>
+              <w:t xml:space="preserve">), </w:t>
+            </w:r>
+            <w:proofErr w:type="spellStart"/>
+            <w:r>
+              <w:rPr>
+                <w:rFonts w:asciiTheme="minorBidi" w:hAnsiTheme="minorBidi"/>
+                <w:sz w:val="22"/>
+                <w:szCs w:val="22"/>
+              </w:rPr>
+              <w:t>pricePerMinute</w:t>
+            </w:r>
+            <w:proofErr w:type="spellEnd"/>
+            <w:r>
+              <w:rPr>
+                <w:rFonts w:asciiTheme="minorBidi" w:hAnsiTheme="minorBidi"/>
+                <w:sz w:val="22"/>
+                <w:szCs w:val="22"/>
+              </w:rPr>
+              <w:t xml:space="preserve">, </w:t>
+            </w:r>
+            <w:proofErr w:type="spellStart"/>
+            <w:r>
+              <w:rPr>
+                <w:rFonts w:asciiTheme="minorBidi" w:hAnsiTheme="minorBidi"/>
+                <w:sz w:val="22"/>
+                <w:szCs w:val="22"/>
+              </w:rPr>
+              <w:t>concurrentCapacity</w:t>
+            </w:r>
+            <w:proofErr w:type="spellEnd"/>
+            <w:r>
+              <w:rPr>
+                <w:rFonts w:asciiTheme="minorBidi" w:hAnsiTheme="minorBidi"/>
+                <w:sz w:val="22"/>
+                <w:szCs w:val="22"/>
+              </w:rPr>
+              <w:t xml:space="preserve">, </w:t>
+            </w:r>
+            <w:proofErr w:type="spellStart"/>
+            <w:r>
+              <w:rPr>
+                <w:rFonts w:asciiTheme="minorBidi" w:hAnsiTheme="minorBidi"/>
+                <w:sz w:val="22"/>
+                <w:szCs w:val="22"/>
+              </w:rPr>
+              <w:t>avgWashTime</w:t>
+            </w:r>
+            <w:proofErr w:type="spellEnd"/>
           </w:p>
         </w:tc>
         <w:tc>
@@ -2448,6 +3226,7 @@
                 <w:rtl/>
               </w:rPr>
             </w:pPr>
+            <w:proofErr w:type="spellStart"/>
             <w:r>
               <w:rPr>
                 <w:rFonts w:asciiTheme="minorBidi" w:hAnsiTheme="minorBidi"/>
@@ -2456,6 +3235,7 @@
               </w:rPr>
               <w:t>CarWashService</w:t>
             </w:r>
+            <w:proofErr w:type="spellEnd"/>
           </w:p>
         </w:tc>
       </w:tr>
@@ -2476,6 +3256,7 @@
                 <w:rtl/>
               </w:rPr>
             </w:pPr>
+            <w:proofErr w:type="spellStart"/>
             <w:r>
               <w:rPr>
                 <w:rFonts w:asciiTheme="minorBidi" w:hAnsiTheme="minorBidi"/>
@@ -2485,13 +3266,32 @@
               </w:rPr>
               <w:t>uniqueNumber</w:t>
             </w:r>
-            <w:r>
-              <w:rPr>
-                <w:rFonts w:asciiTheme="minorBidi" w:hAnsiTheme="minorBidi"/>
-                <w:sz w:val="22"/>
-                <w:szCs w:val="22"/>
-              </w:rPr>
-              <w:t>(FK CarWashService),</w:t>
+            <w:proofErr w:type="spellEnd"/>
+            <w:r>
+              <w:rPr>
+                <w:rFonts w:asciiTheme="minorBidi" w:hAnsiTheme="minorBidi"/>
+                <w:sz w:val="22"/>
+                <w:szCs w:val="22"/>
+              </w:rPr>
+              <w:t xml:space="preserve">(FK </w:t>
+            </w:r>
+            <w:proofErr w:type="spellStart"/>
+            <w:r>
+              <w:rPr>
+                <w:rFonts w:asciiTheme="minorBidi" w:hAnsiTheme="minorBidi"/>
+                <w:sz w:val="22"/>
+                <w:szCs w:val="22"/>
+              </w:rPr>
+              <w:t>CarWashService</w:t>
+            </w:r>
+            <w:proofErr w:type="spellEnd"/>
+            <w:r>
+              <w:rPr>
+                <w:rFonts w:asciiTheme="minorBidi" w:hAnsiTheme="minorBidi"/>
+                <w:sz w:val="22"/>
+                <w:szCs w:val="22"/>
+              </w:rPr>
+              <w:t>),</w:t>
             </w:r>
             <w:r>
               <w:rPr>
@@ -2499,6 +3299,7 @@
               </w:rPr>
               <w:t xml:space="preserve"> </w:t>
             </w:r>
+            <w:proofErr w:type="spellStart"/>
             <w:r>
               <w:rPr>
                 <w:rFonts w:asciiTheme="minorBidi" w:hAnsiTheme="minorBidi"/>
@@ -2514,7 +3315,34 @@
                 <w:sz w:val="22"/>
                 <w:szCs w:val="22"/>
               </w:rPr>
-              <w:t>r(FKVehicle),</w:t>
+              <w:t>r</w:t>
+            </w:r>
+            <w:proofErr w:type="spellEnd"/>
+            <w:r>
+              <w:rPr>
+                <w:rFonts w:asciiTheme="minorBidi" w:hAnsiTheme="minorBidi"/>
+                <w:sz w:val="22"/>
+                <w:szCs w:val="22"/>
+              </w:rPr>
+              <w:t>(</w:t>
+            </w:r>
+            <w:proofErr w:type="spellStart"/>
+            <w:r>
+              <w:rPr>
+                <w:rFonts w:asciiTheme="minorBidi" w:hAnsiTheme="minorBidi"/>
+                <w:sz w:val="22"/>
+                <w:szCs w:val="22"/>
+              </w:rPr>
+              <w:t>FKVehicle</w:t>
+            </w:r>
+            <w:proofErr w:type="spellEnd"/>
+            <w:r>
+              <w:rPr>
+                <w:rFonts w:asciiTheme="minorBidi" w:hAnsiTheme="minorBidi"/>
+                <w:sz w:val="22"/>
+                <w:szCs w:val="22"/>
+              </w:rPr>
+              <w:t>),</w:t>
             </w:r>
             <w:r>
               <w:rPr>
@@ -2522,6 +3350,7 @@
               </w:rPr>
               <w:t xml:space="preserve"> </w:t>
             </w:r>
+            <w:proofErr w:type="spellStart"/>
             <w:r>
               <w:rPr>
                 <w:rFonts w:asciiTheme="minorBidi" w:hAnsiTheme="minorBidi"/>
@@ -2531,14 +3360,43 @@
               </w:rPr>
               <w:t>startTime</w:t>
             </w:r>
-            <w:r>
-              <w:rPr>
-                <w:rFonts w:asciiTheme="minorBidi" w:hAnsiTheme="minorBidi"/>
-                <w:sz w:val="22"/>
-                <w:szCs w:val="22"/>
-              </w:rPr>
-              <w:t>, endTime, amountPaid</w:t>
-            </w:r>
+            <w:proofErr w:type="spellEnd"/>
+            <w:r>
+              <w:rPr>
+                <w:rFonts w:asciiTheme="minorBidi" w:hAnsiTheme="minorBidi"/>
+                <w:sz w:val="22"/>
+                <w:szCs w:val="22"/>
+              </w:rPr>
+              <w:t xml:space="preserve">, </w:t>
+            </w:r>
+            <w:proofErr w:type="spellStart"/>
+            <w:r>
+              <w:rPr>
+                <w:rFonts w:asciiTheme="minorBidi" w:hAnsiTheme="minorBidi"/>
+                <w:sz w:val="22"/>
+                <w:szCs w:val="22"/>
+              </w:rPr>
+              <w:t>endTime</w:t>
+            </w:r>
+            <w:proofErr w:type="spellEnd"/>
+            <w:r>
+              <w:rPr>
+                <w:rFonts w:asciiTheme="minorBidi" w:hAnsiTheme="minorBidi"/>
+                <w:sz w:val="22"/>
+                <w:szCs w:val="22"/>
+              </w:rPr>
+              <w:t xml:space="preserve">, </w:t>
+            </w:r>
+            <w:proofErr w:type="spellStart"/>
+            <w:r>
+              <w:rPr>
+                <w:rFonts w:asciiTheme="minorBidi" w:hAnsiTheme="minorBidi"/>
+                <w:sz w:val="22"/>
+                <w:szCs w:val="22"/>
+              </w:rPr>
+              <w:t>amountPaid</w:t>
+            </w:r>
+            <w:proofErr w:type="spellEnd"/>
           </w:p>
         </w:tc>
         <w:tc>
@@ -2633,6 +3491,939 @@
       <w:pPr>
         <w:rPr>
           <w:rFonts w:asciiTheme="minorBidi" w:hAnsiTheme="minorBidi"/>
+        </w:rPr>
+      </w:pPr>
+      <w:r>
+        <w:rPr>
+          <w:rFonts w:asciiTheme="minorBidi" w:hAnsiTheme="minorBidi"/>
+        </w:rPr>
+        <w:t>1.6</w:t>
+      </w:r>
+    </w:p>
+    <w:tbl>
+      <w:tblPr>
+        <w:tblStyle w:val="TableGrid"/>
+        <w:bidiVisual/>
+        <w:tblW w:w="0" w:type="auto"/>
+        <w:tblLook w:val="04A0" w:firstRow="1" w:lastRow="0" w:firstColumn="1" w:lastColumn="0" w:noHBand="0" w:noVBand="1"/>
+      </w:tblPr>
+      <w:tblGrid>
+        <w:gridCol w:w="6137"/>
+        <w:gridCol w:w="2159"/>
+      </w:tblGrid>
+      <w:tr>
+        <w:trPr>
+          <w:trHeight w:val="432"/>
+        </w:trPr>
+        <w:tc>
+          <w:tcPr>
+            <w:tcW w:w="6137" w:type="dxa"/>
+            <w:vAlign w:val="center"/>
+          </w:tcPr>
+          <w:p>
+            <w:pPr>
+              <w:jc w:val="right"/>
+              <w:rPr>
+                <w:rFonts w:asciiTheme="minorBidi" w:hAnsiTheme="minorBidi"/>
+                <w:rtl/>
+              </w:rPr>
+            </w:pPr>
+            <w:proofErr w:type="spellStart"/>
+            <w:r>
+              <w:rPr>
+                <w:rFonts w:asciiTheme="minorBidi" w:hAnsiTheme="minorBidi"/>
+                <w:sz w:val="22"/>
+                <w:szCs w:val="22"/>
+                <w:u w:val="single"/>
+              </w:rPr>
+              <w:t>uniqueNumber</w:t>
+            </w:r>
+            <w:proofErr w:type="spellEnd"/>
+            <w:r>
+              <w:rPr>
+                <w:rFonts w:asciiTheme="minorBidi" w:hAnsiTheme="minorBidi"/>
+                <w:sz w:val="22"/>
+                <w:szCs w:val="22"/>
+              </w:rPr>
+              <w:t>, name, address, price</w:t>
+            </w:r>
+          </w:p>
+        </w:tc>
+        <w:tc>
+          <w:tcPr>
+            <w:tcW w:w="2159" w:type="dxa"/>
+            <w:vAlign w:val="center"/>
+          </w:tcPr>
+          <w:p>
+            <w:pPr>
+              <w:jc w:val="right"/>
+              <w:rPr>
+                <w:rFonts w:asciiTheme="minorBidi" w:hAnsiTheme="minorBidi"/>
+                <w:rtl/>
+              </w:rPr>
+            </w:pPr>
+            <w:proofErr w:type="spellStart"/>
+            <w:r>
+              <w:rPr>
+                <w:rFonts w:asciiTheme="minorBidi" w:hAnsiTheme="minorBidi"/>
+                <w:sz w:val="22"/>
+                <w:szCs w:val="22"/>
+              </w:rPr>
+              <w:t>ParkingLot</w:t>
+            </w:r>
+            <w:proofErr w:type="spellEnd"/>
+          </w:p>
+        </w:tc>
+      </w:tr>
+      <w:tr>
+        <w:trPr>
+          <w:trHeight w:val="432"/>
+        </w:trPr>
+        <w:tc>
+          <w:tcPr>
+            <w:tcW w:w="6137" w:type="dxa"/>
+            <w:vAlign w:val="center"/>
+          </w:tcPr>
+          <w:p>
+            <w:pPr>
+              <w:jc w:val="right"/>
+              <w:rPr>
+                <w:rFonts w:asciiTheme="minorBidi" w:hAnsiTheme="minorBidi"/>
+                <w:rtl/>
+              </w:rPr>
+            </w:pPr>
+            <w:proofErr w:type="spellStart"/>
+            <w:r>
+              <w:rPr>
+                <w:rFonts w:asciiTheme="minorBidi" w:hAnsiTheme="minorBidi"/>
+                <w:sz w:val="22"/>
+                <w:szCs w:val="22"/>
+                <w:u w:val="single"/>
+              </w:rPr>
+              <w:t>uniqueNumber</w:t>
+            </w:r>
+            <w:proofErr w:type="spellEnd"/>
+            <w:r>
+              <w:rPr>
+                <w:rFonts w:asciiTheme="minorBidi" w:hAnsiTheme="minorBidi"/>
+                <w:sz w:val="22"/>
+                <w:szCs w:val="22"/>
+              </w:rPr>
+              <w:t xml:space="preserve">(FK </w:t>
+            </w:r>
+            <w:proofErr w:type="spellStart"/>
+            <w:r>
+              <w:rPr>
+                <w:rFonts w:asciiTheme="minorBidi" w:hAnsiTheme="minorBidi"/>
+                <w:sz w:val="22"/>
+                <w:szCs w:val="22"/>
+              </w:rPr>
+              <w:t>ParkingLot</w:t>
+            </w:r>
+            <w:proofErr w:type="spellEnd"/>
+            <w:r>
+              <w:rPr>
+                <w:rFonts w:asciiTheme="minorBidi" w:hAnsiTheme="minorBidi"/>
+                <w:sz w:val="22"/>
+                <w:szCs w:val="22"/>
+              </w:rPr>
+              <w:t xml:space="preserve">), </w:t>
+            </w:r>
+            <w:proofErr w:type="spellStart"/>
+            <w:r>
+              <w:rPr>
+                <w:rFonts w:asciiTheme="minorBidi" w:hAnsiTheme="minorBidi"/>
+                <w:sz w:val="22"/>
+                <w:szCs w:val="22"/>
+              </w:rPr>
+              <w:t>numberOfGraceMinutes</w:t>
+            </w:r>
+            <w:proofErr w:type="spellEnd"/>
+          </w:p>
+        </w:tc>
+        <w:tc>
+          <w:tcPr>
+            <w:tcW w:w="2159" w:type="dxa"/>
+            <w:vAlign w:val="center"/>
+          </w:tcPr>
+          <w:p>
+            <w:pPr>
+              <w:jc w:val="right"/>
+              <w:rPr>
+                <w:rFonts w:asciiTheme="minorBidi" w:hAnsiTheme="minorBidi"/>
+                <w:rtl/>
+              </w:rPr>
+            </w:pPr>
+            <w:proofErr w:type="spellStart"/>
+            <w:r>
+              <w:rPr>
+                <w:rFonts w:asciiTheme="minorBidi" w:hAnsiTheme="minorBidi"/>
+                <w:sz w:val="22"/>
+                <w:szCs w:val="22"/>
+              </w:rPr>
+              <w:t>MinutesParkingLot</w:t>
+            </w:r>
+            <w:proofErr w:type="spellEnd"/>
+          </w:p>
+        </w:tc>
+      </w:tr>
+      <w:tr>
+        <w:trPr>
+          <w:trHeight w:val="432"/>
+        </w:trPr>
+        <w:tc>
+          <w:tcPr>
+            <w:tcW w:w="6137" w:type="dxa"/>
+            <w:vAlign w:val="center"/>
+          </w:tcPr>
+          <w:p>
+            <w:pPr>
+              <w:jc w:val="right"/>
+              <w:rPr>
+                <w:rFonts w:asciiTheme="minorBidi" w:hAnsiTheme="minorBidi"/>
+                <w:rtl/>
+              </w:rPr>
+            </w:pPr>
+            <w:proofErr w:type="spellStart"/>
+            <w:r>
+              <w:rPr>
+                <w:rFonts w:asciiTheme="minorBidi" w:hAnsiTheme="minorBidi"/>
+                <w:sz w:val="22"/>
+                <w:szCs w:val="22"/>
+                <w:u w:val="single"/>
+              </w:rPr>
+              <w:t>uniqueNumber</w:t>
+            </w:r>
+            <w:proofErr w:type="spellEnd"/>
+            <w:r>
+              <w:rPr>
+                <w:rFonts w:asciiTheme="minorBidi" w:hAnsiTheme="minorBidi"/>
+                <w:sz w:val="22"/>
+                <w:szCs w:val="22"/>
+              </w:rPr>
+              <w:t xml:space="preserve">(FK </w:t>
+            </w:r>
+            <w:proofErr w:type="spellStart"/>
+            <w:r>
+              <w:rPr>
+                <w:rFonts w:asciiTheme="minorBidi" w:hAnsiTheme="minorBidi"/>
+                <w:sz w:val="22"/>
+                <w:szCs w:val="22"/>
+              </w:rPr>
+              <w:t>ParkingLot</w:t>
+            </w:r>
+            <w:proofErr w:type="spellEnd"/>
+            <w:r>
+              <w:rPr>
+                <w:rFonts w:asciiTheme="minorBidi" w:hAnsiTheme="minorBidi"/>
+                <w:sz w:val="22"/>
+                <w:szCs w:val="22"/>
+              </w:rPr>
+              <w:t xml:space="preserve">), </w:t>
+            </w:r>
+            <w:proofErr w:type="spellStart"/>
+            <w:r>
+              <w:rPr>
+                <w:rFonts w:asciiTheme="minorBidi" w:hAnsiTheme="minorBidi"/>
+                <w:sz w:val="22"/>
+                <w:szCs w:val="22"/>
+              </w:rPr>
+              <w:t>overnightAllowed</w:t>
+            </w:r>
+            <w:proofErr w:type="spellEnd"/>
+            <w:r>
+              <w:rPr>
+                <w:rFonts w:asciiTheme="minorBidi" w:hAnsiTheme="minorBidi"/>
+                <w:sz w:val="22"/>
+                <w:szCs w:val="22"/>
+              </w:rPr>
+              <w:t xml:space="preserve">, </w:t>
+            </w:r>
+            <w:proofErr w:type="spellStart"/>
+            <w:r>
+              <w:rPr>
+                <w:rFonts w:asciiTheme="minorBidi" w:hAnsiTheme="minorBidi"/>
+                <w:sz w:val="22"/>
+                <w:szCs w:val="22"/>
+              </w:rPr>
+              <w:t>maxDaysAllowed</w:t>
+            </w:r>
+            <w:proofErr w:type="spellEnd"/>
+          </w:p>
+        </w:tc>
+        <w:tc>
+          <w:tcPr>
+            <w:tcW w:w="2159" w:type="dxa"/>
+            <w:vAlign w:val="center"/>
+          </w:tcPr>
+          <w:p>
+            <w:pPr>
+              <w:jc w:val="right"/>
+              <w:rPr>
+                <w:rFonts w:asciiTheme="minorBidi" w:hAnsiTheme="minorBidi"/>
+                <w:rtl/>
+              </w:rPr>
+            </w:pPr>
+            <w:proofErr w:type="spellStart"/>
+            <w:r>
+              <w:rPr>
+                <w:rFonts w:asciiTheme="minorBidi" w:hAnsiTheme="minorBidi"/>
+                <w:sz w:val="22"/>
+                <w:szCs w:val="22"/>
+              </w:rPr>
+              <w:t>DailyParkingLot</w:t>
+            </w:r>
+            <w:proofErr w:type="spellEnd"/>
+          </w:p>
+        </w:tc>
+      </w:tr>
+      <w:tr>
+        <w:trPr>
+          <w:trHeight w:val="432"/>
+        </w:trPr>
+        <w:tc>
+          <w:tcPr>
+            <w:tcW w:w="6137" w:type="dxa"/>
+            <w:vAlign w:val="center"/>
+          </w:tcPr>
+          <w:p>
+            <w:pPr>
+              <w:jc w:val="right"/>
+              <w:rPr>
+                <w:rFonts w:asciiTheme="minorBidi" w:hAnsiTheme="minorBidi"/>
+                <w:rtl/>
+              </w:rPr>
+            </w:pPr>
+            <w:proofErr w:type="spellStart"/>
+            <w:r>
+              <w:rPr>
+                <w:rFonts w:asciiTheme="minorBidi" w:hAnsiTheme="minorBidi"/>
+                <w:u w:val="single"/>
+              </w:rPr>
+              <w:t>vehicleNumber</w:t>
+            </w:r>
+            <w:proofErr w:type="spellEnd"/>
+            <w:r>
+              <w:rPr>
+                <w:rFonts w:asciiTheme="minorBidi" w:hAnsiTheme="minorBidi"/>
+              </w:rPr>
+              <w:t>, size, weight, color</w:t>
+            </w:r>
+          </w:p>
+        </w:tc>
+        <w:tc>
+          <w:tcPr>
+            <w:tcW w:w="2159" w:type="dxa"/>
+            <w:vAlign w:val="center"/>
+          </w:tcPr>
+          <w:p>
+            <w:pPr>
+              <w:jc w:val="right"/>
+              <w:rPr>
+                <w:rFonts w:asciiTheme="minorBidi" w:hAnsiTheme="minorBidi"/>
+                <w:rtl/>
+              </w:rPr>
+            </w:pPr>
+            <w:r>
+              <w:rPr>
+                <w:rFonts w:asciiTheme="minorBidi" w:hAnsiTheme="minorBidi"/>
+                <w:sz w:val="22"/>
+                <w:szCs w:val="22"/>
+              </w:rPr>
+              <w:t>Vehicle</w:t>
+            </w:r>
+          </w:p>
+        </w:tc>
+      </w:tr>
+      <w:tr>
+        <w:trPr>
+          <w:trHeight w:val="432"/>
+        </w:trPr>
+        <w:tc>
+          <w:tcPr>
+            <w:tcW w:w="6137" w:type="dxa"/>
+            <w:vAlign w:val="center"/>
+          </w:tcPr>
+          <w:p>
+            <w:pPr>
+              <w:jc w:val="right"/>
+              <w:rPr>
+                <w:rFonts w:asciiTheme="minorBidi" w:hAnsiTheme="minorBidi"/>
+                <w:rtl/>
+              </w:rPr>
+            </w:pPr>
+            <w:proofErr w:type="spellStart"/>
+            <w:r>
+              <w:rPr>
+                <w:rFonts w:asciiTheme="minorBidi" w:hAnsiTheme="minorBidi"/>
+                <w:u w:val="single"/>
+              </w:rPr>
+              <w:t>uniqueNumber</w:t>
+            </w:r>
+            <w:proofErr w:type="spellEnd"/>
+            <w:r>
+              <w:rPr>
+                <w:rFonts w:asciiTheme="minorBidi" w:hAnsiTheme="minorBidi"/>
+                <w:sz w:val="22"/>
+                <w:szCs w:val="22"/>
+              </w:rPr>
+              <w:t xml:space="preserve">(FK </w:t>
+            </w:r>
+            <w:proofErr w:type="spellStart"/>
+            <w:r>
+              <w:rPr>
+                <w:rFonts w:asciiTheme="minorBidi" w:hAnsiTheme="minorBidi"/>
+                <w:sz w:val="22"/>
+                <w:szCs w:val="22"/>
+              </w:rPr>
+              <w:t>ParkingLot</w:t>
+            </w:r>
+            <w:proofErr w:type="spellEnd"/>
+            <w:r>
+              <w:rPr>
+                <w:rFonts w:asciiTheme="minorBidi" w:hAnsiTheme="minorBidi"/>
+              </w:rPr>
+              <w:t xml:space="preserve">), </w:t>
+            </w:r>
+            <w:proofErr w:type="spellStart"/>
+            <w:r>
+              <w:rPr>
+                <w:rFonts w:asciiTheme="minorBidi" w:hAnsiTheme="minorBidi"/>
+                <w:u w:val="single"/>
+              </w:rPr>
+              <w:t>floorNumber</w:t>
+            </w:r>
+            <w:proofErr w:type="spellEnd"/>
+            <w:r>
+              <w:rPr>
+                <w:rFonts w:asciiTheme="minorBidi" w:hAnsiTheme="minorBidi"/>
+              </w:rPr>
+              <w:t xml:space="preserve">, </w:t>
+            </w:r>
+            <w:proofErr w:type="spellStart"/>
+            <w:r>
+              <w:rPr>
+                <w:rFonts w:asciiTheme="minorBidi" w:hAnsiTheme="minorBidi"/>
+                <w:u w:val="single"/>
+              </w:rPr>
+              <w:t>spaceNumber</w:t>
+            </w:r>
+            <w:proofErr w:type="spellEnd"/>
+            <w:r>
+              <w:rPr>
+                <w:rFonts w:asciiTheme="minorBidi" w:hAnsiTheme="minorBidi"/>
+              </w:rPr>
+              <w:t>, x, y, size</w:t>
+            </w:r>
+          </w:p>
+        </w:tc>
+        <w:tc>
+          <w:tcPr>
+            <w:tcW w:w="2159" w:type="dxa"/>
+            <w:vAlign w:val="center"/>
+          </w:tcPr>
+          <w:p>
+            <w:pPr>
+              <w:jc w:val="right"/>
+              <w:rPr>
+                <w:rFonts w:asciiTheme="minorBidi" w:hAnsiTheme="minorBidi"/>
+                <w:rtl/>
+              </w:rPr>
+            </w:pPr>
+            <w:proofErr w:type="spellStart"/>
+            <w:r>
+              <w:rPr>
+                <w:rFonts w:asciiTheme="minorBidi" w:hAnsiTheme="minorBidi"/>
+                <w:sz w:val="22"/>
+                <w:szCs w:val="22"/>
+              </w:rPr>
+              <w:t>ParkingSpace</w:t>
+            </w:r>
+            <w:proofErr w:type="spellEnd"/>
+          </w:p>
+        </w:tc>
+      </w:tr>
+      <w:tr>
+        <w:trPr>
+          <w:trHeight w:val="432"/>
+        </w:trPr>
+        <w:tc>
+          <w:tcPr>
+            <w:tcW w:w="6137" w:type="dxa"/>
+            <w:vAlign w:val="center"/>
+          </w:tcPr>
+          <w:p>
+            <w:pPr>
+              <w:jc w:val="right"/>
+              <w:rPr>
+                <w:rFonts w:asciiTheme="minorBidi" w:hAnsiTheme="minorBidi"/>
+                <w:rtl/>
+              </w:rPr>
+            </w:pPr>
+            <w:proofErr w:type="spellStart"/>
+            <w:r>
+              <w:rPr>
+                <w:rFonts w:asciiTheme="minorBidi" w:hAnsiTheme="minorBidi"/>
+                <w:sz w:val="22"/>
+                <w:szCs w:val="22"/>
+                <w:u w:val="single"/>
+              </w:rPr>
+              <w:t>vehicleNumber</w:t>
+            </w:r>
+            <w:proofErr w:type="spellEnd"/>
+            <w:r>
+              <w:rPr>
+                <w:rFonts w:asciiTheme="minorBidi" w:hAnsiTheme="minorBidi"/>
+                <w:sz w:val="22"/>
+                <w:szCs w:val="22"/>
+                <w:u w:val="single"/>
+              </w:rPr>
+              <w:t xml:space="preserve">(FK </w:t>
+            </w:r>
+            <w:r>
+              <w:rPr>
+                <w:rFonts w:asciiTheme="minorBidi" w:hAnsiTheme="minorBidi"/>
+                <w:sz w:val="22"/>
+                <w:szCs w:val="22"/>
+              </w:rPr>
+              <w:t xml:space="preserve"> Vehicle), </w:t>
+            </w:r>
+            <w:proofErr w:type="spellStart"/>
+            <w:r>
+              <w:rPr>
+                <w:rFonts w:asciiTheme="minorBidi" w:hAnsiTheme="minorBidi"/>
+                <w:sz w:val="22"/>
+                <w:szCs w:val="22"/>
+                <w:u w:val="single"/>
+              </w:rPr>
+              <w:t>uniqueNumber</w:t>
+            </w:r>
+            <w:proofErr w:type="spellEnd"/>
+            <w:r>
+              <w:rPr>
+                <w:rFonts w:asciiTheme="minorBidi" w:hAnsiTheme="minorBidi"/>
+                <w:sz w:val="22"/>
+                <w:szCs w:val="22"/>
+              </w:rPr>
+              <w:t xml:space="preserve">(FK  </w:t>
+            </w:r>
+            <w:proofErr w:type="spellStart"/>
+            <w:r>
+              <w:rPr>
+                <w:rFonts w:asciiTheme="minorBidi" w:hAnsiTheme="minorBidi"/>
+                <w:sz w:val="22"/>
+                <w:szCs w:val="22"/>
+              </w:rPr>
+              <w:t>ParkingSpace</w:t>
+            </w:r>
+            <w:proofErr w:type="spellEnd"/>
+            <w:r>
+              <w:rPr>
+                <w:rFonts w:asciiTheme="minorBidi" w:hAnsiTheme="minorBidi"/>
+                <w:sz w:val="22"/>
+                <w:szCs w:val="22"/>
+              </w:rPr>
+              <w:t xml:space="preserve">) , </w:t>
+            </w:r>
+            <w:proofErr w:type="spellStart"/>
+            <w:r>
+              <w:rPr>
+                <w:rFonts w:asciiTheme="minorBidi" w:hAnsiTheme="minorBidi"/>
+                <w:sz w:val="22"/>
+                <w:szCs w:val="22"/>
+                <w:u w:val="single"/>
+              </w:rPr>
+              <w:t>floorNumber</w:t>
+            </w:r>
+            <w:proofErr w:type="spellEnd"/>
+            <w:r>
+              <w:rPr>
+                <w:rFonts w:asciiTheme="minorBidi" w:hAnsiTheme="minorBidi"/>
+                <w:sz w:val="22"/>
+                <w:szCs w:val="22"/>
+              </w:rPr>
+              <w:t xml:space="preserve">(FK  </w:t>
+            </w:r>
+            <w:proofErr w:type="spellStart"/>
+            <w:r>
+              <w:rPr>
+                <w:rFonts w:asciiTheme="minorBidi" w:hAnsiTheme="minorBidi"/>
+                <w:sz w:val="22"/>
+                <w:szCs w:val="22"/>
+              </w:rPr>
+              <w:t>ParkingSpace</w:t>
+            </w:r>
+            <w:proofErr w:type="spellEnd"/>
+            <w:r>
+              <w:rPr>
+                <w:rFonts w:asciiTheme="minorBidi" w:hAnsiTheme="minorBidi"/>
+                <w:sz w:val="22"/>
+                <w:szCs w:val="22"/>
+              </w:rPr>
+              <w:t xml:space="preserve">) , </w:t>
+            </w:r>
+            <w:proofErr w:type="spellStart"/>
+            <w:r>
+              <w:rPr>
+                <w:rFonts w:asciiTheme="minorBidi" w:hAnsiTheme="minorBidi"/>
+                <w:sz w:val="22"/>
+                <w:szCs w:val="22"/>
+                <w:u w:val="single"/>
+              </w:rPr>
+              <w:t>spaceNumber</w:t>
+            </w:r>
+            <w:proofErr w:type="spellEnd"/>
+            <w:r>
+              <w:rPr>
+                <w:rFonts w:asciiTheme="minorBidi" w:hAnsiTheme="minorBidi"/>
+                <w:sz w:val="22"/>
+                <w:szCs w:val="22"/>
+                <w:u w:val="single"/>
+              </w:rPr>
+              <w:t xml:space="preserve">(FK </w:t>
+            </w:r>
+            <w:r>
+              <w:rPr>
+                <w:rFonts w:asciiTheme="minorBidi" w:hAnsiTheme="minorBidi"/>
+                <w:sz w:val="22"/>
+                <w:szCs w:val="22"/>
+              </w:rPr>
+              <w:t xml:space="preserve"> </w:t>
+            </w:r>
+            <w:proofErr w:type="spellStart"/>
+            <w:r>
+              <w:rPr>
+                <w:rFonts w:asciiTheme="minorBidi" w:hAnsiTheme="minorBidi"/>
+                <w:sz w:val="22"/>
+                <w:szCs w:val="22"/>
+              </w:rPr>
+              <w:t>ParkingSpace</w:t>
+            </w:r>
+            <w:proofErr w:type="spellEnd"/>
+            <w:r>
+              <w:rPr>
+                <w:rFonts w:asciiTheme="minorBidi" w:hAnsiTheme="minorBidi"/>
+                <w:sz w:val="22"/>
+                <w:szCs w:val="22"/>
+              </w:rPr>
+              <w:t xml:space="preserve">), </w:t>
+            </w:r>
+            <w:proofErr w:type="spellStart"/>
+            <w:r>
+              <w:rPr>
+                <w:rFonts w:asciiTheme="minorBidi" w:hAnsiTheme="minorBidi"/>
+                <w:sz w:val="22"/>
+                <w:szCs w:val="22"/>
+                <w:u w:val="single"/>
+              </w:rPr>
+              <w:t>startTime</w:t>
+            </w:r>
+            <w:proofErr w:type="spellEnd"/>
+            <w:r>
+              <w:rPr>
+                <w:rFonts w:asciiTheme="minorBidi" w:hAnsiTheme="minorBidi"/>
+                <w:sz w:val="22"/>
+                <w:szCs w:val="22"/>
+              </w:rPr>
+              <w:t xml:space="preserve">, </w:t>
+            </w:r>
+            <w:proofErr w:type="spellStart"/>
+            <w:r>
+              <w:rPr>
+                <w:rFonts w:asciiTheme="minorBidi" w:hAnsiTheme="minorBidi"/>
+                <w:sz w:val="22"/>
+                <w:szCs w:val="22"/>
+              </w:rPr>
+              <w:t>endTime</w:t>
+            </w:r>
+            <w:proofErr w:type="spellEnd"/>
+            <w:r>
+              <w:rPr>
+                <w:rFonts w:asciiTheme="minorBidi" w:hAnsiTheme="minorBidi"/>
+                <w:sz w:val="22"/>
+                <w:szCs w:val="22"/>
+              </w:rPr>
+              <w:t xml:space="preserve">, </w:t>
+            </w:r>
+            <w:proofErr w:type="spellStart"/>
+            <w:r>
+              <w:rPr>
+                <w:rFonts w:asciiTheme="minorBidi" w:hAnsiTheme="minorBidi"/>
+                <w:sz w:val="22"/>
+                <w:szCs w:val="22"/>
+              </w:rPr>
+              <w:t>amountPaid</w:t>
+            </w:r>
+            <w:proofErr w:type="spellEnd"/>
+          </w:p>
+        </w:tc>
+        <w:tc>
+          <w:tcPr>
+            <w:tcW w:w="2159" w:type="dxa"/>
+            <w:vAlign w:val="center"/>
+          </w:tcPr>
+          <w:p>
+            <w:pPr>
+              <w:jc w:val="right"/>
+              <w:rPr>
+                <w:rFonts w:asciiTheme="minorBidi" w:hAnsiTheme="minorBidi"/>
+                <w:rtl/>
+              </w:rPr>
+            </w:pPr>
+            <w:proofErr w:type="spellStart"/>
+            <w:r>
+              <w:rPr>
+                <w:rFonts w:asciiTheme="minorBidi" w:hAnsiTheme="minorBidi"/>
+              </w:rPr>
+              <w:t>ParksIn</w:t>
+            </w:r>
+            <w:proofErr w:type="spellEnd"/>
+          </w:p>
+        </w:tc>
+      </w:tr>
+      <w:tr>
+        <w:trPr>
+          <w:trHeight w:val="432"/>
+        </w:trPr>
+        <w:tc>
+          <w:tcPr>
+            <w:tcW w:w="6137" w:type="dxa"/>
+            <w:vAlign w:val="center"/>
+          </w:tcPr>
+          <w:p>
+            <w:pPr>
+              <w:jc w:val="right"/>
+              <w:rPr>
+                <w:rFonts w:asciiTheme="minorBidi" w:hAnsiTheme="minorBidi"/>
+                <w:sz w:val="22"/>
+                <w:szCs w:val="22"/>
+              </w:rPr>
+            </w:pPr>
+            <w:r>
+              <w:rPr>
+                <w:rFonts w:asciiTheme="minorBidi" w:hAnsiTheme="minorBidi"/>
+                <w:sz w:val="22"/>
+                <w:szCs w:val="22"/>
+                <w:u w:val="single"/>
+              </w:rPr>
+              <w:t>StationID</w:t>
+            </w:r>
+            <w:r>
+              <w:rPr>
+                <w:rFonts w:asciiTheme="minorBidi" w:hAnsiTheme="minorBidi"/>
+                <w:sz w:val="22"/>
+                <w:szCs w:val="22"/>
+                <w:u w:val="single"/>
+              </w:rPr>
+              <w:t>,</w:t>
+            </w:r>
+            <w:r>
+              <w:rPr>
+                <w:rFonts w:asciiTheme="minorBidi" w:hAnsiTheme="minorBidi"/>
+                <w:sz w:val="22"/>
+                <w:szCs w:val="22"/>
+              </w:rPr>
+              <w:t xml:space="preserve"> </w:t>
+            </w:r>
+            <w:proofErr w:type="spellStart"/>
+            <w:r>
+              <w:rPr>
+                <w:rFonts w:asciiTheme="minorBidi" w:hAnsiTheme="minorBidi"/>
+                <w:sz w:val="22"/>
+                <w:szCs w:val="22"/>
+                <w:u w:val="single"/>
+              </w:rPr>
+              <w:t>ParkingLotID</w:t>
+            </w:r>
+            <w:proofErr w:type="spellEnd"/>
+            <w:r>
+              <w:rPr>
+                <w:rFonts w:asciiTheme="minorBidi" w:hAnsiTheme="minorBidi"/>
+                <w:sz w:val="22"/>
+                <w:szCs w:val="22"/>
+              </w:rPr>
+              <w:t xml:space="preserve">, </w:t>
+            </w:r>
+            <w:proofErr w:type="spellStart"/>
+            <w:r>
+              <w:rPr>
+                <w:rFonts w:asciiTheme="minorBidi" w:hAnsiTheme="minorBidi"/>
+                <w:sz w:val="22"/>
+                <w:szCs w:val="22"/>
+              </w:rPr>
+              <w:t>IsFast</w:t>
+            </w:r>
+            <w:proofErr w:type="spellEnd"/>
+            <w:r>
+              <w:rPr>
+                <w:rFonts w:asciiTheme="minorBidi" w:hAnsiTheme="minorBidi"/>
+                <w:sz w:val="22"/>
+                <w:szCs w:val="22"/>
+              </w:rPr>
+              <w:t xml:space="preserve">, </w:t>
+            </w:r>
+            <w:proofErr w:type="spellStart"/>
+            <w:r>
+              <w:rPr>
+                <w:rFonts w:asciiTheme="minorBidi" w:hAnsiTheme="minorBidi"/>
+                <w:sz w:val="22"/>
+                <w:szCs w:val="22"/>
+              </w:rPr>
+              <w:t>pricePerMin</w:t>
+            </w:r>
+            <w:proofErr w:type="spellEnd"/>
+          </w:p>
+        </w:tc>
+        <w:tc>
+          <w:tcPr>
+            <w:tcW w:w="2159" w:type="dxa"/>
+            <w:vAlign w:val="center"/>
+          </w:tcPr>
+          <w:p>
+            <w:pPr>
+              <w:jc w:val="right"/>
+              <w:rPr>
+                <w:rFonts w:asciiTheme="minorBidi" w:hAnsiTheme="minorBidi"/>
+              </w:rPr>
+            </w:pPr>
+            <w:proofErr w:type="spellStart"/>
+            <w:r>
+              <w:rPr>
+                <w:rFonts w:asciiTheme="minorBidi" w:hAnsiTheme="minorBidi"/>
+              </w:rPr>
+              <w:t>ChargingStation</w:t>
+            </w:r>
+            <w:proofErr w:type="spellEnd"/>
+          </w:p>
+        </w:tc>
+      </w:tr>
+      <w:tr>
+        <w:trPr>
+          <w:trHeight w:val="432"/>
+        </w:trPr>
+        <w:tc>
+          <w:tcPr>
+            <w:tcW w:w="6137" w:type="dxa"/>
+            <w:vAlign w:val="center"/>
+          </w:tcPr>
+          <w:p>
+            <w:pPr>
+              <w:jc w:val="right"/>
+              <w:rPr>
+                <w:rFonts w:asciiTheme="minorBidi" w:hAnsiTheme="minorBidi"/>
+                <w:sz w:val="22"/>
+                <w:szCs w:val="22"/>
+                <w:lang w:val="en-GB"/>
+              </w:rPr>
+            </w:pPr>
+            <w:proofErr w:type="spellStart"/>
+            <w:r>
+              <w:rPr>
+                <w:rFonts w:asciiTheme="minorBidi" w:hAnsiTheme="minorBidi"/>
+                <w:sz w:val="22"/>
+                <w:szCs w:val="22"/>
+                <w:u w:val="single"/>
+              </w:rPr>
+              <w:t>VehicleNumber</w:t>
+            </w:r>
+            <w:proofErr w:type="spellEnd"/>
+            <w:r>
+              <w:rPr>
+                <w:rFonts w:asciiTheme="minorBidi" w:hAnsiTheme="minorBidi"/>
+                <w:sz w:val="22"/>
+                <w:szCs w:val="22"/>
+                <w:u w:val="single"/>
+              </w:rPr>
+              <w:t>, StationID</w:t>
+            </w:r>
+            <w:r>
+              <w:rPr>
+                <w:rFonts w:asciiTheme="minorBidi" w:hAnsiTheme="minorBidi"/>
+                <w:sz w:val="22"/>
+                <w:szCs w:val="22"/>
+              </w:rPr>
+              <w:t xml:space="preserve">, </w:t>
+            </w:r>
+            <w:proofErr w:type="spellStart"/>
+            <w:r>
+              <w:rPr>
+                <w:rFonts w:asciiTheme="minorBidi" w:hAnsiTheme="minorBidi"/>
+                <w:sz w:val="22"/>
+                <w:szCs w:val="22"/>
+                <w:lang w:val="en-GB"/>
+              </w:rPr>
+              <w:t>startTime</w:t>
+            </w:r>
+            <w:proofErr w:type="spellEnd"/>
+            <w:r>
+              <w:rPr>
+                <w:rFonts w:asciiTheme="minorBidi" w:hAnsiTheme="minorBidi"/>
+                <w:sz w:val="22"/>
+                <w:szCs w:val="22"/>
+                <w:lang w:val="en-GB"/>
+              </w:rPr>
+              <w:t xml:space="preserve">, </w:t>
+            </w:r>
+            <w:proofErr w:type="spellStart"/>
+            <w:r>
+              <w:rPr>
+                <w:rFonts w:asciiTheme="minorBidi" w:hAnsiTheme="minorBidi"/>
+                <w:sz w:val="22"/>
+                <w:szCs w:val="22"/>
+                <w:lang w:val="en-GB"/>
+              </w:rPr>
+              <w:t>endTime</w:t>
+            </w:r>
+            <w:proofErr w:type="spellEnd"/>
+            <w:r>
+              <w:rPr>
+                <w:rFonts w:asciiTheme="minorBidi" w:hAnsiTheme="minorBidi"/>
+                <w:sz w:val="22"/>
+                <w:szCs w:val="22"/>
+                <w:lang w:val="en-GB"/>
+              </w:rPr>
+              <w:t>, j</w:t>
+            </w:r>
+            <w:proofErr w:type="spellStart"/>
+            <w:r>
+              <w:rPr>
+                <w:rFonts w:asciiTheme="minorBidi" w:hAnsiTheme="minorBidi"/>
+                <w:sz w:val="22"/>
+                <w:szCs w:val="22"/>
+              </w:rPr>
+              <w:t>oulesConsumed</w:t>
+            </w:r>
+            <w:proofErr w:type="spellEnd"/>
+          </w:p>
+        </w:tc>
+        <w:tc>
+          <w:tcPr>
+            <w:tcW w:w="2159" w:type="dxa"/>
+            <w:vAlign w:val="center"/>
+          </w:tcPr>
+          <w:p>
+            <w:pPr>
+              <w:jc w:val="right"/>
+              <w:rPr>
+                <w:rFonts w:asciiTheme="minorBidi" w:hAnsiTheme="minorBidi"/>
+              </w:rPr>
+            </w:pPr>
+            <w:proofErr w:type="spellStart"/>
+            <w:r>
+              <w:rPr>
+                <w:rFonts w:asciiTheme="minorBidi" w:hAnsiTheme="minorBidi"/>
+              </w:rPr>
+              <w:t>Chargs</w:t>
+            </w:r>
+            <w:proofErr w:type="spellEnd"/>
+          </w:p>
+        </w:tc>
+      </w:tr>
+    </w:tbl>
+    <w:p>
+      <w:pPr>
+        <w:rPr>
+          <w:rFonts w:asciiTheme="minorBidi" w:hAnsiTheme="minorBidi"/>
           <w:rtl/>
         </w:rPr>
       </w:pPr>
@@ -2653,12 +4444,7 @@
       </w:pPr>
     </w:p>
     <w:sectPr>
-      <w:headerReference w:type="even" r:id="rId7"/>
-      <w:headerReference w:type="default" r:id="rId8"/>
-      <w:footerReference w:type="even" r:id="rId9"/>
-      <w:footerReference w:type="default" r:id="rId10"/>
-      <w:headerReference w:type="first" r:id="rId11"/>
-      <w:footerReference w:type="first" r:id="rId12"/>
+      <w:headerReference w:type="default" r:id="rId7"/>
       <w:pgSz w:w="11906" w:h="16838"/>
       <w:pgMar w:top="1440" w:right="1800" w:bottom="1440" w:left="1800" w:header="708" w:footer="708" w:gutter="0"/>
       <w:cols w:space="708"/>
@@ -2689,36 +4475,6 @@
 </w:endnotes>
 </file>
 
-<file path=word/footer1.xml><?xml version="1.0" encoding="utf-8"?>
-<w:ftr xmlns:wpc="http://schemas.microsoft.com/office/word/2010/wordprocessingCanvas" xmlns:cx="http://schemas.microsoft.com/office/drawing/2014/chartex" xmlns:cx1="http://schemas.microsoft.com/office/drawing/2015/9/8/chartex" xmlns:cx2="http://schemas.microsoft.com/office/drawing/2015/10/21/chartex" xmlns:cx3="http://schemas.microsoft.com/office/drawing/2016/5/9/chartex" xmlns:cx4="http://schemas.microsoft.com/office/drawing/2016/5/10/chartex" xmlns:cx5="http://schemas.microsoft.com/office/drawing/2016/5/11/chartex" xmlns:cx6="http://schemas.microsoft.com/office/drawing/2016/5/12/chartex" xmlns:cx7="http://schemas.microsoft.com/office/drawing/2016/5/13/chartex" xmlns:cx8="http://schemas.microsoft.com/office/drawing/2016/5/14/chartex" xmlns:mc="http://schemas.openxmlformats.org/markup-compatibility/2006" xmlns:aink="http://schemas.microsoft.com/office/drawing/2016/ink" xmlns:am3d="http://schemas.microsoft.com/office/drawing/2017/model3d" xmlns:o="urn:schemas-microsoft-com:office:office" xmlns:oel="http://schemas.microsoft.com/office/2019/extlst" xmlns:r="http://schemas.openxmlformats.org/officeDocument/2006/relationships" xmlns:m="http://schemas.openxmlformats.org/officeDocument/2006/math" xmlns:v="urn:schemas-microsoft-com:vml" xmlns:wp14="http://schemas.microsoft.com/office/word/2010/wordprocessingDrawing" xmlns:wp="http://schemas.openxmlformats.org/drawingml/2006/wordprocessingDrawing" xmlns:w10="urn:schemas-microsoft-com:office:word" xmlns:w="http://schemas.openxmlformats.org/wordprocessingml/2006/main" xmlns:w14="http://schemas.microsoft.com/office/word/2010/wordml" xmlns:w15="http://schemas.microsoft.com/office/word/2012/wordml" xmlns:w16cex="http://schemas.microsoft.com/office/word/2018/wordml/cex" xmlns:w16cid="http://schemas.microsoft.com/office/word/2016/wordml/cid" xmlns:w16="http://schemas.microsoft.com/office/word/2018/wordml" xmlns:w16du="http://schemas.microsoft.com/office/word/2023/wordml/word16du" xmlns:w16sdtdh="http://schemas.microsoft.com/office/word/2020/wordml/sdtdatahash" xmlns:w16sdtfl="http://schemas.microsoft.com/office/word/2024/wordml/sdtformatlock" xmlns:w16se="http://schemas.microsoft.com/office/word/2015/wordml/symex" xmlns:wpg="http://schemas.microsoft.com/office/word/2010/wordprocessingGroup" xmlns:wpi="http://schemas.microsoft.com/office/word/2010/wordprocessingInk" xmlns:wne="http://schemas.microsoft.com/office/word/2006/wordml" xmlns:wps="http://schemas.microsoft.com/office/word/2010/wordprocessingShape" mc:Ignorable="w14 w15 w16se w16cid w16 w16cex w16sdtdh w16sdtfl w16du wp14">
-  <w:p>
-    <w:pPr>
-      <w:pStyle w:val="Footer"/>
-    </w:pPr>
-  </w:p>
-</w:ftr>
-</file>
-
-<file path=word/footer2.xml><?xml version="1.0" encoding="utf-8"?>
-<w:ftr xmlns:wpc="http://schemas.microsoft.com/office/word/2010/wordprocessingCanvas" xmlns:cx="http://schemas.microsoft.com/office/drawing/2014/chartex" xmlns:cx1="http://schemas.microsoft.com/office/drawing/2015/9/8/chartex" xmlns:cx2="http://schemas.microsoft.com/office/drawing/2015/10/21/chartex" xmlns:cx3="http://schemas.microsoft.com/office/drawing/2016/5/9/chartex" xmlns:cx4="http://schemas.microsoft.com/office/drawing/2016/5/10/chartex" xmlns:cx5="http://schemas.microsoft.com/office/drawing/2016/5/11/chartex" xmlns:cx6="http://schemas.microsoft.com/office/drawing/2016/5/12/chartex" xmlns:cx7="http://schemas.microsoft.com/office/drawing/2016/5/13/chartex" xmlns:cx8="http://schemas.microsoft.com/office/drawing/2016/5/14/chartex" xmlns:mc="http://schemas.openxmlformats.org/markup-compatibility/2006" xmlns:aink="http://schemas.microsoft.com/office/drawing/2016/ink" xmlns:am3d="http://schemas.microsoft.com/office/drawing/2017/model3d" xmlns:o="urn:schemas-microsoft-com:office:office" xmlns:oel="http://schemas.microsoft.com/office/2019/extlst" xmlns:r="http://schemas.openxmlformats.org/officeDocument/2006/relationships" xmlns:m="http://schemas.openxmlformats.org/officeDocument/2006/math" xmlns:v="urn:schemas-microsoft-com:vml" xmlns:wp14="http://schemas.microsoft.com/office/word/2010/wordprocessingDrawing" xmlns:wp="http://schemas.openxmlformats.org/drawingml/2006/wordprocessingDrawing" xmlns:w10="urn:schemas-microsoft-com:office:word" xmlns:w="http://schemas.openxmlformats.org/wordprocessingml/2006/main" xmlns:w14="http://schemas.microsoft.com/office/word/2010/wordml" xmlns:w15="http://schemas.microsoft.com/office/word/2012/wordml" xmlns:w16cex="http://schemas.microsoft.com/office/word/2018/wordml/cex" xmlns:w16cid="http://schemas.microsoft.com/office/word/2016/wordml/cid" xmlns:w16="http://schemas.microsoft.com/office/word/2018/wordml" xmlns:w16du="http://schemas.microsoft.com/office/word/2023/wordml/word16du" xmlns:w16sdtdh="http://schemas.microsoft.com/office/word/2020/wordml/sdtdatahash" xmlns:w16sdtfl="http://schemas.microsoft.com/office/word/2024/wordml/sdtformatlock" xmlns:w16se="http://schemas.microsoft.com/office/word/2015/wordml/symex" xmlns:wpg="http://schemas.microsoft.com/office/word/2010/wordprocessingGroup" xmlns:wpi="http://schemas.microsoft.com/office/word/2010/wordprocessingInk" xmlns:wne="http://schemas.microsoft.com/office/word/2006/wordml" xmlns:wps="http://schemas.microsoft.com/office/word/2010/wordprocessingShape" mc:Ignorable="w14 w15 w16se w16cid w16 w16cex w16sdtdh w16sdtfl w16du wp14">
-  <w:p>
-    <w:pPr>
-      <w:pStyle w:val="Footer"/>
-    </w:pPr>
-  </w:p>
-</w:ftr>
-</file>
-
-<file path=word/footer3.xml><?xml version="1.0" encoding="utf-8"?>
-<w:ftr xmlns:wpc="http://schemas.microsoft.com/office/word/2010/wordprocessingCanvas" xmlns:cx="http://schemas.microsoft.com/office/drawing/2014/chartex" xmlns:cx1="http://schemas.microsoft.com/office/drawing/2015/9/8/chartex" xmlns:cx2="http://schemas.microsoft.com/office/drawing/2015/10/21/chartex" xmlns:cx3="http://schemas.microsoft.com/office/drawing/2016/5/9/chartex" xmlns:cx4="http://schemas.microsoft.com/office/drawing/2016/5/10/chartex" xmlns:cx5="http://schemas.microsoft.com/office/drawing/2016/5/11/chartex" xmlns:cx6="http://schemas.microsoft.com/office/drawing/2016/5/12/chartex" xmlns:cx7="http://schemas.microsoft.com/office/drawing/2016/5/13/chartex" xmlns:cx8="http://schemas.microsoft.com/office/drawing/2016/5/14/chartex" xmlns:mc="http://schemas.openxmlformats.org/markup-compatibility/2006" xmlns:aink="http://schemas.microsoft.com/office/drawing/2016/ink" xmlns:am3d="http://schemas.microsoft.com/office/drawing/2017/model3d" xmlns:o="urn:schemas-microsoft-com:office:office" xmlns:oel="http://schemas.microsoft.com/office/2019/extlst" xmlns:r="http://schemas.openxmlformats.org/officeDocument/2006/relationships" xmlns:m="http://schemas.openxmlformats.org/officeDocument/2006/math" xmlns:v="urn:schemas-microsoft-com:vml" xmlns:wp14="http://schemas.microsoft.com/office/word/2010/wordprocessingDrawing" xmlns:wp="http://schemas.openxmlformats.org/drawingml/2006/wordprocessingDrawing" xmlns:w10="urn:schemas-microsoft-com:office:word" xmlns:w="http://schemas.openxmlformats.org/wordprocessingml/2006/main" xmlns:w14="http://schemas.microsoft.com/office/word/2010/wordml" xmlns:w15="http://schemas.microsoft.com/office/word/2012/wordml" xmlns:w16cex="http://schemas.microsoft.com/office/word/2018/wordml/cex" xmlns:w16cid="http://schemas.microsoft.com/office/word/2016/wordml/cid" xmlns:w16="http://schemas.microsoft.com/office/word/2018/wordml" xmlns:w16du="http://schemas.microsoft.com/office/word/2023/wordml/word16du" xmlns:w16sdtdh="http://schemas.microsoft.com/office/word/2020/wordml/sdtdatahash" xmlns:w16sdtfl="http://schemas.microsoft.com/office/word/2024/wordml/sdtformatlock" xmlns:w16se="http://schemas.microsoft.com/office/word/2015/wordml/symex" xmlns:wpg="http://schemas.microsoft.com/office/word/2010/wordprocessingGroup" xmlns:wpi="http://schemas.microsoft.com/office/word/2010/wordprocessingInk" xmlns:wne="http://schemas.microsoft.com/office/word/2006/wordml" xmlns:wps="http://schemas.microsoft.com/office/word/2010/wordprocessingShape" mc:Ignorable="w14 w15 w16se w16cid w16 w16cex w16sdtdh w16sdtfl w16du wp14">
-  <w:p>
-    <w:pPr>
-      <w:pStyle w:val="Footer"/>
-    </w:pPr>
-  </w:p>
-</w:ftr>
-</file>
-
 <file path=word/footnotes.xml><?xml version="1.0" encoding="utf-8"?>
 <w:footnotes xmlns:wpc="http://schemas.microsoft.com/office/word/2010/wordprocessingCanvas" xmlns:cx="http://schemas.microsoft.com/office/drawing/2014/chartex" xmlns:cx1="http://schemas.microsoft.com/office/drawing/2015/9/8/chartex" xmlns:cx2="http://schemas.microsoft.com/office/drawing/2015/10/21/chartex" xmlns:cx3="http://schemas.microsoft.com/office/drawing/2016/5/9/chartex" xmlns:cx4="http://schemas.microsoft.com/office/drawing/2016/5/10/chartex" xmlns:cx5="http://schemas.microsoft.com/office/drawing/2016/5/11/chartex" xmlns:cx6="http://schemas.microsoft.com/office/drawing/2016/5/12/chartex" xmlns:cx7="http://schemas.microsoft.com/office/drawing/2016/5/13/chartex" xmlns:cx8="http://schemas.microsoft.com/office/drawing/2016/5/14/chartex" xmlns:mc="http://schemas.openxmlformats.org/markup-compatibility/2006" xmlns:aink="http://schemas.microsoft.com/office/drawing/2016/ink" xmlns:am3d="http://schemas.microsoft.com/office/drawing/2017/model3d" xmlns:o="urn:schemas-microsoft-com:office:office" xmlns:oel="http://schemas.microsoft.com/office/2019/extlst" xmlns:r="http://schemas.openxmlformats.org/officeDocument/2006/relationships" xmlns:m="http://schemas.openxmlformats.org/officeDocument/2006/math" xmlns:v="urn:schemas-microsoft-com:vml" xmlns:wp14="http://schemas.microsoft.com/office/word/2010/wordprocessingDrawing" xmlns:wp="http://schemas.openxmlformats.org/drawingml/2006/wordprocessingDrawing" xmlns:w10="urn:schemas-microsoft-com:office:word" xmlns:w="http://schemas.openxmlformats.org/wordprocessingml/2006/main" xmlns:w14="http://schemas.microsoft.com/office/word/2010/wordml" xmlns:w15="http://schemas.microsoft.com/office/word/2012/wordml" xmlns:w16cex="http://schemas.microsoft.com/office/word/2018/wordml/cex" xmlns:w16cid="http://schemas.microsoft.com/office/word/2016/wordml/cid" xmlns:w16="http://schemas.microsoft.com/office/word/2018/wordml" xmlns:w16du="http://schemas.microsoft.com/office/word/2023/wordml/word16du" xmlns:w16sdtdh="http://schemas.microsoft.com/office/word/2020/wordml/sdtdatahash" xmlns:w16sdtfl="http://schemas.microsoft.com/office/word/2024/wordml/sdtformatlock" xmlns:w16se="http://schemas.microsoft.com/office/word/2015/wordml/symex" xmlns:wpg="http://schemas.microsoft.com/office/word/2010/wordprocessingGroup" xmlns:wpi="http://schemas.microsoft.com/office/word/2010/wordprocessingInk" xmlns:wne="http://schemas.microsoft.com/office/word/2006/wordml" xmlns:wps="http://schemas.microsoft.com/office/word/2010/wordprocessingShape" mc:Ignorable="w14 w15 w16se w16cid w16 w16cex w16sdtdh w16sdtfl w16du wp14">
   <w:footnote w:type="separator" w:id="-1">
@@ -2739,16 +4495,6 @@
 </file>
 
 <file path=word/header1.xml><?xml version="1.0" encoding="utf-8"?>
-<w:hdr xmlns:wpc="http://schemas.microsoft.com/office/word/2010/wordprocessingCanvas" xmlns:cx="http://schemas.microsoft.com/office/drawing/2014/chartex" xmlns:cx1="http://schemas.microsoft.com/office/drawing/2015/9/8/chartex" xmlns:cx2="http://schemas.microsoft.com/office/drawing/2015/10/21/chartex" xmlns:cx3="http://schemas.microsoft.com/office/drawing/2016/5/9/chartex" xmlns:cx4="http://schemas.microsoft.com/office/drawing/2016/5/10/chartex" xmlns:cx5="http://schemas.microsoft.com/office/drawing/2016/5/11/chartex" xmlns:cx6="http://schemas.microsoft.com/office/drawing/2016/5/12/chartex" xmlns:cx7="http://schemas.microsoft.com/office/drawing/2016/5/13/chartex" xmlns:cx8="http://schemas.microsoft.com/office/drawing/2016/5/14/chartex" xmlns:mc="http://schemas.openxmlformats.org/markup-compatibility/2006" xmlns:aink="http://schemas.microsoft.com/office/drawing/2016/ink" xmlns:am3d="http://schemas.microsoft.com/office/drawing/2017/model3d" xmlns:o="urn:schemas-microsoft-com:office:office" xmlns:oel="http://schemas.microsoft.com/office/2019/extlst" xmlns:r="http://schemas.openxmlformats.org/officeDocument/2006/relationships" xmlns:m="http://schemas.openxmlformats.org/officeDocument/2006/math" xmlns:v="urn:schemas-microsoft-com:vml" xmlns:wp14="http://schemas.microsoft.com/office/word/2010/wordprocessingDrawing" xmlns:wp="http://schemas.openxmlformats.org/drawingml/2006/wordprocessingDrawing" xmlns:w10="urn:schemas-microsoft-com:office:word" xmlns:w="http://schemas.openxmlformats.org/wordprocessingml/2006/main" xmlns:w14="http://schemas.microsoft.com/office/word/2010/wordml" xmlns:w15="http://schemas.microsoft.com/office/word/2012/wordml" xmlns:w16cex="http://schemas.microsoft.com/office/word/2018/wordml/cex" xmlns:w16cid="http://schemas.microsoft.com/office/word/2016/wordml/cid" xmlns:w16="http://schemas.microsoft.com/office/word/2018/wordml" xmlns:w16du="http://schemas.microsoft.com/office/word/2023/wordml/word16du" xmlns:w16sdtdh="http://schemas.microsoft.com/office/word/2020/wordml/sdtdatahash" xmlns:w16sdtfl="http://schemas.microsoft.com/office/word/2024/wordml/sdtformatlock" xmlns:w16se="http://schemas.microsoft.com/office/word/2015/wordml/symex" xmlns:wpg="http://schemas.microsoft.com/office/word/2010/wordprocessingGroup" xmlns:wpi="http://schemas.microsoft.com/office/word/2010/wordprocessingInk" xmlns:wne="http://schemas.microsoft.com/office/word/2006/wordml" xmlns:wps="http://schemas.microsoft.com/office/word/2010/wordprocessingShape" mc:Ignorable="w14 w15 w16se w16cid w16 w16cex w16sdtdh w16sdtfl w16du wp14">
-  <w:p>
-    <w:pPr>
-      <w:pStyle w:val="Header"/>
-    </w:pPr>
-  </w:p>
-</w:hdr>
-</file>
-
-<file path=word/header2.xml><?xml version="1.0" encoding="utf-8"?>
 <w:hdr xmlns:wpc="http://schemas.microsoft.com/office/word/2010/wordprocessingCanvas" xmlns:cx="http://schemas.microsoft.com/office/drawing/2014/chartex" xmlns:cx1="http://schemas.microsoft.com/office/drawing/2015/9/8/chartex" xmlns:cx2="http://schemas.microsoft.com/office/drawing/2015/10/21/chartex" xmlns:cx3="http://schemas.microsoft.com/office/drawing/2016/5/9/chartex" xmlns:cx4="http://schemas.microsoft.com/office/drawing/2016/5/10/chartex" xmlns:cx5="http://schemas.microsoft.com/office/drawing/2016/5/11/chartex" xmlns:cx6="http://schemas.microsoft.com/office/drawing/2016/5/12/chartex" xmlns:cx7="http://schemas.microsoft.com/office/drawing/2016/5/13/chartex" xmlns:cx8="http://schemas.microsoft.com/office/drawing/2016/5/14/chartex" xmlns:mc="http://schemas.openxmlformats.org/markup-compatibility/2006" xmlns:aink="http://schemas.microsoft.com/office/drawing/2016/ink" xmlns:am3d="http://schemas.microsoft.com/office/drawing/2017/model3d" xmlns:o="urn:schemas-microsoft-com:office:office" xmlns:oel="http://schemas.microsoft.com/office/2019/extlst" xmlns:r="http://schemas.openxmlformats.org/officeDocument/2006/relationships" xmlns:m="http://schemas.openxmlformats.org/officeDocument/2006/math" xmlns:v="urn:schemas-microsoft-com:vml" xmlns:wp14="http://schemas.microsoft.com/office/word/2010/wordprocessingDrawing" xmlns:wp="http://schemas.openxmlformats.org/drawingml/2006/wordprocessingDrawing" xmlns:w10="urn:schemas-microsoft-com:office:word" xmlns:w="http://schemas.openxmlformats.org/wordprocessingml/2006/main" xmlns:w14="http://schemas.microsoft.com/office/word/2010/wordml" xmlns:w15="http://schemas.microsoft.com/office/word/2012/wordml" xmlns:w16cex="http://schemas.microsoft.com/office/word/2018/wordml/cex" xmlns:w16cid="http://schemas.microsoft.com/office/word/2016/wordml/cid" xmlns:w16="http://schemas.microsoft.com/office/word/2018/wordml" xmlns:w16du="http://schemas.microsoft.com/office/word/2023/wordml/word16du" xmlns:w16sdtdh="http://schemas.microsoft.com/office/word/2020/wordml/sdtdatahash" xmlns:w16sdtfl="http://schemas.microsoft.com/office/word/2024/wordml/sdtformatlock" xmlns:w16se="http://schemas.microsoft.com/office/word/2015/wordml/symex" xmlns:wpg="http://schemas.microsoft.com/office/word/2010/wordprocessingGroup" xmlns:wpi="http://schemas.microsoft.com/office/word/2010/wordprocessingInk" xmlns:wne="http://schemas.microsoft.com/office/word/2006/wordml" xmlns:wps="http://schemas.microsoft.com/office/word/2010/wordprocessingShape" mc:Ignorable="w14 w15 w16se w16cid w16 w16cex w16sdtdh w16sdtfl w16du wp14">
   <w:p>
     <w:pPr>
@@ -2761,19 +4507,11 @@
       </w:rPr>
       <w:t xml:space="preserve">ת.ז מגישות: 213384860 </w:t>
     </w:r>
+    <w:proofErr w:type="spellStart"/>
     <w:r>
       <w:t>xxxxxxxxx</w:t>
     </w:r>
-  </w:p>
-</w:hdr>
-</file>
-
-<file path=word/header3.xml><?xml version="1.0" encoding="utf-8"?>
-<w:hdr xmlns:wpc="http://schemas.microsoft.com/office/word/2010/wordprocessingCanvas" xmlns:cx="http://schemas.microsoft.com/office/drawing/2014/chartex" xmlns:cx1="http://schemas.microsoft.com/office/drawing/2015/9/8/chartex" xmlns:cx2="http://schemas.microsoft.com/office/drawing/2015/10/21/chartex" xmlns:cx3="http://schemas.microsoft.com/office/drawing/2016/5/9/chartex" xmlns:cx4="http://schemas.microsoft.com/office/drawing/2016/5/10/chartex" xmlns:cx5="http://schemas.microsoft.com/office/drawing/2016/5/11/chartex" xmlns:cx6="http://schemas.microsoft.com/office/drawing/2016/5/12/chartex" xmlns:cx7="http://schemas.microsoft.com/office/drawing/2016/5/13/chartex" xmlns:cx8="http://schemas.microsoft.com/office/drawing/2016/5/14/chartex" xmlns:mc="http://schemas.openxmlformats.org/markup-compatibility/2006" xmlns:aink="http://schemas.microsoft.com/office/drawing/2016/ink" xmlns:am3d="http://schemas.microsoft.com/office/drawing/2017/model3d" xmlns:o="urn:schemas-microsoft-com:office:office" xmlns:oel="http://schemas.microsoft.com/office/2019/extlst" xmlns:r="http://schemas.openxmlformats.org/officeDocument/2006/relationships" xmlns:m="http://schemas.openxmlformats.org/officeDocument/2006/math" xmlns:v="urn:schemas-microsoft-com:vml" xmlns:wp14="http://schemas.microsoft.com/office/word/2010/wordprocessingDrawing" xmlns:wp="http://schemas.openxmlformats.org/drawingml/2006/wordprocessingDrawing" xmlns:w10="urn:schemas-microsoft-com:office:word" xmlns:w="http://schemas.openxmlformats.org/wordprocessingml/2006/main" xmlns:w14="http://schemas.microsoft.com/office/word/2010/wordml" xmlns:w15="http://schemas.microsoft.com/office/word/2012/wordml" xmlns:w16cex="http://schemas.microsoft.com/office/word/2018/wordml/cex" xmlns:w16cid="http://schemas.microsoft.com/office/word/2016/wordml/cid" xmlns:w16="http://schemas.microsoft.com/office/word/2018/wordml" xmlns:w16du="http://schemas.microsoft.com/office/word/2023/wordml/word16du" xmlns:w16sdtdh="http://schemas.microsoft.com/office/word/2020/wordml/sdtdatahash" xmlns:w16sdtfl="http://schemas.microsoft.com/office/word/2024/wordml/sdtformatlock" xmlns:w16se="http://schemas.microsoft.com/office/word/2015/wordml/symex" xmlns:wpg="http://schemas.microsoft.com/office/word/2010/wordprocessingGroup" xmlns:wpi="http://schemas.microsoft.com/office/word/2010/wordprocessingInk" xmlns:wne="http://schemas.microsoft.com/office/word/2006/wordml" xmlns:wps="http://schemas.microsoft.com/office/word/2010/wordprocessingShape" mc:Ignorable="w14 w15 w16se w16cid w16 w16cex w16sdtdh w16sdtfl w16du wp14">
-  <w:p>
-    <w:pPr>
-      <w:pStyle w:val="Header"/>
-    </w:pPr>
+    <w:proofErr w:type="spellEnd"/>
   </w:p>
 </w:hdr>
 </file>
@@ -3172,6 +4910,7 @@
   <w:style w:type="paragraph" w:default="1" w:styleId="Normal">
     <w:name w:val="Normal"/>
     <w:qFormat/>
+    <w:rsid w:val="00B30899"/>
     <w:pPr>
       <w:bidi/>
     </w:pPr>
@@ -3376,7 +5115,6 @@
   <w:style w:type="character" w:default="1" w:styleId="DefaultParagraphFont">
     <w:name w:val="Default Paragraph Font"/>
     <w:uiPriority w:val="1"/>
-    <w:semiHidden/>
     <w:unhideWhenUsed/>
   </w:style>
   <w:style w:type="table" w:default="1" w:styleId="TableNormal">

</xml_diff>

<commit_message>
thats it i broke down
</commit_message>
<xml_diff>
--- a/ex4_solution_2026_Ascendant/ex4_Ascendant.docx
+++ b/ex4_solution_2026_Ascendant/ex4_Ascendant.docx
@@ -5389,15 +5389,14 @@
     </w:p>
     <w:p>
       <w:pPr>
-        <w:ind w:hanging="424"/>
-        <w:rPr>
-          <w:rFonts w:asciiTheme="minorBidi" w:hAnsiTheme="minorBidi" w:hint="cs"/>
+        <w:rPr>
+          <w:rFonts w:hint="cs"/>
           <w:noProof/>
         </w:rPr>
       </w:pPr>
       <w:r>
         <w:rPr>
-          <w:rFonts w:asciiTheme="minorBidi" w:hAnsiTheme="minorBidi" w:hint="cs"/>
+          <w:rFonts w:hint="cs"/>
           <w:noProof/>
         </w:rPr>
         <w:drawing>
@@ -5445,46 +5444,1052 @@
     </w:p>
     <w:p>
       <w:pPr>
-        <w:rPr>
-          <w:rFonts w:asciiTheme="minorBidi" w:hAnsiTheme="minorBidi" w:hint="cs"/>
+        <w:bidi w:val="0"/>
+        <w:rPr>
+          <w:rFonts w:asciiTheme="minorBidi" w:hAnsiTheme="minorBidi"/>
         </w:rPr>
       </w:pPr>
-    </w:p>
-    <w:p>
-      <w:pPr>
-        <w:rPr>
-          <w:rFonts w:asciiTheme="minorBidi" w:hAnsiTheme="minorBidi" w:hint="cs"/>
-        </w:rPr>
-      </w:pPr>
-    </w:p>
-    <w:p>
-      <w:pPr>
-        <w:rPr>
-          <w:rFonts w:asciiTheme="minorBidi" w:hAnsiTheme="minorBidi" w:hint="cs"/>
-        </w:rPr>
-      </w:pPr>
-    </w:p>
-    <w:p>
-      <w:pPr>
-        <w:rPr>
-          <w:rFonts w:asciiTheme="minorBidi" w:hAnsiTheme="minorBidi" w:hint="cs"/>
-          <w:noProof/>
-        </w:rPr>
-      </w:pPr>
+      <w:r>
+        <w:rPr>
+          <w:rFonts w:asciiTheme="minorBidi" w:hAnsiTheme="minorBidi"/>
+        </w:rPr>
+        <w:br w:type="page"/>
+      </w:r>
     </w:p>
     <w:p>
       <w:pPr>
         <w:pStyle w:val="NoSpacing"/>
       </w:pPr>
       <w:r>
+        <w:lastRenderedPageBreak/>
         <w:t>2.4</w:t>
       </w:r>
+      <w:r>
+        <w:rPr>
+          <w:rFonts w:hint="cs"/>
+          <w:rtl/>
+        </w:rPr>
+        <w:t xml:space="preserve"> </w:t>
+      </w:r>
+      <w:r>
+        <w:rPr>
+          <w:rFonts w:hint="cs"/>
+          <w:color w:val="EE0000"/>
+          <w:rtl/>
+        </w:rPr>
+        <w:t>[</w:t>
+      </w:r>
+      <w:r>
+        <w:rPr>
+          <w:color w:val="EE0000"/>
+        </w:rPr>
+        <w:t>draft</w:t>
+      </w:r>
+      <w:r>
+        <w:rPr>
+          <w:rFonts w:hint="cs"/>
+          <w:color w:val="EE0000"/>
+          <w:rtl/>
+        </w:rPr>
+        <w:t>]</w:t>
+      </w:r>
+      <w:r>
+        <w:br/>
+      </w:r>
     </w:p>
-    <w:p/>
+    <w:tbl>
+      <w:tblPr>
+        <w:tblStyle w:val="TableGrid"/>
+        <w:bidiVisual/>
+        <w:tblW w:w="10437" w:type="dxa"/>
+        <w:tblInd w:w="-903" w:type="dxa"/>
+        <w:tblLook w:val="04A0" w:firstRow="1" w:lastRow="0" w:firstColumn="1" w:lastColumn="0" w:noHBand="0" w:noVBand="1"/>
+      </w:tblPr>
+      <w:tblGrid>
+        <w:gridCol w:w="2423"/>
+        <w:gridCol w:w="3247"/>
+        <w:gridCol w:w="1710"/>
+        <w:gridCol w:w="1053"/>
+        <w:gridCol w:w="2004"/>
+      </w:tblGrid>
+      <w:tr>
+        <w:trPr>
+          <w:trHeight w:val="364"/>
+        </w:trPr>
+        <w:tc>
+          <w:tcPr>
+            <w:tcW w:w="2423" w:type="dxa"/>
+            <w:shd w:val="clear" w:color="auto" w:fill="F2CEED" w:themeFill="accent5" w:themeFillTint="33"/>
+            <w:vAlign w:val="center"/>
+          </w:tcPr>
+          <w:p>
+            <w:pPr>
+              <w:spacing w:line="276" w:lineRule="auto"/>
+              <w:jc w:val="right"/>
+              <w:rPr>
+                <w:rtl/>
+              </w:rPr>
+            </w:pPr>
+            <w:r>
+              <w:rPr>
+                <w:rFonts w:ascii="Arial" w:hAnsi="Arial" w:cs="Arial"/>
+                <w:sz w:val="20"/>
+                <w:szCs w:val="20"/>
+              </w:rPr>
+              <w:t>Implementation</w:t>
+            </w:r>
+          </w:p>
+        </w:tc>
+        <w:tc>
+          <w:tcPr>
+            <w:tcW w:w="3247" w:type="dxa"/>
+            <w:shd w:val="clear" w:color="auto" w:fill="F2CEED" w:themeFill="accent5" w:themeFillTint="33"/>
+            <w:vAlign w:val="center"/>
+          </w:tcPr>
+          <w:p>
+            <w:pPr>
+              <w:spacing w:line="276" w:lineRule="auto"/>
+              <w:jc w:val="right"/>
+              <w:rPr>
+                <w:rtl/>
+              </w:rPr>
+            </w:pPr>
+            <w:r>
+              <w:rPr>
+                <w:rFonts w:ascii="Arial" w:hAnsi="Arial" w:cs="Arial"/>
+                <w:sz w:val="20"/>
+                <w:szCs w:val="20"/>
+              </w:rPr>
+              <w:t>Data Structure</w:t>
+            </w:r>
+          </w:p>
+        </w:tc>
+        <w:tc>
+          <w:tcPr>
+            <w:tcW w:w="1710" w:type="dxa"/>
+            <w:shd w:val="clear" w:color="auto" w:fill="F2CEED" w:themeFill="accent5" w:themeFillTint="33"/>
+            <w:vAlign w:val="center"/>
+          </w:tcPr>
+          <w:p>
+            <w:pPr>
+              <w:spacing w:line="276" w:lineRule="auto"/>
+              <w:jc w:val="right"/>
+              <w:rPr>
+                <w:rtl/>
+              </w:rPr>
+            </w:pPr>
+            <w:r>
+              <w:rPr>
+                <w:rFonts w:ascii="Arial" w:hAnsi="Arial" w:cs="Arial"/>
+                <w:sz w:val="20"/>
+                <w:szCs w:val="20"/>
+              </w:rPr>
+              <w:t>to</w:t>
+            </w:r>
+          </w:p>
+        </w:tc>
+        <w:tc>
+          <w:tcPr>
+            <w:tcW w:w="1053" w:type="dxa"/>
+            <w:shd w:val="clear" w:color="auto" w:fill="F2CEED" w:themeFill="accent5" w:themeFillTint="33"/>
+            <w:vAlign w:val="center"/>
+          </w:tcPr>
+          <w:p>
+            <w:pPr>
+              <w:spacing w:line="276" w:lineRule="auto"/>
+              <w:jc w:val="right"/>
+              <w:rPr>
+                <w:rtl/>
+              </w:rPr>
+            </w:pPr>
+            <w:r>
+              <w:rPr>
+                <w:rFonts w:ascii="Arial" w:hAnsi="Arial" w:cs="Arial"/>
+                <w:sz w:val="20"/>
+                <w:szCs w:val="20"/>
+              </w:rPr>
+              <w:t>from</w:t>
+            </w:r>
+          </w:p>
+        </w:tc>
+        <w:tc>
+          <w:tcPr>
+            <w:tcW w:w="2004" w:type="dxa"/>
+            <w:shd w:val="clear" w:color="auto" w:fill="F2CEED" w:themeFill="accent5" w:themeFillTint="33"/>
+            <w:vAlign w:val="center"/>
+          </w:tcPr>
+          <w:p>
+            <w:pPr>
+              <w:spacing w:line="276" w:lineRule="auto"/>
+              <w:jc w:val="right"/>
+              <w:rPr>
+                <w:rFonts w:hint="cs"/>
+                <w:rtl/>
+              </w:rPr>
+            </w:pPr>
+            <w:r>
+              <w:rPr>
+                <w:rFonts w:ascii="Arial" w:hAnsi="Arial" w:cs="Arial"/>
+                <w:sz w:val="20"/>
+                <w:szCs w:val="20"/>
+              </w:rPr>
+              <w:t>Flow Name</w:t>
+            </w:r>
+          </w:p>
+        </w:tc>
+      </w:tr>
+      <w:tr>
+        <w:trPr>
+          <w:trHeight w:val="378"/>
+        </w:trPr>
+        <w:tc>
+          <w:tcPr>
+            <w:tcW w:w="2423" w:type="dxa"/>
+            <w:vAlign w:val="center"/>
+          </w:tcPr>
+          <w:p>
+            <w:pPr>
+              <w:spacing w:line="276" w:lineRule="auto"/>
+              <w:jc w:val="right"/>
+              <w:rPr>
+                <w:rtl/>
+              </w:rPr>
+            </w:pPr>
+            <w:r>
+              <w:rPr>
+                <w:rFonts w:ascii="Arial" w:hAnsi="Arial" w:cs="Arial"/>
+                <w:sz w:val="20"/>
+                <w:szCs w:val="20"/>
+              </w:rPr>
+              <w:t>Inductive Loop Sensor</w:t>
+            </w:r>
+          </w:p>
+        </w:tc>
+        <w:tc>
+          <w:tcPr>
+            <w:tcW w:w="3247" w:type="dxa"/>
+            <w:vAlign w:val="center"/>
+          </w:tcPr>
+          <w:p>
+            <w:pPr>
+              <w:spacing w:line="276" w:lineRule="auto"/>
+              <w:jc w:val="right"/>
+              <w:rPr>
+                <w:rtl/>
+              </w:rPr>
+            </w:pPr>
+            <w:proofErr w:type="spellStart"/>
+            <w:r>
+              <w:rPr>
+                <w:rFonts w:ascii="Arial" w:hAnsi="Arial" w:cs="Arial"/>
+                <w:sz w:val="20"/>
+                <w:szCs w:val="20"/>
+              </w:rPr>
+              <w:t>SensorSignal</w:t>
+            </w:r>
+            <w:proofErr w:type="spellEnd"/>
+            <w:r>
+              <w:rPr>
+                <w:rFonts w:ascii="Arial" w:hAnsi="Arial" w:cs="Arial"/>
+                <w:sz w:val="20"/>
+                <w:szCs w:val="20"/>
+              </w:rPr>
+              <w:t xml:space="preserve"> OR </w:t>
+            </w:r>
+            <w:proofErr w:type="spellStart"/>
+            <w:r>
+              <w:rPr>
+                <w:rFonts w:ascii="Arial" w:hAnsi="Arial" w:cs="Arial"/>
+                <w:sz w:val="20"/>
+                <w:szCs w:val="20"/>
+              </w:rPr>
+              <w:t>ButtonPress</w:t>
+            </w:r>
+            <w:proofErr w:type="spellEnd"/>
+          </w:p>
+        </w:tc>
+        <w:tc>
+          <w:tcPr>
+            <w:tcW w:w="1710" w:type="dxa"/>
+            <w:vAlign w:val="center"/>
+          </w:tcPr>
+          <w:p>
+            <w:pPr>
+              <w:spacing w:line="276" w:lineRule="auto"/>
+              <w:jc w:val="right"/>
+              <w:rPr>
+                <w:rtl/>
+              </w:rPr>
+            </w:pPr>
+            <w:r>
+              <w:rPr>
+                <w:rFonts w:ascii="Arial" w:hAnsi="Arial" w:cs="Arial"/>
+                <w:sz w:val="20"/>
+                <w:szCs w:val="20"/>
+              </w:rPr>
+              <w:t xml:space="preserve">P1.1 </w:t>
+            </w:r>
+          </w:p>
+        </w:tc>
+        <w:tc>
+          <w:tcPr>
+            <w:tcW w:w="1053" w:type="dxa"/>
+            <w:vAlign w:val="center"/>
+          </w:tcPr>
+          <w:p>
+            <w:pPr>
+              <w:spacing w:line="276" w:lineRule="auto"/>
+              <w:jc w:val="right"/>
+              <w:rPr>
+                <w:rtl/>
+              </w:rPr>
+            </w:pPr>
+            <w:r>
+              <w:rPr>
+                <w:rFonts w:ascii="Arial" w:hAnsi="Arial" w:cs="Arial"/>
+                <w:sz w:val="20"/>
+                <w:szCs w:val="20"/>
+              </w:rPr>
+              <w:t>Driver</w:t>
+            </w:r>
+          </w:p>
+        </w:tc>
+        <w:tc>
+          <w:tcPr>
+            <w:tcW w:w="2004" w:type="dxa"/>
+            <w:vAlign w:val="center"/>
+          </w:tcPr>
+          <w:p>
+            <w:pPr>
+              <w:spacing w:line="276" w:lineRule="auto"/>
+              <w:jc w:val="right"/>
+              <w:rPr>
+                <w:rtl/>
+              </w:rPr>
+            </w:pPr>
+            <w:r>
+              <w:rPr>
+                <w:rFonts w:ascii="Arial" w:hAnsi="Arial" w:cs="Arial"/>
+                <w:sz w:val="20"/>
+                <w:szCs w:val="20"/>
+              </w:rPr>
+              <w:t>Check Availability</w:t>
+            </w:r>
+          </w:p>
+        </w:tc>
+      </w:tr>
+      <w:tr>
+        <w:trPr>
+          <w:trHeight w:val="364"/>
+        </w:trPr>
+        <w:tc>
+          <w:tcPr>
+            <w:tcW w:w="2423" w:type="dxa"/>
+            <w:vAlign w:val="center"/>
+          </w:tcPr>
+          <w:p>
+            <w:pPr>
+              <w:spacing w:line="276" w:lineRule="auto"/>
+              <w:jc w:val="right"/>
+              <w:rPr>
+                <w:rtl/>
+              </w:rPr>
+            </w:pPr>
+            <w:r>
+              <w:rPr>
+                <w:rFonts w:ascii="Arial" w:hAnsi="Arial" w:cs="Arial"/>
+                <w:sz w:val="20"/>
+                <w:szCs w:val="20"/>
+              </w:rPr>
+              <w:t>LED Signage</w:t>
+            </w:r>
+          </w:p>
+        </w:tc>
+        <w:tc>
+          <w:tcPr>
+            <w:tcW w:w="3247" w:type="dxa"/>
+            <w:vAlign w:val="center"/>
+          </w:tcPr>
+          <w:p>
+            <w:pPr>
+              <w:spacing w:line="276" w:lineRule="auto"/>
+              <w:jc w:val="right"/>
+              <w:rPr>
+                <w:rtl/>
+              </w:rPr>
+            </w:pPr>
+            <w:r>
+              <w:rPr>
+                <w:rFonts w:ascii="Arial" w:hAnsi="Arial" w:cs="Arial"/>
+                <w:sz w:val="20"/>
+                <w:szCs w:val="20"/>
+              </w:rPr>
+              <w:t>Status (Green/Red light)</w:t>
+            </w:r>
+          </w:p>
+        </w:tc>
+        <w:tc>
+          <w:tcPr>
+            <w:tcW w:w="1710" w:type="dxa"/>
+            <w:vAlign w:val="center"/>
+          </w:tcPr>
+          <w:p>
+            <w:pPr>
+              <w:spacing w:line="276" w:lineRule="auto"/>
+              <w:jc w:val="right"/>
+              <w:rPr>
+                <w:rtl/>
+              </w:rPr>
+            </w:pPr>
+            <w:r>
+              <w:rPr>
+                <w:rFonts w:ascii="Arial" w:hAnsi="Arial" w:cs="Arial"/>
+                <w:sz w:val="20"/>
+                <w:szCs w:val="20"/>
+              </w:rPr>
+              <w:t>Driver</w:t>
+            </w:r>
+          </w:p>
+        </w:tc>
+        <w:tc>
+          <w:tcPr>
+            <w:tcW w:w="1053" w:type="dxa"/>
+            <w:vAlign w:val="center"/>
+          </w:tcPr>
+          <w:p>
+            <w:pPr>
+              <w:spacing w:line="276" w:lineRule="auto"/>
+              <w:jc w:val="right"/>
+              <w:rPr>
+                <w:rtl/>
+              </w:rPr>
+            </w:pPr>
+            <w:r>
+              <w:rPr>
+                <w:rFonts w:ascii="Arial" w:hAnsi="Arial" w:cs="Arial"/>
+                <w:sz w:val="20"/>
+                <w:szCs w:val="20"/>
+              </w:rPr>
+              <w:t>P1.1</w:t>
+            </w:r>
+          </w:p>
+        </w:tc>
+        <w:tc>
+          <w:tcPr>
+            <w:tcW w:w="2004" w:type="dxa"/>
+            <w:vAlign w:val="center"/>
+          </w:tcPr>
+          <w:p>
+            <w:pPr>
+              <w:spacing w:line="276" w:lineRule="auto"/>
+              <w:jc w:val="right"/>
+              <w:rPr>
+                <w:rtl/>
+              </w:rPr>
+            </w:pPr>
+            <w:r>
+              <w:rPr>
+                <w:rFonts w:ascii="Arial" w:hAnsi="Arial" w:cs="Arial"/>
+                <w:sz w:val="20"/>
+                <w:szCs w:val="20"/>
+              </w:rPr>
+              <w:t>Space Availability</w:t>
+            </w:r>
+          </w:p>
+        </w:tc>
+      </w:tr>
+      <w:tr>
+        <w:trPr>
+          <w:trHeight w:val="364"/>
+        </w:trPr>
+        <w:tc>
+          <w:tcPr>
+            <w:tcW w:w="2423" w:type="dxa"/>
+            <w:vAlign w:val="center"/>
+          </w:tcPr>
+          <w:p>
+            <w:pPr>
+              <w:spacing w:line="276" w:lineRule="auto"/>
+              <w:jc w:val="right"/>
+              <w:rPr>
+                <w:rtl/>
+              </w:rPr>
+            </w:pPr>
+            <w:r>
+              <w:rPr>
+                <w:rFonts w:ascii="Arial" w:hAnsi="Arial" w:cs="Arial"/>
+                <w:sz w:val="20"/>
+                <w:szCs w:val="20"/>
+              </w:rPr>
+              <w:t>SQL INSERT Query</w:t>
+            </w:r>
+          </w:p>
+        </w:tc>
+        <w:tc>
+          <w:tcPr>
+            <w:tcW w:w="3247" w:type="dxa"/>
+            <w:vAlign w:val="center"/>
+          </w:tcPr>
+          <w:p>
+            <w:pPr>
+              <w:spacing w:line="276" w:lineRule="auto"/>
+              <w:jc w:val="right"/>
+              <w:rPr>
+                <w:rtl/>
+              </w:rPr>
+            </w:pPr>
+            <w:proofErr w:type="spellStart"/>
+            <w:proofErr w:type="gramStart"/>
+            <w:r>
+              <w:rPr>
+                <w:rFonts w:ascii="Arial" w:hAnsi="Arial" w:cs="Arial"/>
+                <w:sz w:val="20"/>
+                <w:szCs w:val="20"/>
+              </w:rPr>
+              <w:t>vehicleNumber</w:t>
+            </w:r>
+            <w:proofErr w:type="spellEnd"/>
+            <w:proofErr w:type="gramEnd"/>
+            <w:r>
+              <w:rPr>
+                <w:rFonts w:ascii="Arial" w:hAnsi="Arial" w:cs="Arial"/>
+                <w:sz w:val="20"/>
+                <w:szCs w:val="20"/>
+              </w:rPr>
+              <w:t xml:space="preserve">, </w:t>
+            </w:r>
+            <w:proofErr w:type="spellStart"/>
+            <w:proofErr w:type="gramStart"/>
+            <w:r>
+              <w:rPr>
+                <w:rFonts w:ascii="Arial" w:hAnsi="Arial" w:cs="Arial"/>
+                <w:sz w:val="20"/>
+                <w:szCs w:val="20"/>
+              </w:rPr>
+              <w:t>startTime</w:t>
+            </w:r>
+            <w:proofErr w:type="spellEnd"/>
+            <w:proofErr w:type="gramEnd"/>
+            <w:r>
+              <w:rPr>
+                <w:rFonts w:ascii="Arial" w:hAnsi="Arial" w:cs="Arial"/>
+                <w:sz w:val="20"/>
+                <w:szCs w:val="20"/>
+              </w:rPr>
+              <w:t xml:space="preserve">, </w:t>
+            </w:r>
+            <w:proofErr w:type="spellStart"/>
+            <w:r>
+              <w:rPr>
+                <w:rFonts w:ascii="Arial" w:hAnsi="Arial" w:cs="Arial"/>
+                <w:sz w:val="20"/>
+                <w:szCs w:val="20"/>
+              </w:rPr>
+              <w:t>stationID</w:t>
+            </w:r>
+            <w:proofErr w:type="spellEnd"/>
+            <w:r>
+              <w:rPr>
+                <w:rFonts w:ascii="Arial" w:hAnsi="Arial" w:cs="Arial"/>
+                <w:sz w:val="20"/>
+                <w:szCs w:val="20"/>
+              </w:rPr>
+              <w:t xml:space="preserve"> (if applicable)</w:t>
+            </w:r>
+          </w:p>
+        </w:tc>
+        <w:tc>
+          <w:tcPr>
+            <w:tcW w:w="1710" w:type="dxa"/>
+            <w:vAlign w:val="center"/>
+          </w:tcPr>
+          <w:p>
+            <w:pPr>
+              <w:spacing w:line="276" w:lineRule="auto"/>
+              <w:jc w:val="right"/>
+              <w:rPr>
+                <w:rtl/>
+              </w:rPr>
+            </w:pPr>
+            <w:r>
+              <w:rPr>
+                <w:rFonts w:ascii="Arial" w:hAnsi="Arial" w:cs="Arial"/>
+                <w:sz w:val="20"/>
+                <w:szCs w:val="20"/>
+              </w:rPr>
+              <w:t>D2 Operations</w:t>
+            </w:r>
+          </w:p>
+        </w:tc>
+        <w:tc>
+          <w:tcPr>
+            <w:tcW w:w="1053" w:type="dxa"/>
+            <w:vAlign w:val="center"/>
+          </w:tcPr>
+          <w:p>
+            <w:pPr>
+              <w:spacing w:line="276" w:lineRule="auto"/>
+              <w:jc w:val="right"/>
+              <w:rPr>
+                <w:rtl/>
+              </w:rPr>
+            </w:pPr>
+            <w:r>
+              <w:rPr>
+                <w:rFonts w:ascii="Arial" w:hAnsi="Arial" w:cs="Arial"/>
+                <w:sz w:val="20"/>
+                <w:szCs w:val="20"/>
+              </w:rPr>
+              <w:t>P1.2</w:t>
+            </w:r>
+          </w:p>
+        </w:tc>
+        <w:tc>
+          <w:tcPr>
+            <w:tcW w:w="2004" w:type="dxa"/>
+            <w:vAlign w:val="center"/>
+          </w:tcPr>
+          <w:p>
+            <w:pPr>
+              <w:spacing w:line="276" w:lineRule="auto"/>
+              <w:jc w:val="right"/>
+              <w:rPr>
+                <w:rtl/>
+              </w:rPr>
+            </w:pPr>
+            <w:r>
+              <w:rPr>
+                <w:rFonts w:ascii="Arial" w:hAnsi="Arial" w:cs="Arial"/>
+                <w:sz w:val="20"/>
+                <w:szCs w:val="20"/>
+              </w:rPr>
+              <w:t>Create Parking Record</w:t>
+            </w:r>
+          </w:p>
+        </w:tc>
+      </w:tr>
+      <w:tr>
+        <w:trPr>
+          <w:trHeight w:val="364"/>
+        </w:trPr>
+        <w:tc>
+          <w:tcPr>
+            <w:tcW w:w="2423" w:type="dxa"/>
+            <w:vAlign w:val="center"/>
+          </w:tcPr>
+          <w:p>
+            <w:pPr>
+              <w:spacing w:line="276" w:lineRule="auto"/>
+              <w:jc w:val="right"/>
+              <w:rPr>
+                <w:rtl/>
+              </w:rPr>
+            </w:pPr>
+            <w:r>
+              <w:rPr>
+                <w:rFonts w:ascii="Arial" w:hAnsi="Arial" w:cs="Arial"/>
+                <w:sz w:val="20"/>
+                <w:szCs w:val="20"/>
+              </w:rPr>
+              <w:t>Barcode Scanner / LPR Camera</w:t>
+            </w:r>
+          </w:p>
+        </w:tc>
+        <w:tc>
+          <w:tcPr>
+            <w:tcW w:w="3247" w:type="dxa"/>
+            <w:vAlign w:val="center"/>
+          </w:tcPr>
+          <w:p>
+            <w:pPr>
+              <w:spacing w:line="276" w:lineRule="auto"/>
+              <w:jc w:val="right"/>
+              <w:rPr>
+                <w:rtl/>
+              </w:rPr>
+            </w:pPr>
+            <w:proofErr w:type="spellStart"/>
+            <w:r>
+              <w:rPr>
+                <w:rFonts w:ascii="Arial" w:hAnsi="Arial" w:cs="Arial"/>
+                <w:sz w:val="20"/>
+                <w:szCs w:val="20"/>
+              </w:rPr>
+              <w:t>vehicleNumber</w:t>
+            </w:r>
+            <w:proofErr w:type="spellEnd"/>
+            <w:r>
+              <w:rPr>
+                <w:rFonts w:ascii="Arial" w:hAnsi="Arial" w:cs="Arial"/>
+                <w:sz w:val="20"/>
+                <w:szCs w:val="20"/>
+              </w:rPr>
+              <w:t xml:space="preserve"> OR </w:t>
+            </w:r>
+            <w:proofErr w:type="spellStart"/>
+            <w:r>
+              <w:rPr>
+                <w:rFonts w:ascii="Arial" w:hAnsi="Arial" w:cs="Arial"/>
+                <w:sz w:val="20"/>
+                <w:szCs w:val="20"/>
+              </w:rPr>
+              <w:t>ticketBarcode</w:t>
+            </w:r>
+            <w:proofErr w:type="spellEnd"/>
+          </w:p>
+        </w:tc>
+        <w:tc>
+          <w:tcPr>
+            <w:tcW w:w="1710" w:type="dxa"/>
+            <w:vAlign w:val="center"/>
+          </w:tcPr>
+          <w:p>
+            <w:pPr>
+              <w:spacing w:line="276" w:lineRule="auto"/>
+              <w:jc w:val="right"/>
+              <w:rPr>
+                <w:rtl/>
+              </w:rPr>
+            </w:pPr>
+            <w:r>
+              <w:rPr>
+                <w:rFonts w:ascii="Arial" w:hAnsi="Arial" w:cs="Arial"/>
+                <w:sz w:val="20"/>
+                <w:szCs w:val="20"/>
+              </w:rPr>
+              <w:t>P1.3 Calculate Pay</w:t>
+            </w:r>
+          </w:p>
+        </w:tc>
+        <w:tc>
+          <w:tcPr>
+            <w:tcW w:w="1053" w:type="dxa"/>
+            <w:vAlign w:val="center"/>
+          </w:tcPr>
+          <w:p>
+            <w:pPr>
+              <w:spacing w:line="276" w:lineRule="auto"/>
+              <w:jc w:val="right"/>
+              <w:rPr>
+                <w:rtl/>
+              </w:rPr>
+            </w:pPr>
+            <w:r>
+              <w:rPr>
+                <w:rFonts w:ascii="Arial" w:hAnsi="Arial" w:cs="Arial"/>
+                <w:sz w:val="20"/>
+                <w:szCs w:val="20"/>
+              </w:rPr>
+              <w:t>Driver</w:t>
+            </w:r>
+          </w:p>
+        </w:tc>
+        <w:tc>
+          <w:tcPr>
+            <w:tcW w:w="2004" w:type="dxa"/>
+            <w:vAlign w:val="center"/>
+          </w:tcPr>
+          <w:p>
+            <w:pPr>
+              <w:spacing w:line="276" w:lineRule="auto"/>
+              <w:jc w:val="right"/>
+              <w:rPr>
+                <w:rtl/>
+              </w:rPr>
+            </w:pPr>
+            <w:r>
+              <w:rPr>
+                <w:rFonts w:ascii="Arial" w:hAnsi="Arial" w:cs="Arial"/>
+                <w:sz w:val="20"/>
+                <w:szCs w:val="20"/>
+              </w:rPr>
+              <w:t>Vehicle ID</w:t>
+            </w:r>
+          </w:p>
+        </w:tc>
+      </w:tr>
+      <w:tr>
+        <w:trPr>
+          <w:trHeight w:val="378"/>
+        </w:trPr>
+        <w:tc>
+          <w:tcPr>
+            <w:tcW w:w="2423" w:type="dxa"/>
+            <w:vAlign w:val="center"/>
+          </w:tcPr>
+          <w:p>
+            <w:pPr>
+              <w:spacing w:line="276" w:lineRule="auto"/>
+              <w:jc w:val="right"/>
+              <w:rPr>
+                <w:rtl/>
+              </w:rPr>
+            </w:pPr>
+            <w:r>
+              <w:rPr>
+                <w:rFonts w:ascii="Arial" w:hAnsi="Arial" w:cs="Arial"/>
+                <w:sz w:val="20"/>
+                <w:szCs w:val="20"/>
+              </w:rPr>
+              <w:t>Internal Variable / Object Transfer</w:t>
+            </w:r>
+          </w:p>
+        </w:tc>
+        <w:tc>
+          <w:tcPr>
+            <w:tcW w:w="3247" w:type="dxa"/>
+            <w:vAlign w:val="center"/>
+          </w:tcPr>
+          <w:p>
+            <w:pPr>
+              <w:spacing w:line="276" w:lineRule="auto"/>
+              <w:jc w:val="right"/>
+              <w:rPr>
+                <w:rtl/>
+              </w:rPr>
+            </w:pPr>
+            <w:proofErr w:type="spellStart"/>
+            <w:r>
+              <w:rPr>
+                <w:rFonts w:ascii="Arial" w:hAnsi="Arial" w:cs="Arial"/>
+                <w:sz w:val="20"/>
+                <w:szCs w:val="20"/>
+              </w:rPr>
+              <w:t>amountPaid</w:t>
+            </w:r>
+            <w:proofErr w:type="spellEnd"/>
+            <w:r>
+              <w:rPr>
+                <w:rFonts w:ascii="Arial" w:hAnsi="Arial" w:cs="Arial"/>
+                <w:sz w:val="20"/>
+                <w:szCs w:val="20"/>
+              </w:rPr>
+              <w:t>, currency</w:t>
+            </w:r>
+          </w:p>
+        </w:tc>
+        <w:tc>
+          <w:tcPr>
+            <w:tcW w:w="1710" w:type="dxa"/>
+            <w:vAlign w:val="center"/>
+          </w:tcPr>
+          <w:p>
+            <w:pPr>
+              <w:spacing w:line="276" w:lineRule="auto"/>
+              <w:jc w:val="right"/>
+              <w:rPr>
+                <w:rtl/>
+              </w:rPr>
+            </w:pPr>
+            <w:r>
+              <w:rPr>
+                <w:rFonts w:ascii="Arial" w:hAnsi="Arial" w:cs="Arial"/>
+                <w:sz w:val="20"/>
+                <w:szCs w:val="20"/>
+              </w:rPr>
+              <w:t>P1.4 Register Exit</w:t>
+            </w:r>
+          </w:p>
+        </w:tc>
+        <w:tc>
+          <w:tcPr>
+            <w:tcW w:w="1053" w:type="dxa"/>
+            <w:vAlign w:val="center"/>
+          </w:tcPr>
+          <w:p>
+            <w:pPr>
+              <w:spacing w:line="276" w:lineRule="auto"/>
+              <w:jc w:val="right"/>
+              <w:rPr>
+                <w:rtl/>
+              </w:rPr>
+            </w:pPr>
+            <w:r>
+              <w:rPr>
+                <w:rFonts w:ascii="Arial" w:hAnsi="Arial" w:cs="Arial"/>
+                <w:sz w:val="20"/>
+                <w:szCs w:val="20"/>
+              </w:rPr>
+              <w:t>P1.3</w:t>
+            </w:r>
+          </w:p>
+        </w:tc>
+        <w:tc>
+          <w:tcPr>
+            <w:tcW w:w="2004" w:type="dxa"/>
+            <w:vAlign w:val="center"/>
+          </w:tcPr>
+          <w:p>
+            <w:pPr>
+              <w:spacing w:line="276" w:lineRule="auto"/>
+              <w:jc w:val="right"/>
+              <w:rPr>
+                <w:rtl/>
+              </w:rPr>
+            </w:pPr>
+            <w:r>
+              <w:rPr>
+                <w:rFonts w:ascii="Arial" w:hAnsi="Arial" w:cs="Arial"/>
+                <w:sz w:val="20"/>
+                <w:szCs w:val="20"/>
+              </w:rPr>
+              <w:t>Payment Detail</w:t>
+            </w:r>
+          </w:p>
+        </w:tc>
+      </w:tr>
+      <w:tr>
+        <w:trPr>
+          <w:trHeight w:val="364"/>
+        </w:trPr>
+        <w:tc>
+          <w:tcPr>
+            <w:tcW w:w="2423" w:type="dxa"/>
+            <w:vAlign w:val="center"/>
+          </w:tcPr>
+          <w:p>
+            <w:pPr>
+              <w:spacing w:line="276" w:lineRule="auto"/>
+              <w:jc w:val="right"/>
+              <w:rPr>
+                <w:rtl/>
+              </w:rPr>
+            </w:pPr>
+            <w:r>
+              <w:rPr>
+                <w:rFonts w:ascii="Arial" w:hAnsi="Arial" w:cs="Arial"/>
+                <w:sz w:val="20"/>
+                <w:szCs w:val="20"/>
+              </w:rPr>
+              <w:t>SQL UPDATE Query</w:t>
+            </w:r>
+          </w:p>
+        </w:tc>
+        <w:tc>
+          <w:tcPr>
+            <w:tcW w:w="3247" w:type="dxa"/>
+            <w:vAlign w:val="center"/>
+          </w:tcPr>
+          <w:p>
+            <w:pPr>
+              <w:spacing w:line="276" w:lineRule="auto"/>
+              <w:jc w:val="right"/>
+              <w:rPr>
+                <w:rtl/>
+              </w:rPr>
+            </w:pPr>
+            <w:proofErr w:type="spellStart"/>
+            <w:r>
+              <w:rPr>
+                <w:rFonts w:ascii="Arial" w:hAnsi="Arial" w:cs="Arial"/>
+                <w:sz w:val="20"/>
+                <w:szCs w:val="20"/>
+              </w:rPr>
+              <w:t>amountPaid</w:t>
+            </w:r>
+            <w:proofErr w:type="spellEnd"/>
+            <w:r>
+              <w:rPr>
+                <w:rFonts w:ascii="Arial" w:hAnsi="Arial" w:cs="Arial"/>
+                <w:sz w:val="20"/>
+                <w:szCs w:val="20"/>
+              </w:rPr>
+              <w:t xml:space="preserve">, </w:t>
+            </w:r>
+            <w:proofErr w:type="spellStart"/>
+            <w:r>
+              <w:rPr>
+                <w:rFonts w:ascii="Arial" w:hAnsi="Arial" w:cs="Arial"/>
+                <w:sz w:val="20"/>
+                <w:szCs w:val="20"/>
+              </w:rPr>
+              <w:t>endTime</w:t>
+            </w:r>
+            <w:proofErr w:type="spellEnd"/>
+          </w:p>
+        </w:tc>
+        <w:tc>
+          <w:tcPr>
+            <w:tcW w:w="1710" w:type="dxa"/>
+            <w:vAlign w:val="center"/>
+          </w:tcPr>
+          <w:p>
+            <w:pPr>
+              <w:spacing w:line="276" w:lineRule="auto"/>
+              <w:jc w:val="right"/>
+              <w:rPr>
+                <w:rtl/>
+              </w:rPr>
+            </w:pPr>
+            <w:r>
+              <w:rPr>
+                <w:rFonts w:ascii="Arial" w:hAnsi="Arial" w:cs="Arial"/>
+                <w:sz w:val="20"/>
+                <w:szCs w:val="20"/>
+              </w:rPr>
+              <w:t>D2 Operations</w:t>
+            </w:r>
+          </w:p>
+        </w:tc>
+        <w:tc>
+          <w:tcPr>
+            <w:tcW w:w="1053" w:type="dxa"/>
+            <w:vAlign w:val="center"/>
+          </w:tcPr>
+          <w:p>
+            <w:pPr>
+              <w:spacing w:line="276" w:lineRule="auto"/>
+              <w:jc w:val="right"/>
+              <w:rPr>
+                <w:rtl/>
+              </w:rPr>
+            </w:pPr>
+            <w:r>
+              <w:rPr>
+                <w:rFonts w:ascii="Arial" w:hAnsi="Arial" w:cs="Arial"/>
+                <w:sz w:val="20"/>
+                <w:szCs w:val="20"/>
+              </w:rPr>
+              <w:t>P1.4</w:t>
+            </w:r>
+          </w:p>
+        </w:tc>
+        <w:tc>
+          <w:tcPr>
+            <w:tcW w:w="2004" w:type="dxa"/>
+            <w:vAlign w:val="center"/>
+          </w:tcPr>
+          <w:p>
+            <w:pPr>
+              <w:spacing w:line="276" w:lineRule="auto"/>
+              <w:jc w:val="right"/>
+              <w:rPr>
+                <w:rtl/>
+              </w:rPr>
+            </w:pPr>
+            <w:r>
+              <w:rPr>
+                <w:rFonts w:ascii="Arial" w:hAnsi="Arial" w:cs="Arial"/>
+                <w:sz w:val="20"/>
+                <w:szCs w:val="20"/>
+              </w:rPr>
+              <w:t>Update Paid Amount</w:t>
+            </w:r>
+          </w:p>
+        </w:tc>
+      </w:tr>
+    </w:tbl>
+    <w:p>
+      <w:pPr>
+        <w:spacing w:line="276" w:lineRule="auto"/>
+        <w:ind w:left="-483" w:right="-426"/>
+        <w:jc w:val="right"/>
+      </w:pPr>
+    </w:p>
     <w:sectPr>
       <w:headerReference w:type="default" r:id="rId10"/>
       <w:pgSz w:w="11906" w:h="16838"/>
-      <w:pgMar w:top="1440" w:right="1800" w:bottom="1440" w:left="1800" w:header="708" w:footer="708" w:gutter="0"/>
+      <w:pgMar w:top="1440" w:right="1800" w:bottom="1440" w:left="720" w:header="708" w:footer="708" w:gutter="0"/>
       <w:cols w:space="708"/>
       <w:bidi/>
       <w:rtlGutter/>
@@ -6647,6 +7652,30 @@
       <w:bCs/>
     </w:rPr>
   </w:style>
+  <w:style w:type="character" w:styleId="Strong">
+    <w:name w:val="Strong"/>
+    <w:basedOn w:val="DefaultParagraphFont"/>
+    <w:uiPriority w:val="22"/>
+    <w:qFormat/>
+    <w:rsid w:val="00DD29B0"/>
+    <w:rPr>
+      <w:b/>
+      <w:bCs/>
+    </w:rPr>
+  </w:style>
+  <w:style w:type="character" w:styleId="HTMLCode">
+    <w:name w:val="HTML Code"/>
+    <w:basedOn w:val="DefaultParagraphFont"/>
+    <w:uiPriority w:val="99"/>
+    <w:semiHidden/>
+    <w:unhideWhenUsed/>
+    <w:rsid w:val="00DD29B0"/>
+    <w:rPr>
+      <w:rFonts w:ascii="Courier New" w:eastAsia="Times New Roman" w:hAnsi="Courier New" w:cs="Courier New"/>
+      <w:sz w:val="20"/>
+      <w:szCs w:val="20"/>
+    </w:rPr>
+  </w:style>
 </w:styles>
 </file>
 

</xml_diff>

<commit_message>
lil fix of 2.2 2.3
</commit_message>
<xml_diff>
--- a/ex4_solution_2026_Ascendant/ex4_Ascendant.docx
+++ b/ex4_solution_2026_Ascendant/ex4_Ascendant.docx
@@ -5342,14 +5342,14 @@
       </w:pPr>
       <w:r>
         <w:rPr>
-          <w:rFonts w:asciiTheme="minorBidi" w:hAnsiTheme="minorBidi" w:hint="cs"/>
+          <w:rFonts w:asciiTheme="minorBidi" w:hAnsiTheme="minorBidi"/>
           <w:noProof/>
         </w:rPr>
         <w:drawing>
-          <wp:inline distT="0" distB="0" distL="0" distR="0" wp14:anchorId="310B7885" wp14:editId="27E08783">
-            <wp:extent cx="5274310" cy="4180840"/>
-            <wp:effectExtent l="0" t="0" r="0" b="0"/>
-            <wp:docPr id="1431570395" name="Picture 5"/>
+          <wp:inline distT="0" distB="0" distL="0" distR="0" wp14:anchorId="19D23BD1" wp14:editId="2FFDB263">
+            <wp:extent cx="5960110" cy="4724400"/>
+            <wp:effectExtent l="0" t="0" r="2540" b="0"/>
+            <wp:docPr id="378124357" name="Picture 3"/>
             <wp:cNvGraphicFramePr>
               <a:graphicFrameLocks xmlns:a="http://schemas.openxmlformats.org/drawingml/2006/main" noChangeAspect="1"/>
             </wp:cNvGraphicFramePr>
@@ -5357,7 +5357,7 @@
               <a:graphicData uri="http://schemas.openxmlformats.org/drawingml/2006/picture">
                 <pic:pic xmlns:pic="http://schemas.openxmlformats.org/drawingml/2006/picture">
                   <pic:nvPicPr>
-                    <pic:cNvPr id="1431570395" name="Picture 1431570395"/>
+                    <pic:cNvPr id="378124357" name="Picture 378124357"/>
                     <pic:cNvPicPr/>
                   </pic:nvPicPr>
                   <pic:blipFill>
@@ -5375,7 +5375,7 @@
                   <pic:spPr>
                     <a:xfrm>
                       <a:off x="0" y="0"/>
-                      <a:ext cx="5274310" cy="4180840"/>
+                      <a:ext cx="5960110" cy="4724400"/>
                     </a:xfrm>
                     <a:prstGeom prst="rect">
                       <a:avLst/>
@@ -5399,6 +5399,7 @@
         <w:rPr>
           <w:rFonts w:asciiTheme="minorBidi" w:hAnsiTheme="minorBidi"/>
         </w:rPr>
+        <w:lastRenderedPageBreak/>
         <w:br w:type="page"/>
       </w:r>
     </w:p>
@@ -5419,14 +5420,13 @@
       </w:pPr>
       <w:r>
         <w:rPr>
-          <w:rFonts w:hint="cs"/>
           <w:noProof/>
         </w:rPr>
         <w:drawing>
-          <wp:inline distT="0" distB="0" distL="0" distR="0" wp14:anchorId="2D1A4687" wp14:editId="4CF910D9">
-            <wp:extent cx="5761990" cy="4394679"/>
-            <wp:effectExtent l="0" t="0" r="0" b="0"/>
-            <wp:docPr id="2070656747" name="Picture 7"/>
+          <wp:inline distT="0" distB="0" distL="0" distR="0" wp14:anchorId="1F4ACF1D" wp14:editId="12E312CB">
+            <wp:extent cx="5960110" cy="4545330"/>
+            <wp:effectExtent l="0" t="0" r="2540" b="0"/>
+            <wp:docPr id="1341656890" name="Picture 2"/>
             <wp:cNvGraphicFramePr>
               <a:graphicFrameLocks xmlns:a="http://schemas.openxmlformats.org/drawingml/2006/main" noChangeAspect="1"/>
             </wp:cNvGraphicFramePr>
@@ -5434,7 +5434,7 @@
               <a:graphicData uri="http://schemas.openxmlformats.org/drawingml/2006/picture">
                 <pic:pic xmlns:pic="http://schemas.openxmlformats.org/drawingml/2006/picture">
                   <pic:nvPicPr>
-                    <pic:cNvPr id="2070656747" name="Picture 2070656747"/>
+                    <pic:cNvPr id="1341656890" name="Picture 1341656890"/>
                     <pic:cNvPicPr/>
                   </pic:nvPicPr>
                   <pic:blipFill>
@@ -5452,7 +5452,7 @@
                   <pic:spPr>
                     <a:xfrm>
                       <a:off x="0" y="0"/>
-                      <a:ext cx="5764896" cy="4396895"/>
+                      <a:ext cx="5960110" cy="4545330"/>
                     </a:xfrm>
                     <a:prstGeom prst="rect">
                       <a:avLst/>
@@ -6573,33 +6573,15 @@
                             </w:r>
                             <w:proofErr w:type="spellEnd"/>
                             <w:r>
-                              <w:t>("n</w:t>
-                            </w:r>
-                            <w:proofErr w:type="gramStart"/>
-                            <w:r>
-                              <w:t>",[</w:t>
+                              <w:t>("n",[</w:t>
                             </w:r>
                             <w:proofErr w:type="spellStart"/>
-                            <w:proofErr w:type="gramEnd"/>
                             <w:r>
                               <w:t>EntryTime</w:t>
                             </w:r>
                             <w:proofErr w:type="spellEnd"/>
-                            <w:proofErr w:type="gramStart"/>
                             <w:r>
-                              <w:t>],Now</w:t>
-                            </w:r>
-                            <w:proofErr w:type="gramEnd"/>
-                            <w:r>
-                              <w:t>(</w:t>
-                            </w:r>
-                            <w:proofErr w:type="gramStart"/>
-                            <w:r>
-                              <w:t>))*</w:t>
-                            </w:r>
-                            <w:proofErr w:type="gramEnd"/>
-                            <w:r>
-                              <w:t>[</w:t>
+                              <w:t>],Now())*[</w:t>
                             </w:r>
                             <w:proofErr w:type="spellStart"/>
                             <w:r>
@@ -6615,41 +6597,7 @@
                             </w:r>
                             <w:proofErr w:type="spellEnd"/>
                             <w:r>
-                              <w:t>("d</w:t>
-                            </w:r>
-                            <w:proofErr w:type="gramStart"/>
-                            <w:r>
-                              <w:t>",[</w:t>
-                            </w:r>
-                            <w:proofErr w:type="spellStart"/>
-                            <w:proofErr w:type="gramEnd"/>
-                            <w:r>
-                              <w:t>EntryTime</w:t>
-                            </w:r>
-                            <w:proofErr w:type="spellEnd"/>
-                            <w:proofErr w:type="gramStart"/>
-                            <w:r>
-                              <w:t>],Now</w:t>
-                            </w:r>
-                            <w:proofErr w:type="gramEnd"/>
-                            <w:r>
-                              <w:t>(</w:t>
-                            </w:r>
-                            <w:proofErr w:type="gramStart"/>
-                            <w:r>
-                              <w:t>))*</w:t>
-                            </w:r>
-                            <w:proofErr w:type="gramEnd"/>
-                            <w:r>
-                              <w:t>[</w:t>
-                            </w:r>
-                            <w:proofErr w:type="spellStart"/>
-                            <w:r>
-                              <w:t>availableSpaces</w:t>
-                            </w:r>
-                            <w:proofErr w:type="spellEnd"/>
-                            <w:r>
-                              <w:t>])</w:t>
+                              <w:t>("d",[EntryTime],Now())*[availableSpaces])</w:t>
                             </w:r>
                           </w:p>
                         </w:txbxContent>
@@ -6746,33 +6694,15 @@
                       </w:r>
                       <w:proofErr w:type="spellEnd"/>
                       <w:r>
-                        <w:t>("n</w:t>
-                      </w:r>
-                      <w:proofErr w:type="gramStart"/>
-                      <w:r>
-                        <w:t>",[</w:t>
+                        <w:t>("n",[</w:t>
                       </w:r>
                       <w:proofErr w:type="spellStart"/>
-                      <w:proofErr w:type="gramEnd"/>
                       <w:r>
                         <w:t>EntryTime</w:t>
                       </w:r>
                       <w:proofErr w:type="spellEnd"/>
-                      <w:proofErr w:type="gramStart"/>
                       <w:r>
-                        <w:t>],Now</w:t>
-                      </w:r>
-                      <w:proofErr w:type="gramEnd"/>
-                      <w:r>
-                        <w:t>(</w:t>
-                      </w:r>
-                      <w:proofErr w:type="gramStart"/>
-                      <w:r>
-                        <w:t>))*</w:t>
-                      </w:r>
-                      <w:proofErr w:type="gramEnd"/>
-                      <w:r>
-                        <w:t>[</w:t>
+                        <w:t>],Now())*[</w:t>
                       </w:r>
                       <w:proofErr w:type="spellStart"/>
                       <w:r>
@@ -6788,41 +6718,7 @@
                       </w:r>
                       <w:proofErr w:type="spellEnd"/>
                       <w:r>
-                        <w:t>("d</w:t>
-                      </w:r>
-                      <w:proofErr w:type="gramStart"/>
-                      <w:r>
-                        <w:t>",[</w:t>
-                      </w:r>
-                      <w:proofErr w:type="spellStart"/>
-                      <w:proofErr w:type="gramEnd"/>
-                      <w:r>
-                        <w:t>EntryTime</w:t>
-                      </w:r>
-                      <w:proofErr w:type="spellEnd"/>
-                      <w:proofErr w:type="gramStart"/>
-                      <w:r>
-                        <w:t>],Now</w:t>
-                      </w:r>
-                      <w:proofErr w:type="gramEnd"/>
-                      <w:r>
-                        <w:t>(</w:t>
-                      </w:r>
-                      <w:proofErr w:type="gramStart"/>
-                      <w:r>
-                        <w:t>))*</w:t>
-                      </w:r>
-                      <w:proofErr w:type="gramEnd"/>
-                      <w:r>
-                        <w:t>[</w:t>
-                      </w:r>
-                      <w:proofErr w:type="spellStart"/>
-                      <w:r>
-                        <w:t>availableSpaces</w:t>
-                      </w:r>
-                      <w:proofErr w:type="spellEnd"/>
-                      <w:r>
-                        <w:t>])</w:t>
+                        <w:t>("d",[EntryTime],Now())*[availableSpaces])</w:t>
                       </w:r>
                     </w:p>
                   </w:txbxContent>
@@ -6835,6 +6731,7 @@
       <w:r>
         <w:rPr>
           <w:rFonts w:cs="Arial"/>
+          <w:noProof/>
           <w:rtl/>
         </w:rPr>
         <w:drawing>
@@ -7554,6 +7451,7 @@
   <w:style w:type="character" w:default="1" w:styleId="DefaultParagraphFont">
     <w:name w:val="Default Paragraph Font"/>
     <w:uiPriority w:val="1"/>
+    <w:semiHidden/>
     <w:unhideWhenUsed/>
   </w:style>
   <w:style w:type="table" w:default="1" w:styleId="TableNormal">

</xml_diff>

<commit_message>
updated DrawIO file - need to add to word
fix dfd1 by discord record
recheck dfd 0
</commit_message>
<xml_diff>
--- a/ex4_solution_2026_Ascendant/ex4_Ascendant.docx
+++ b/ex4_solution_2026_Ascendant/ex4_Ascendant.docx
@@ -573,7 +573,7 @@
         <w:spacing w:line="276" w:lineRule="auto"/>
         <w:ind w:left="-483" w:right="-426" w:hanging="301"/>
         <w:rPr>
-          <w:rFonts w:asciiTheme="minorBidi" w:hAnsiTheme="minorBidi" w:hint="cs"/>
+          <w:rFonts w:asciiTheme="minorBidi" w:hAnsiTheme="minorBidi"/>
           <w:rtl/>
         </w:rPr>
       </w:pPr>
@@ -1583,7 +1583,7 @@
     </w:p>
     <w:p>
       <w:pPr>
-        <w:pStyle w:val="af4"/>
+        <w:pStyle w:val="NoSpacing"/>
         <w:rPr>
           <w:rtl/>
         </w:rPr>
@@ -1628,7 +1628,7 @@
     </w:p>
     <w:p>
       <w:pPr>
-        <w:pStyle w:val="af4"/>
+        <w:pStyle w:val="NoSpacing"/>
         <w:rPr>
           <w:rtl/>
         </w:rPr>
@@ -1636,7 +1636,7 @@
     </w:p>
     <w:tbl>
       <w:tblPr>
-        <w:tblStyle w:val="ae"/>
+        <w:tblStyle w:val="TableGrid"/>
         <w:bidiVisual/>
         <w:tblW w:w="0" w:type="auto"/>
         <w:tblLook w:val="04A0" w:firstRow="1" w:lastRow="0" w:firstColumn="1" w:lastColumn="0" w:noHBand="0" w:noVBand="1"/>
@@ -2477,7 +2477,7 @@
     </w:p>
     <w:p>
       <w:pPr>
-        <w:pStyle w:val="af4"/>
+        <w:pStyle w:val="NoSpacing"/>
         <w:rPr>
           <w:rtl/>
         </w:rPr>
@@ -2491,7 +2491,7 @@
     </w:p>
     <w:tbl>
       <w:tblPr>
-        <w:tblStyle w:val="ae"/>
+        <w:tblStyle w:val="TableGrid"/>
         <w:bidiVisual/>
         <w:tblW w:w="0" w:type="auto"/>
         <w:tblLook w:val="04A0" w:firstRow="1" w:lastRow="0" w:firstColumn="1" w:lastColumn="0" w:noHBand="0" w:noVBand="1"/>
@@ -3608,7 +3608,7 @@
     </w:p>
     <w:p>
       <w:pPr>
-        <w:pStyle w:val="af4"/>
+        <w:pStyle w:val="NoSpacing"/>
       </w:pPr>
       <w:r>
         <w:rPr>
@@ -3909,7 +3909,7 @@
     </w:p>
     <w:tbl>
       <w:tblPr>
-        <w:tblStyle w:val="ae"/>
+        <w:tblStyle w:val="TableGrid"/>
         <w:tblpPr w:leftFromText="180" w:rightFromText="180" w:vertAnchor="text" w:horzAnchor="margin" w:tblpXSpec="center" w:tblpY="58"/>
         <w:bidiVisual/>
         <w:tblW w:w="0" w:type="auto"/>
@@ -4697,6 +4697,7 @@
               </w:rPr>
               <w:t xml:space="preserve"> </w:t>
             </w:r>
+            <w:proofErr w:type="spellStart"/>
             <w:r>
               <w:rPr>
                 <w:rFonts w:asciiTheme="minorBidi" w:hAnsiTheme="minorBidi"/>
@@ -4706,6 +4707,7 @@
               </w:rPr>
               <w:t>ParkingLotID</w:t>
             </w:r>
+            <w:proofErr w:type="spellEnd"/>
             <w:r>
               <w:rPr>
                 <w:rFonts w:asciiTheme="minorBidi" w:hAnsiTheme="minorBidi"/>
@@ -5019,7 +5021,7 @@
             <w:pPr>
               <w:bidi w:val="0"/>
               <w:rPr>
-                <w:rFonts w:asciiTheme="minorBidi" w:hAnsiTheme="minorBidi" w:hint="cs"/>
+                <w:rFonts w:asciiTheme="minorBidi" w:hAnsiTheme="minorBidi"/>
                 <w:sz w:val="22"/>
                 <w:szCs w:val="22"/>
                 <w:rtl/>
@@ -5314,7 +5316,7 @@
     </w:p>
     <w:p>
       <w:pPr>
-        <w:pStyle w:val="af4"/>
+        <w:pStyle w:val="NoSpacing"/>
         <w:rPr>
           <w:rtl/>
         </w:rPr>
@@ -5329,7 +5331,7 @@
     </w:p>
     <w:tbl>
       <w:tblPr>
-        <w:tblStyle w:val="ae"/>
+        <w:tblStyle w:val="TableGrid"/>
         <w:bidiVisual/>
         <w:tblW w:w="0" w:type="auto"/>
         <w:tblBorders>
@@ -5875,7 +5877,7 @@
     </w:p>
     <w:p>
       <w:pPr>
-        <w:pStyle w:val="af4"/>
+        <w:pStyle w:val="NoSpacing"/>
       </w:pPr>
       <w:r>
         <w:rPr>
@@ -5894,6 +5896,7 @@
     </w:p>
     <w:p>
       <w:pPr>
+        <w:ind w:hanging="1054"/>
         <w:rPr>
           <w:rFonts w:asciiTheme="minorBidi" w:hAnsiTheme="minorBidi"/>
         </w:rPr>
@@ -5903,11 +5906,123 @@
           <w:rFonts w:asciiTheme="minorBidi" w:hAnsiTheme="minorBidi"/>
           <w:noProof/>
         </w:rPr>
+        <mc:AlternateContent>
+          <mc:Choice Requires="wps">
+            <w:drawing>
+              <wp:anchor distT="45720" distB="45720" distL="114300" distR="114300" simplePos="0" relativeHeight="251662336" behindDoc="0" locked="0" layoutInCell="1" allowOverlap="1" wp14:anchorId="1298477E" wp14:editId="715A754C">
+                <wp:simplePos x="0" y="0"/>
+                <wp:positionH relativeFrom="column">
+                  <wp:posOffset>4257675</wp:posOffset>
+                </wp:positionH>
+                <wp:positionV relativeFrom="paragraph">
+                  <wp:posOffset>1289050</wp:posOffset>
+                </wp:positionV>
+                <wp:extent cx="1003618" cy="276225"/>
+                <wp:effectExtent l="0" t="0" r="0" b="0"/>
+                <wp:wrapNone/>
+                <wp:docPr id="217" name="Text Box 2"/>
+                <wp:cNvGraphicFramePr>
+                  <a:graphicFrameLocks xmlns:a="http://schemas.openxmlformats.org/drawingml/2006/main"/>
+                </wp:cNvGraphicFramePr>
+                <a:graphic xmlns:a="http://schemas.openxmlformats.org/drawingml/2006/main">
+                  <a:graphicData uri="http://schemas.microsoft.com/office/word/2010/wordprocessingShape">
+                    <wps:wsp>
+                      <wps:cNvSpPr txBox="1">
+                        <a:spLocks noChangeArrowheads="1"/>
+                      </wps:cNvSpPr>
+                      <wps:spPr bwMode="auto">
+                        <a:xfrm>
+                          <a:off x="0" y="0"/>
+                          <a:ext cx="1003618" cy="276225"/>
+                        </a:xfrm>
+                        <a:prstGeom prst="rect">
+                          <a:avLst/>
+                        </a:prstGeom>
+                        <a:noFill/>
+                        <a:ln w="9525">
+                          <a:noFill/>
+                          <a:miter lim="800000"/>
+                          <a:headEnd/>
+                          <a:tailEnd/>
+                        </a:ln>
+                      </wps:spPr>
+                      <wps:txbx>
+                        <w:txbxContent>
+                          <w:p>
+                            <w:pPr>
+                              <w:shd w:val="clear" w:color="auto" w:fill="FFFFFF" w:themeFill="background1"/>
+                              <w:rPr>
+                                <w:sz w:val="20"/>
+                                <w:szCs w:val="20"/>
+                              </w:rPr>
+                            </w:pPr>
+                            <w:r>
+                              <w:rPr>
+                                <w:sz w:val="20"/>
+                                <w:szCs w:val="20"/>
+                              </w:rPr>
+                              <w:t>license plate</w:t>
+                            </w:r>
+                          </w:p>
+                        </w:txbxContent>
+                      </wps:txbx>
+                      <wps:bodyPr rot="0" vert="horz" wrap="square" lIns="91440" tIns="45720" rIns="91440" bIns="45720" anchor="t" anchorCtr="0">
+                        <a:noAutofit/>
+                      </wps:bodyPr>
+                    </wps:wsp>
+                  </a:graphicData>
+                </a:graphic>
+                <wp14:sizeRelH relativeFrom="margin">
+                  <wp14:pctWidth>0</wp14:pctWidth>
+                </wp14:sizeRelH>
+                <wp14:sizeRelV relativeFrom="margin">
+                  <wp14:pctHeight>0</wp14:pctHeight>
+                </wp14:sizeRelV>
+              </wp:anchor>
+            </w:drawing>
+          </mc:Choice>
+          <mc:Fallback>
+            <w:pict>
+              <v:shapetype w14:anchorId="1298477E" id="_x0000_t202" coordsize="21600,21600" o:spt="202" path="m,l,21600r21600,l21600,xe">
+                <v:stroke joinstyle="miter"/>
+                <v:path gradientshapeok="t" o:connecttype="rect"/>
+              </v:shapetype>
+              <v:shape id="Text Box 2" o:spid="_x0000_s1026" type="#_x0000_t202" style="position:absolute;left:0;text-align:left;margin-left:335.25pt;margin-top:101.5pt;width:79.05pt;height:21.75pt;z-index:251662336;visibility:visible;mso-wrap-style:square;mso-width-percent:0;mso-height-percent:0;mso-wrap-distance-left:9pt;mso-wrap-distance-top:3.6pt;mso-wrap-distance-right:9pt;mso-wrap-distance-bottom:3.6pt;mso-position-horizontal:absolute;mso-position-horizontal-relative:text;mso-position-vertical:absolute;mso-position-vertical-relative:text;mso-width-percent:0;mso-height-percent:0;mso-width-relative:margin;mso-height-relative:margin;v-text-anchor:top" o:gfxdata="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" filled="f" stroked="f">
+                <v:textbox>
+                  <w:txbxContent>
+                    <w:p>
+                      <w:pPr>
+                        <w:shd w:val="clear" w:color="auto" w:fill="FFFFFF" w:themeFill="background1"/>
+                        <w:rPr>
+                          <w:sz w:val="20"/>
+                          <w:szCs w:val="20"/>
+                        </w:rPr>
+                      </w:pPr>
+                      <w:r>
+                        <w:rPr>
+                          <w:sz w:val="20"/>
+                          <w:szCs w:val="20"/>
+                        </w:rPr>
+                        <w:t>license plate</w:t>
+                      </w:r>
+                    </w:p>
+                  </w:txbxContent>
+                </v:textbox>
+              </v:shape>
+            </w:pict>
+          </mc:Fallback>
+        </mc:AlternateContent>
+      </w:r>
+      <w:r>
+        <w:rPr>
+          <w:rFonts w:asciiTheme="minorBidi" w:hAnsiTheme="minorBidi"/>
+          <w:noProof/>
+        </w:rPr>
         <w:drawing>
-          <wp:inline distT="0" distB="0" distL="0" distR="0" wp14:anchorId="19D23BD1" wp14:editId="2FFDB263">
-            <wp:extent cx="5960110" cy="4724400"/>
-            <wp:effectExtent l="0" t="0" r="2540" b="0"/>
-            <wp:docPr id="378124357" name="Picture 3"/>
+          <wp:inline distT="0" distB="0" distL="0" distR="0" wp14:anchorId="55D3E143" wp14:editId="06245CEA">
+            <wp:extent cx="6315794" cy="5006340"/>
+            <wp:effectExtent l="0" t="0" r="8890" b="3810"/>
+            <wp:docPr id="1198757393" name="Picture 2"/>
             <wp:cNvGraphicFramePr>
               <a:graphicFrameLocks xmlns:a="http://schemas.openxmlformats.org/drawingml/2006/main" noChangeAspect="1"/>
             </wp:cNvGraphicFramePr>
@@ -5915,7 +6030,7 @@
               <a:graphicData uri="http://schemas.openxmlformats.org/drawingml/2006/picture">
                 <pic:pic xmlns:pic="http://schemas.openxmlformats.org/drawingml/2006/picture">
                   <pic:nvPicPr>
-                    <pic:cNvPr id="378124357" name="Picture 378124357"/>
+                    <pic:cNvPr id="1198757393" name="Picture 1198757393"/>
                     <pic:cNvPicPr/>
                   </pic:nvPicPr>
                   <pic:blipFill>
@@ -5933,7 +6048,7 @@
                   <pic:spPr>
                     <a:xfrm>
                       <a:off x="0" y="0"/>
-                      <a:ext cx="5960110" cy="4724400"/>
+                      <a:ext cx="6323512" cy="5012458"/>
                     </a:xfrm>
                     <a:prstGeom prst="rect">
                       <a:avLst/>
@@ -5962,7 +6077,7 @@
     </w:p>
     <w:p>
       <w:pPr>
-        <w:pStyle w:val="af4"/>
+        <w:pStyle w:val="NoSpacing"/>
       </w:pPr>
       <w:r>
         <w:lastRenderedPageBreak/>
@@ -6038,7 +6153,7 @@
     </w:p>
     <w:p>
       <w:pPr>
-        <w:pStyle w:val="af4"/>
+        <w:pStyle w:val="NoSpacing"/>
       </w:pPr>
       <w:r>
         <w:lastRenderedPageBreak/>
@@ -6050,7 +6165,7 @@
     </w:p>
     <w:tbl>
       <w:tblPr>
-        <w:tblStyle w:val="ae"/>
+        <w:tblStyle w:val="TableGrid"/>
         <w:bidiVisual/>
         <w:tblW w:w="9445" w:type="dxa"/>
         <w:jc w:val="right"/>
@@ -7024,7 +7139,7 @@
     </w:tbl>
     <w:p>
       <w:pPr>
-        <w:pStyle w:val="af4"/>
+        <w:pStyle w:val="NoSpacing"/>
       </w:pPr>
       <w:r>
         <w:t xml:space="preserve"> </w:t>
@@ -7032,7 +7147,7 @@
     </w:p>
     <w:p>
       <w:pPr>
-        <w:pStyle w:val="af4"/>
+        <w:pStyle w:val="NoSpacing"/>
       </w:pPr>
       <w:r>
         <w:t>2.5</w:t>
@@ -7237,7 +7352,7 @@
                   <v:h position="#0,#1"/>
                 </v:handles>
               </v:shapetype>
-              <v:shape id="Speech Bubble: Rectangle 4" o:spid="_x0000_s1026" type="#_x0000_t61" style="position:absolute;left:0;text-align:left;margin-left:44.5pt;margin-top:296.5pt;width:320pt;height:53pt;z-index:251659264;visibility:visible;mso-wrap-style:square;mso-width-percent:0;mso-wrap-distance-left:9pt;mso-wrap-distance-top:0;mso-wrap-distance-right:9pt;mso-wrap-distance-bottom:0;mso-position-horizontal:absolute;mso-position-horizontal-relative:text;mso-position-vertical:absolute;mso-position-vertical-relative:text;mso-width-percent:0;mso-width-relative:margin;v-text-anchor:middle" o:gfxdata="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" adj="8504,-22364" fillcolor="#ed412f" strokecolor="black [3213]">
+              <v:shape id="Speech Bubble: Rectangle 4" o:spid="_x0000_s1027" type="#_x0000_t61" style="position:absolute;left:0;text-align:left;margin-left:44.5pt;margin-top:296.5pt;width:320pt;height:53pt;z-index:251659264;visibility:visible;mso-wrap-style:square;mso-width-percent:0;mso-wrap-distance-left:9pt;mso-wrap-distance-top:0;mso-wrap-distance-right:9pt;mso-wrap-distance-bottom:0;mso-position-horizontal:absolute;mso-position-horizontal-relative:text;mso-position-vertical:absolute;mso-position-vertical-relative:text;mso-width-percent:0;mso-width-relative:margin;v-text-anchor:middle" o:gfxdata="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" adj="8504,-22364" fillcolor="#ed412f" strokecolor="black [3213]">
                 <v:fill opacity="32639f"/>
                 <v:textbox>
                   <w:txbxContent>
@@ -7415,7 +7530,7 @@
 <w:hdr xmlns:wpc="http://schemas.microsoft.com/office/word/2010/wordprocessingCanvas" xmlns:cx="http://schemas.microsoft.com/office/drawing/2014/chartex" xmlns:cx1="http://schemas.microsoft.com/office/drawing/2015/9/8/chartex" xmlns:cx2="http://schemas.microsoft.com/office/drawing/2015/10/21/chartex" xmlns:cx3="http://schemas.microsoft.com/office/drawing/2016/5/9/chartex" xmlns:cx4="http://schemas.microsoft.com/office/drawing/2016/5/10/chartex" xmlns:cx5="http://schemas.microsoft.com/office/drawing/2016/5/11/chartex" xmlns:cx6="http://schemas.microsoft.com/office/drawing/2016/5/12/chartex" xmlns:cx7="http://schemas.microsoft.com/office/drawing/2016/5/13/chartex" xmlns:cx8="http://schemas.microsoft.com/office/drawing/2016/5/14/chartex" xmlns:mc="http://schemas.openxmlformats.org/markup-compatibility/2006" xmlns:aink="http://schemas.microsoft.com/office/drawing/2016/ink" xmlns:am3d="http://schemas.microsoft.com/office/drawing/2017/model3d" xmlns:o="urn:schemas-microsoft-com:office:office" xmlns:oel="http://schemas.microsoft.com/office/2019/extlst" xmlns:r="http://schemas.openxmlformats.org/officeDocument/2006/relationships" xmlns:m="http://schemas.openxmlformats.org/officeDocument/2006/math" xmlns:v="urn:schemas-microsoft-com:vml" xmlns:wp14="http://schemas.microsoft.com/office/word/2010/wordprocessingDrawing" xmlns:wp="http://schemas.openxmlformats.org/drawingml/2006/wordprocessingDrawing" xmlns:w10="urn:schemas-microsoft-com:office:word" xmlns:w="http://schemas.openxmlformats.org/wordprocessingml/2006/main" xmlns:w14="http://schemas.microsoft.com/office/word/2010/wordml" xmlns:w15="http://schemas.microsoft.com/office/word/2012/wordml" xmlns:w16cex="http://schemas.microsoft.com/office/word/2018/wordml/cex" xmlns:w16cid="http://schemas.microsoft.com/office/word/2016/wordml/cid" xmlns:w16="http://schemas.microsoft.com/office/word/2018/wordml" xmlns:w16du="http://schemas.microsoft.com/office/word/2023/wordml/word16du" xmlns:w16sdtdh="http://schemas.microsoft.com/office/word/2020/wordml/sdtdatahash" xmlns:w16sdtfl="http://schemas.microsoft.com/office/word/2024/wordml/sdtformatlock" xmlns:w16se="http://schemas.microsoft.com/office/word/2015/wordml/symex" xmlns:wpg="http://schemas.microsoft.com/office/word/2010/wordprocessingGroup" xmlns:wpi="http://schemas.microsoft.com/office/word/2010/wordprocessingInk" xmlns:wne="http://schemas.microsoft.com/office/word/2006/wordml" xmlns:wps="http://schemas.microsoft.com/office/word/2010/wordprocessingShape" mc:Ignorable="w14 w15 w16se w16cid w16 w16cex w16sdtdh w16sdtfl w16du wp14">
   <w:p>
     <w:pPr>
-      <w:pStyle w:val="af0"/>
+      <w:pStyle w:val="Header"/>
     </w:pPr>
     <w:r>
       <w:rPr>
@@ -7832,7 +7947,7 @@
     <w:lsdException w:name="Unresolved Mention" w:semiHidden="1" w:unhideWhenUsed="1"/>
     <w:lsdException w:name="Smart Link" w:semiHidden="1" w:unhideWhenUsed="1"/>
   </w:latentStyles>
-  <w:style w:type="paragraph" w:default="1" w:styleId="a">
+  <w:style w:type="paragraph" w:default="1" w:styleId="Normal">
     <w:name w:val="Normal"/>
     <w:qFormat/>
     <w:rsid w:val="00B30899"/>
@@ -7840,11 +7955,11 @@
       <w:bidi/>
     </w:pPr>
   </w:style>
-  <w:style w:type="paragraph" w:styleId="1">
+  <w:style w:type="paragraph" w:styleId="Heading1">
     <w:name w:val="heading 1"/>
-    <w:basedOn w:val="a"/>
-    <w:next w:val="a"/>
-    <w:link w:val="10"/>
+    <w:basedOn w:val="Normal"/>
+    <w:next w:val="Normal"/>
+    <w:link w:val="Heading1Char"/>
     <w:uiPriority w:val="9"/>
     <w:qFormat/>
     <w:rsid w:val="000836A0"/>
@@ -7861,11 +7976,11 @@
       <w:szCs w:val="40"/>
     </w:rPr>
   </w:style>
-  <w:style w:type="paragraph" w:styleId="2">
+  <w:style w:type="paragraph" w:styleId="Heading2">
     <w:name w:val="heading 2"/>
-    <w:basedOn w:val="a"/>
-    <w:next w:val="a"/>
-    <w:link w:val="20"/>
+    <w:basedOn w:val="Normal"/>
+    <w:next w:val="Normal"/>
+    <w:link w:val="Heading2Char"/>
     <w:uiPriority w:val="9"/>
     <w:semiHidden/>
     <w:unhideWhenUsed/>
@@ -7884,11 +7999,11 @@
       <w:szCs w:val="32"/>
     </w:rPr>
   </w:style>
-  <w:style w:type="paragraph" w:styleId="3">
+  <w:style w:type="paragraph" w:styleId="Heading3">
     <w:name w:val="heading 3"/>
-    <w:basedOn w:val="a"/>
-    <w:next w:val="a"/>
-    <w:link w:val="30"/>
+    <w:basedOn w:val="Normal"/>
+    <w:next w:val="Normal"/>
+    <w:link w:val="Heading3Char"/>
     <w:uiPriority w:val="9"/>
     <w:semiHidden/>
     <w:unhideWhenUsed/>
@@ -7907,11 +8022,11 @@
       <w:szCs w:val="28"/>
     </w:rPr>
   </w:style>
-  <w:style w:type="paragraph" w:styleId="4">
+  <w:style w:type="paragraph" w:styleId="Heading4">
     <w:name w:val="heading 4"/>
-    <w:basedOn w:val="a"/>
-    <w:next w:val="a"/>
-    <w:link w:val="40"/>
+    <w:basedOn w:val="Normal"/>
+    <w:next w:val="Normal"/>
+    <w:link w:val="Heading4Char"/>
     <w:uiPriority w:val="9"/>
     <w:semiHidden/>
     <w:unhideWhenUsed/>
@@ -7930,11 +8045,11 @@
       <w:color w:val="0F4761" w:themeColor="accent1" w:themeShade="BF"/>
     </w:rPr>
   </w:style>
-  <w:style w:type="paragraph" w:styleId="5">
+  <w:style w:type="paragraph" w:styleId="Heading5">
     <w:name w:val="heading 5"/>
-    <w:basedOn w:val="a"/>
-    <w:next w:val="a"/>
-    <w:link w:val="50"/>
+    <w:basedOn w:val="Normal"/>
+    <w:next w:val="Normal"/>
+    <w:link w:val="Heading5Char"/>
     <w:uiPriority w:val="9"/>
     <w:semiHidden/>
     <w:unhideWhenUsed/>
@@ -7951,11 +8066,11 @@
       <w:color w:val="0F4761" w:themeColor="accent1" w:themeShade="BF"/>
     </w:rPr>
   </w:style>
-  <w:style w:type="paragraph" w:styleId="6">
+  <w:style w:type="paragraph" w:styleId="Heading6">
     <w:name w:val="heading 6"/>
-    <w:basedOn w:val="a"/>
-    <w:next w:val="a"/>
-    <w:link w:val="60"/>
+    <w:basedOn w:val="Normal"/>
+    <w:next w:val="Normal"/>
+    <w:link w:val="Heading6Char"/>
     <w:uiPriority w:val="9"/>
     <w:semiHidden/>
     <w:unhideWhenUsed/>
@@ -7974,11 +8089,11 @@
       <w:color w:val="595959" w:themeColor="text1" w:themeTint="A6"/>
     </w:rPr>
   </w:style>
-  <w:style w:type="paragraph" w:styleId="7">
+  <w:style w:type="paragraph" w:styleId="Heading7">
     <w:name w:val="heading 7"/>
-    <w:basedOn w:val="a"/>
-    <w:next w:val="a"/>
-    <w:link w:val="70"/>
+    <w:basedOn w:val="Normal"/>
+    <w:next w:val="Normal"/>
+    <w:link w:val="Heading7Char"/>
     <w:uiPriority w:val="9"/>
     <w:semiHidden/>
     <w:unhideWhenUsed/>
@@ -7995,11 +8110,11 @@
       <w:color w:val="595959" w:themeColor="text1" w:themeTint="A6"/>
     </w:rPr>
   </w:style>
-  <w:style w:type="paragraph" w:styleId="8">
+  <w:style w:type="paragraph" w:styleId="Heading8">
     <w:name w:val="heading 8"/>
-    <w:basedOn w:val="a"/>
-    <w:next w:val="a"/>
-    <w:link w:val="80"/>
+    <w:basedOn w:val="Normal"/>
+    <w:next w:val="Normal"/>
+    <w:link w:val="Heading8Char"/>
     <w:uiPriority w:val="9"/>
     <w:semiHidden/>
     <w:unhideWhenUsed/>
@@ -8017,11 +8132,11 @@
       <w:color w:val="272727" w:themeColor="text1" w:themeTint="D8"/>
     </w:rPr>
   </w:style>
-  <w:style w:type="paragraph" w:styleId="9">
+  <w:style w:type="paragraph" w:styleId="Heading9">
     <w:name w:val="heading 9"/>
-    <w:basedOn w:val="a"/>
-    <w:next w:val="a"/>
-    <w:link w:val="90"/>
+    <w:basedOn w:val="Normal"/>
+    <w:next w:val="Normal"/>
+    <w:link w:val="Heading9Char"/>
     <w:uiPriority w:val="9"/>
     <w:semiHidden/>
     <w:unhideWhenUsed/>
@@ -8037,13 +8152,12 @@
       <w:color w:val="272727" w:themeColor="text1" w:themeTint="D8"/>
     </w:rPr>
   </w:style>
-  <w:style w:type="character" w:default="1" w:styleId="a0">
+  <w:style w:type="character" w:default="1" w:styleId="DefaultParagraphFont">
     <w:name w:val="Default Paragraph Font"/>
     <w:uiPriority w:val="1"/>
-    <w:semiHidden/>
     <w:unhideWhenUsed/>
   </w:style>
-  <w:style w:type="table" w:default="1" w:styleId="a1">
+  <w:style w:type="table" w:default="1" w:styleId="TableNormal">
     <w:name w:val="Normal Table"/>
     <w:uiPriority w:val="99"/>
     <w:semiHidden/>
@@ -8058,16 +8172,16 @@
       </w:tblCellMar>
     </w:tblPr>
   </w:style>
-  <w:style w:type="numbering" w:default="1" w:styleId="a2">
+  <w:style w:type="numbering" w:default="1" w:styleId="NoList">
     <w:name w:val="No List"/>
     <w:uiPriority w:val="99"/>
     <w:semiHidden/>
     <w:unhideWhenUsed/>
   </w:style>
-  <w:style w:type="character" w:customStyle="1" w:styleId="10">
-    <w:name w:val="כותרת 1 תו"/>
-    <w:basedOn w:val="a0"/>
-    <w:link w:val="1"/>
+  <w:style w:type="character" w:customStyle="1" w:styleId="Heading1Char">
+    <w:name w:val="Heading 1 Char"/>
+    <w:basedOn w:val="DefaultParagraphFont"/>
+    <w:link w:val="Heading1"/>
     <w:uiPriority w:val="9"/>
     <w:rsid w:val="000836A0"/>
     <w:rPr>
@@ -8077,10 +8191,10 @@
       <w:szCs w:val="40"/>
     </w:rPr>
   </w:style>
-  <w:style w:type="character" w:customStyle="1" w:styleId="20">
-    <w:name w:val="כותרת 2 תו"/>
-    <w:basedOn w:val="a0"/>
-    <w:link w:val="2"/>
+  <w:style w:type="character" w:customStyle="1" w:styleId="Heading2Char">
+    <w:name w:val="Heading 2 Char"/>
+    <w:basedOn w:val="DefaultParagraphFont"/>
+    <w:link w:val="Heading2"/>
     <w:uiPriority w:val="9"/>
     <w:semiHidden/>
     <w:rsid w:val="000836A0"/>
@@ -8091,10 +8205,10 @@
       <w:szCs w:val="32"/>
     </w:rPr>
   </w:style>
-  <w:style w:type="character" w:customStyle="1" w:styleId="30">
-    <w:name w:val="כותרת 3 תו"/>
-    <w:basedOn w:val="a0"/>
-    <w:link w:val="3"/>
+  <w:style w:type="character" w:customStyle="1" w:styleId="Heading3Char">
+    <w:name w:val="Heading 3 Char"/>
+    <w:basedOn w:val="DefaultParagraphFont"/>
+    <w:link w:val="Heading3"/>
     <w:uiPriority w:val="9"/>
     <w:semiHidden/>
     <w:rsid w:val="000836A0"/>
@@ -8105,10 +8219,10 @@
       <w:szCs w:val="28"/>
     </w:rPr>
   </w:style>
-  <w:style w:type="character" w:customStyle="1" w:styleId="40">
-    <w:name w:val="כותרת 4 תו"/>
-    <w:basedOn w:val="a0"/>
-    <w:link w:val="4"/>
+  <w:style w:type="character" w:customStyle="1" w:styleId="Heading4Char">
+    <w:name w:val="Heading 4 Char"/>
+    <w:basedOn w:val="DefaultParagraphFont"/>
+    <w:link w:val="Heading4"/>
     <w:uiPriority w:val="9"/>
     <w:semiHidden/>
     <w:rsid w:val="000836A0"/>
@@ -8119,10 +8233,10 @@
       <w:color w:val="0F4761" w:themeColor="accent1" w:themeShade="BF"/>
     </w:rPr>
   </w:style>
-  <w:style w:type="character" w:customStyle="1" w:styleId="50">
-    <w:name w:val="כותרת 5 תו"/>
-    <w:basedOn w:val="a0"/>
-    <w:link w:val="5"/>
+  <w:style w:type="character" w:customStyle="1" w:styleId="Heading5Char">
+    <w:name w:val="Heading 5 Char"/>
+    <w:basedOn w:val="DefaultParagraphFont"/>
+    <w:link w:val="Heading5"/>
     <w:uiPriority w:val="9"/>
     <w:semiHidden/>
     <w:rsid w:val="000836A0"/>
@@ -8131,10 +8245,10 @@
       <w:color w:val="0F4761" w:themeColor="accent1" w:themeShade="BF"/>
     </w:rPr>
   </w:style>
-  <w:style w:type="character" w:customStyle="1" w:styleId="60">
-    <w:name w:val="כותרת 6 תו"/>
-    <w:basedOn w:val="a0"/>
-    <w:link w:val="6"/>
+  <w:style w:type="character" w:customStyle="1" w:styleId="Heading6Char">
+    <w:name w:val="Heading 6 Char"/>
+    <w:basedOn w:val="DefaultParagraphFont"/>
+    <w:link w:val="Heading6"/>
     <w:uiPriority w:val="9"/>
     <w:semiHidden/>
     <w:rsid w:val="000836A0"/>
@@ -8145,10 +8259,10 @@
       <w:color w:val="595959" w:themeColor="text1" w:themeTint="A6"/>
     </w:rPr>
   </w:style>
-  <w:style w:type="character" w:customStyle="1" w:styleId="70">
-    <w:name w:val="כותרת 7 תו"/>
-    <w:basedOn w:val="a0"/>
-    <w:link w:val="7"/>
+  <w:style w:type="character" w:customStyle="1" w:styleId="Heading7Char">
+    <w:name w:val="Heading 7 Char"/>
+    <w:basedOn w:val="DefaultParagraphFont"/>
+    <w:link w:val="Heading7"/>
     <w:uiPriority w:val="9"/>
     <w:semiHidden/>
     <w:rsid w:val="000836A0"/>
@@ -8157,10 +8271,10 @@
       <w:color w:val="595959" w:themeColor="text1" w:themeTint="A6"/>
     </w:rPr>
   </w:style>
-  <w:style w:type="character" w:customStyle="1" w:styleId="80">
-    <w:name w:val="כותרת 8 תו"/>
-    <w:basedOn w:val="a0"/>
-    <w:link w:val="8"/>
+  <w:style w:type="character" w:customStyle="1" w:styleId="Heading8Char">
+    <w:name w:val="Heading 8 Char"/>
+    <w:basedOn w:val="DefaultParagraphFont"/>
+    <w:link w:val="Heading8"/>
     <w:uiPriority w:val="9"/>
     <w:semiHidden/>
     <w:rsid w:val="000836A0"/>
@@ -8171,10 +8285,10 @@
       <w:color w:val="272727" w:themeColor="text1" w:themeTint="D8"/>
     </w:rPr>
   </w:style>
-  <w:style w:type="character" w:customStyle="1" w:styleId="90">
-    <w:name w:val="כותרת 9 תו"/>
-    <w:basedOn w:val="a0"/>
-    <w:link w:val="9"/>
+  <w:style w:type="character" w:customStyle="1" w:styleId="Heading9Char">
+    <w:name w:val="Heading 9 Char"/>
+    <w:basedOn w:val="DefaultParagraphFont"/>
+    <w:link w:val="Heading9"/>
     <w:uiPriority w:val="9"/>
     <w:semiHidden/>
     <w:rsid w:val="000836A0"/>
@@ -8183,11 +8297,11 @@
       <w:color w:val="272727" w:themeColor="text1" w:themeTint="D8"/>
     </w:rPr>
   </w:style>
-  <w:style w:type="paragraph" w:styleId="a3">
+  <w:style w:type="paragraph" w:styleId="Title">
     <w:name w:val="Title"/>
-    <w:basedOn w:val="a"/>
-    <w:next w:val="a"/>
-    <w:link w:val="a4"/>
+    <w:basedOn w:val="Normal"/>
+    <w:next w:val="Normal"/>
+    <w:link w:val="TitleChar"/>
     <w:uiPriority w:val="10"/>
     <w:qFormat/>
     <w:rsid w:val="000836A0"/>
@@ -8203,10 +8317,10 @@
       <w:szCs w:val="56"/>
     </w:rPr>
   </w:style>
-  <w:style w:type="character" w:customStyle="1" w:styleId="a4">
-    <w:name w:val="כותרת טקסט תו"/>
-    <w:basedOn w:val="a0"/>
-    <w:link w:val="a3"/>
+  <w:style w:type="character" w:customStyle="1" w:styleId="TitleChar">
+    <w:name w:val="Title Char"/>
+    <w:basedOn w:val="DefaultParagraphFont"/>
+    <w:link w:val="Title"/>
     <w:uiPriority w:val="10"/>
     <w:rsid w:val="000836A0"/>
     <w:rPr>
@@ -8217,11 +8331,11 @@
       <w:szCs w:val="56"/>
     </w:rPr>
   </w:style>
-  <w:style w:type="paragraph" w:styleId="a5">
+  <w:style w:type="paragraph" w:styleId="Subtitle">
     <w:name w:val="Subtitle"/>
-    <w:basedOn w:val="a"/>
-    <w:next w:val="a"/>
-    <w:link w:val="a6"/>
+    <w:basedOn w:val="Normal"/>
+    <w:next w:val="Normal"/>
+    <w:link w:val="SubtitleChar"/>
     <w:uiPriority w:val="11"/>
     <w:qFormat/>
     <w:rsid w:val="000836A0"/>
@@ -8239,10 +8353,10 @@
       <w:szCs w:val="28"/>
     </w:rPr>
   </w:style>
-  <w:style w:type="character" w:customStyle="1" w:styleId="a6">
-    <w:name w:val="כותרת משנה תו"/>
-    <w:basedOn w:val="a0"/>
-    <w:link w:val="a5"/>
+  <w:style w:type="character" w:customStyle="1" w:styleId="SubtitleChar">
+    <w:name w:val="Subtitle Char"/>
+    <w:basedOn w:val="DefaultParagraphFont"/>
+    <w:link w:val="Subtitle"/>
     <w:uiPriority w:val="11"/>
     <w:rsid w:val="000836A0"/>
     <w:rPr>
@@ -8253,11 +8367,11 @@
       <w:szCs w:val="28"/>
     </w:rPr>
   </w:style>
-  <w:style w:type="paragraph" w:styleId="a7">
+  <w:style w:type="paragraph" w:styleId="Quote">
     <w:name w:val="Quote"/>
-    <w:basedOn w:val="a"/>
-    <w:next w:val="a"/>
-    <w:link w:val="a8"/>
+    <w:basedOn w:val="Normal"/>
+    <w:next w:val="Normal"/>
+    <w:link w:val="QuoteChar"/>
     <w:uiPriority w:val="29"/>
     <w:qFormat/>
     <w:rsid w:val="000836A0"/>
@@ -8271,10 +8385,10 @@
       <w:color w:val="404040" w:themeColor="text1" w:themeTint="BF"/>
     </w:rPr>
   </w:style>
-  <w:style w:type="character" w:customStyle="1" w:styleId="a8">
-    <w:name w:val="ציטוט תו"/>
-    <w:basedOn w:val="a0"/>
-    <w:link w:val="a7"/>
+  <w:style w:type="character" w:customStyle="1" w:styleId="QuoteChar">
+    <w:name w:val="Quote Char"/>
+    <w:basedOn w:val="DefaultParagraphFont"/>
+    <w:link w:val="Quote"/>
     <w:uiPriority w:val="29"/>
     <w:rsid w:val="000836A0"/>
     <w:rPr>
@@ -8283,9 +8397,9 @@
       <w:color w:val="404040" w:themeColor="text1" w:themeTint="BF"/>
     </w:rPr>
   </w:style>
-  <w:style w:type="paragraph" w:styleId="a9">
+  <w:style w:type="paragraph" w:styleId="ListParagraph">
     <w:name w:val="List Paragraph"/>
-    <w:basedOn w:val="a"/>
+    <w:basedOn w:val="Normal"/>
     <w:uiPriority w:val="34"/>
     <w:qFormat/>
     <w:rsid w:val="000836A0"/>
@@ -8294,9 +8408,9 @@
       <w:contextualSpacing/>
     </w:pPr>
   </w:style>
-  <w:style w:type="character" w:styleId="aa">
+  <w:style w:type="character" w:styleId="IntenseEmphasis">
     <w:name w:val="Intense Emphasis"/>
-    <w:basedOn w:val="a0"/>
+    <w:basedOn w:val="DefaultParagraphFont"/>
     <w:uiPriority w:val="21"/>
     <w:qFormat/>
     <w:rsid w:val="000836A0"/>
@@ -8306,11 +8420,11 @@
       <w:color w:val="0F4761" w:themeColor="accent1" w:themeShade="BF"/>
     </w:rPr>
   </w:style>
-  <w:style w:type="paragraph" w:styleId="ab">
+  <w:style w:type="paragraph" w:styleId="IntenseQuote">
     <w:name w:val="Intense Quote"/>
-    <w:basedOn w:val="a"/>
-    <w:next w:val="a"/>
-    <w:link w:val="ac"/>
+    <w:basedOn w:val="Normal"/>
+    <w:next w:val="Normal"/>
+    <w:link w:val="IntenseQuoteChar"/>
     <w:uiPriority w:val="30"/>
     <w:qFormat/>
     <w:rsid w:val="000836A0"/>
@@ -8329,10 +8443,10 @@
       <w:color w:val="0F4761" w:themeColor="accent1" w:themeShade="BF"/>
     </w:rPr>
   </w:style>
-  <w:style w:type="character" w:customStyle="1" w:styleId="ac">
-    <w:name w:val="ציטוט חזק תו"/>
-    <w:basedOn w:val="a0"/>
-    <w:link w:val="ab"/>
+  <w:style w:type="character" w:customStyle="1" w:styleId="IntenseQuoteChar">
+    <w:name w:val="Intense Quote Char"/>
+    <w:basedOn w:val="DefaultParagraphFont"/>
+    <w:link w:val="IntenseQuote"/>
     <w:uiPriority w:val="30"/>
     <w:rsid w:val="000836A0"/>
     <w:rPr>
@@ -8341,9 +8455,9 @@
       <w:color w:val="0F4761" w:themeColor="accent1" w:themeShade="BF"/>
     </w:rPr>
   </w:style>
-  <w:style w:type="character" w:styleId="ad">
+  <w:style w:type="character" w:styleId="IntenseReference">
     <w:name w:val="Intense Reference"/>
-    <w:basedOn w:val="a0"/>
+    <w:basedOn w:val="DefaultParagraphFont"/>
     <w:uiPriority w:val="32"/>
     <w:qFormat/>
     <w:rsid w:val="000836A0"/>
@@ -8355,9 +8469,9 @@
       <w:spacing w:val="5"/>
     </w:rPr>
   </w:style>
-  <w:style w:type="table" w:styleId="ae">
+  <w:style w:type="table" w:styleId="TableGrid">
     <w:name w:val="Table Grid"/>
-    <w:basedOn w:val="a1"/>
+    <w:basedOn w:val="TableNormal"/>
     <w:uiPriority w:val="39"/>
     <w:rsid w:val="003C31F0"/>
     <w:tblPr>
@@ -8371,9 +8485,9 @@
       </w:tblBorders>
     </w:tblPr>
   </w:style>
-  <w:style w:type="table" w:styleId="31">
+  <w:style w:type="table" w:styleId="PlainTable3">
     <w:name w:val="Plain Table 3"/>
-    <w:basedOn w:val="a1"/>
+    <w:basedOn w:val="TableNormal"/>
     <w:uiPriority w:val="43"/>
     <w:rsid w:val="003C31F0"/>
     <w:tblPr>
@@ -8461,9 +8575,9 @@
       </w:tcPr>
     </w:tblStylePr>
   </w:style>
-  <w:style w:type="table" w:styleId="af">
+  <w:style w:type="table" w:styleId="TableGridLight">
     <w:name w:val="Grid Table Light"/>
-    <w:basedOn w:val="a1"/>
+    <w:basedOn w:val="TableNormal"/>
     <w:uiPriority w:val="40"/>
     <w:rsid w:val="003C31F0"/>
     <w:tblPr>
@@ -8477,10 +8591,10 @@
       </w:tblBorders>
     </w:tblPr>
   </w:style>
-  <w:style w:type="paragraph" w:styleId="af0">
+  <w:style w:type="paragraph" w:styleId="Header">
     <w:name w:val="header"/>
-    <w:basedOn w:val="a"/>
-    <w:link w:val="af1"/>
+    <w:basedOn w:val="Normal"/>
+    <w:link w:val="HeaderChar"/>
     <w:uiPriority w:val="99"/>
     <w:unhideWhenUsed/>
     <w:rsid w:val="001A5E4C"/>
@@ -8491,17 +8605,17 @@
       </w:tabs>
     </w:pPr>
   </w:style>
-  <w:style w:type="character" w:customStyle="1" w:styleId="af1">
-    <w:name w:val="כותרת עליונה תו"/>
-    <w:basedOn w:val="a0"/>
-    <w:link w:val="af0"/>
+  <w:style w:type="character" w:customStyle="1" w:styleId="HeaderChar">
+    <w:name w:val="Header Char"/>
+    <w:basedOn w:val="DefaultParagraphFont"/>
+    <w:link w:val="Header"/>
     <w:uiPriority w:val="99"/>
     <w:rsid w:val="001A5E4C"/>
   </w:style>
-  <w:style w:type="paragraph" w:styleId="af2">
+  <w:style w:type="paragraph" w:styleId="Footer">
     <w:name w:val="footer"/>
-    <w:basedOn w:val="a"/>
-    <w:link w:val="af3"/>
+    <w:basedOn w:val="Normal"/>
+    <w:link w:val="FooterChar"/>
     <w:uiPriority w:val="99"/>
     <w:unhideWhenUsed/>
     <w:rsid w:val="001A5E4C"/>
@@ -8512,16 +8626,16 @@
       </w:tabs>
     </w:pPr>
   </w:style>
-  <w:style w:type="character" w:customStyle="1" w:styleId="af3">
-    <w:name w:val="כותרת תחתונה תו"/>
-    <w:basedOn w:val="a0"/>
-    <w:link w:val="af2"/>
+  <w:style w:type="character" w:customStyle="1" w:styleId="FooterChar">
+    <w:name w:val="Footer Char"/>
+    <w:basedOn w:val="DefaultParagraphFont"/>
+    <w:link w:val="Footer"/>
     <w:uiPriority w:val="99"/>
     <w:rsid w:val="001A5E4C"/>
   </w:style>
-  <w:style w:type="paragraph" w:styleId="af4">
+  <w:style w:type="paragraph" w:styleId="NoSpacing">
     <w:name w:val="No Spacing"/>
-    <w:basedOn w:val="a"/>
+    <w:basedOn w:val="Normal"/>
     <w:uiPriority w:val="1"/>
     <w:qFormat/>
     <w:rsid w:val="00FC0C1D"/>
@@ -8535,9 +8649,9 @@
       <w:bCs/>
     </w:rPr>
   </w:style>
-  <w:style w:type="character" w:styleId="af5">
+  <w:style w:type="character" w:styleId="Strong">
     <w:name w:val="Strong"/>
-    <w:basedOn w:val="a0"/>
+    <w:basedOn w:val="DefaultParagraphFont"/>
     <w:uiPriority w:val="22"/>
     <w:qFormat/>
     <w:rsid w:val="00DD29B0"/>
@@ -8548,7 +8662,7 @@
   </w:style>
   <w:style w:type="character" w:styleId="HTMLCode">
     <w:name w:val="HTML Code"/>
-    <w:basedOn w:val="a0"/>
+    <w:basedOn w:val="DefaultParagraphFont"/>
     <w:uiPriority w:val="99"/>
     <w:semiHidden/>
     <w:unhideWhenUsed/>

</xml_diff>